<commit_message>
docs: Complete relatório with all requirements sections and conclusion
</commit_message>
<xml_diff>
--- a/IPL-TeSP-PSI-TS-2024_Relatório.docx
+++ b/IPL-TeSP-PSI-TS-2024_Relatório.docx
@@ -3275,9 +3275,9 @@
         <w:tblLook w:val="04A0" w:firstRow="1" w:lastRow="0" w:firstColumn="1" w:lastColumn="0" w:noHBand="0" w:noVBand="1"/>
       </w:tblPr>
       <w:tblGrid>
-        <w:gridCol w:w="1325"/>
-        <w:gridCol w:w="4973"/>
-        <w:gridCol w:w="1407"/>
+        <w:gridCol w:w="1321"/>
+        <w:gridCol w:w="4978"/>
+        <w:gridCol w:w="1406"/>
         <w:gridCol w:w="1689"/>
       </w:tblGrid>
       <w:tr>
@@ -3392,6 +3392,17 @@
             <w:pPr>
               <w:cnfStyle w:val="000000100000" w:firstRow="0" w:lastRow="0" w:firstColumn="0" w:lastColumn="0" w:oddVBand="0" w:evenVBand="0" w:oddHBand="1" w:evenHBand="0" w:firstRowFirstColumn="0" w:firstRowLastColumn="0" w:lastRowFirstColumn="0" w:lastRowLastColumn="0"/>
             </w:pPr>
+            <w:r>
+              <w:t xml:space="preserve">Interface gráfica em Windows </w:t>
+            </w:r>
+            <w:proofErr w:type="spellStart"/>
+            <w:r>
+              <w:t>Forms</w:t>
+            </w:r>
+            <w:proofErr w:type="spellEnd"/>
+            <w:r>
+              <w:t xml:space="preserve"> clara e intuitiva</w:t>
+            </w:r>
           </w:p>
         </w:tc>
         <w:tc>
@@ -3403,6 +3414,9 @@
               <w:jc w:val="center"/>
               <w:cnfStyle w:val="000000100000" w:firstRow="0" w:lastRow="0" w:firstColumn="0" w:lastColumn="0" w:oddVBand="0" w:evenVBand="0" w:oddHBand="1" w:evenHBand="0" w:firstRowFirstColumn="0" w:firstRowLastColumn="0" w:lastRowFirstColumn="0" w:lastRowLastColumn="0"/>
             </w:pPr>
+            <w:r>
+              <w:t>Alta</w:t>
+            </w:r>
           </w:p>
         </w:tc>
         <w:tc>
@@ -3423,7 +3437,14 @@
             <w:cnfStyle w:val="001000000000" w:firstRow="0" w:lastRow="0" w:firstColumn="1" w:lastColumn="0" w:oddVBand="0" w:evenVBand="0" w:oddHBand="0" w:evenHBand="0" w:firstRowFirstColumn="0" w:firstRowLastColumn="0" w:lastRowFirstColumn="0" w:lastRowLastColumn="0"/>
             <w:tcW w:w="1389" w:type="dxa"/>
           </w:tcPr>
-          <w:p/>
+          <w:p>
+            <w:r>
+              <w:t>RNF-USA-0</w:t>
+            </w:r>
+            <w:r>
+              <w:t>2</w:t>
+            </w:r>
+          </w:p>
         </w:tc>
         <w:tc>
           <w:tcPr>
@@ -3433,6 +3454,9 @@
             <w:pPr>
               <w:cnfStyle w:val="000000000000" w:firstRow="0" w:lastRow="0" w:firstColumn="0" w:lastColumn="0" w:oddVBand="0" w:evenVBand="0" w:oddHBand="0" w:evenHBand="0" w:firstRowFirstColumn="0" w:firstRowLastColumn="0" w:lastRowFirstColumn="0" w:lastRowLastColumn="0"/>
             </w:pPr>
+            <w:r>
+              <w:t>Mensagens de erro/sucesso informativas ao utilizador</w:t>
+            </w:r>
           </w:p>
         </w:tc>
         <w:tc>
@@ -3444,6 +3468,9 @@
               <w:jc w:val="center"/>
               <w:cnfStyle w:val="000000000000" w:firstRow="0" w:lastRow="0" w:firstColumn="0" w:lastColumn="0" w:oddVBand="0" w:evenVBand="0" w:oddHBand="0" w:evenHBand="0" w:firstRowFirstColumn="0" w:firstRowLastColumn="0" w:lastRowFirstColumn="0" w:lastRowLastColumn="0"/>
             </w:pPr>
+            <w:r>
+              <w:t>Alta</w:t>
+            </w:r>
           </w:p>
         </w:tc>
         <w:tc>
@@ -3467,7 +3494,14 @@
             <w:cnfStyle w:val="001000000000" w:firstRow="0" w:lastRow="0" w:firstColumn="1" w:lastColumn="0" w:oddVBand="0" w:evenVBand="0" w:oddHBand="0" w:evenHBand="0" w:firstRowFirstColumn="0" w:firstRowLastColumn="0" w:lastRowFirstColumn="0" w:lastRowLastColumn="0"/>
             <w:tcW w:w="1389" w:type="dxa"/>
           </w:tcPr>
-          <w:p/>
+          <w:p>
+            <w:r>
+              <w:t>RNF-USA-0</w:t>
+            </w:r>
+            <w:r>
+              <w:t>3</w:t>
+            </w:r>
+          </w:p>
         </w:tc>
         <w:tc>
           <w:tcPr>
@@ -3477,6 +3511,9 @@
             <w:pPr>
               <w:cnfStyle w:val="000000100000" w:firstRow="0" w:lastRow="0" w:firstColumn="0" w:lastColumn="0" w:oddVBand="0" w:evenVBand="0" w:oddHBand="1" w:evenHBand="0" w:firstRowFirstColumn="0" w:firstRowLastColumn="0" w:lastRowFirstColumn="0" w:lastRowLastColumn="0"/>
             </w:pPr>
+            <w:r>
+              <w:t>Indicador visual de estado de conexão com servidor</w:t>
+            </w:r>
           </w:p>
         </w:tc>
         <w:tc>
@@ -3488,6 +3525,9 @@
               <w:jc w:val="center"/>
               <w:cnfStyle w:val="000000100000" w:firstRow="0" w:lastRow="0" w:firstColumn="0" w:lastColumn="0" w:oddVBand="0" w:evenVBand="0" w:oddHBand="1" w:evenHBand="0" w:firstRowFirstColumn="0" w:firstRowLastColumn="0" w:lastRowFirstColumn="0" w:lastRowLastColumn="0"/>
             </w:pPr>
+            <w:r>
+              <w:t>Média</w:t>
+            </w:r>
           </w:p>
         </w:tc>
         <w:tc>
@@ -3508,7 +3548,14 @@
             <w:cnfStyle w:val="001000000000" w:firstRow="0" w:lastRow="0" w:firstColumn="1" w:lastColumn="0" w:oddVBand="0" w:evenVBand="0" w:oddHBand="0" w:evenHBand="0" w:firstRowFirstColumn="0" w:firstRowLastColumn="0" w:lastRowFirstColumn="0" w:lastRowLastColumn="0"/>
             <w:tcW w:w="1389" w:type="dxa"/>
           </w:tcPr>
-          <w:p/>
+          <w:p>
+            <w:r>
+              <w:t>RNF-USA-0</w:t>
+            </w:r>
+            <w:r>
+              <w:t>4</w:t>
+            </w:r>
+          </w:p>
         </w:tc>
         <w:tc>
           <w:tcPr>
@@ -3518,6 +3565,9 @@
             <w:pPr>
               <w:cnfStyle w:val="000000000000" w:firstRow="0" w:lastRow="0" w:firstColumn="0" w:lastColumn="0" w:oddVBand="0" w:evenVBand="0" w:oddHBand="0" w:evenHBand="0" w:firstRowFirstColumn="0" w:firstRowLastColumn="0" w:lastRowFirstColumn="0" w:lastRowLastColumn="0"/>
             </w:pPr>
+            <w:r>
+              <w:t>Histórico de mensagens visível e navegável</w:t>
+            </w:r>
           </w:p>
         </w:tc>
         <w:tc>
@@ -3530,6 +3580,9 @@
               <w:jc w:val="center"/>
               <w:cnfStyle w:val="000000000000" w:firstRow="0" w:lastRow="0" w:firstColumn="0" w:lastColumn="0" w:oddVBand="0" w:evenVBand="0" w:oddHBand="0" w:evenHBand="0" w:firstRowFirstColumn="0" w:firstRowLastColumn="0" w:lastRowFirstColumn="0" w:lastRowLastColumn="0"/>
             </w:pPr>
+            <w:r>
+              <w:t>Média</w:t>
+            </w:r>
           </w:p>
         </w:tc>
         <w:tc>
@@ -3725,6 +3778,9 @@
             <w:pPr>
               <w:cnfStyle w:val="000000100000" w:firstRow="0" w:lastRow="0" w:firstColumn="0" w:lastColumn="0" w:oddVBand="0" w:evenVBand="0" w:oddHBand="1" w:evenHBand="0" w:firstRowFirstColumn="0" w:firstRowLastColumn="0" w:lastRowFirstColumn="0" w:lastRowLastColumn="0"/>
             </w:pPr>
+            <w:r>
+              <w:t>Servidor continuar a funcionar com falha de um cliente</w:t>
+            </w:r>
           </w:p>
         </w:tc>
         <w:tc>
@@ -3736,6 +3792,9 @@
               <w:jc w:val="center"/>
               <w:cnfStyle w:val="000000100000" w:firstRow="0" w:lastRow="0" w:firstColumn="0" w:lastColumn="0" w:oddVBand="0" w:evenVBand="0" w:oddHBand="1" w:evenHBand="0" w:firstRowFirstColumn="0" w:firstRowLastColumn="0" w:lastRowFirstColumn="0" w:lastRowLastColumn="0"/>
             </w:pPr>
+            <w:r>
+              <w:t>Alta</w:t>
+            </w:r>
           </w:p>
         </w:tc>
         <w:tc>
@@ -3756,7 +3815,14 @@
             <w:cnfStyle w:val="001000000000" w:firstRow="0" w:lastRow="0" w:firstColumn="1" w:lastColumn="0" w:oddVBand="0" w:evenVBand="0" w:oddHBand="0" w:evenHBand="0" w:firstRowFirstColumn="0" w:firstRowLastColumn="0" w:lastRowFirstColumn="0" w:lastRowLastColumn="0"/>
             <w:tcW w:w="1413" w:type="dxa"/>
           </w:tcPr>
-          <w:p/>
+          <w:p>
+            <w:r>
+              <w:t>RNF-FIA-0</w:t>
+            </w:r>
+            <w:r>
+              <w:t>2</w:t>
+            </w:r>
+          </w:p>
         </w:tc>
         <w:tc>
           <w:tcPr>
@@ -3766,6 +3832,9 @@
             <w:pPr>
               <w:cnfStyle w:val="000000000000" w:firstRow="0" w:lastRow="0" w:firstColumn="0" w:lastColumn="0" w:oddVBand="0" w:evenVBand="0" w:oddHBand="0" w:evenHBand="0" w:firstRowFirstColumn="0" w:firstRowLastColumn="0" w:lastRowFirstColumn="0" w:lastRowLastColumn="0"/>
             </w:pPr>
+            <w:r>
+              <w:t>Reconexão automática do cliente em caso de perda de conexão</w:t>
+            </w:r>
           </w:p>
         </w:tc>
         <w:tc>
@@ -3777,6 +3846,9 @@
               <w:jc w:val="center"/>
               <w:cnfStyle w:val="000000000000" w:firstRow="0" w:lastRow="0" w:firstColumn="0" w:lastColumn="0" w:oddVBand="0" w:evenVBand="0" w:oddHBand="0" w:evenHBand="0" w:firstRowFirstColumn="0" w:firstRowLastColumn="0" w:lastRowFirstColumn="0" w:lastRowLastColumn="0"/>
             </w:pPr>
+            <w:r>
+              <w:t>Média</w:t>
+            </w:r>
           </w:p>
         </w:tc>
         <w:tc>
@@ -3800,7 +3872,14 @@
             <w:cnfStyle w:val="001000000000" w:firstRow="0" w:lastRow="0" w:firstColumn="1" w:lastColumn="0" w:oddVBand="0" w:evenVBand="0" w:oddHBand="0" w:evenHBand="0" w:firstRowFirstColumn="0" w:firstRowLastColumn="0" w:lastRowFirstColumn="0" w:lastRowLastColumn="0"/>
             <w:tcW w:w="1413" w:type="dxa"/>
           </w:tcPr>
-          <w:p/>
+          <w:p>
+            <w:r>
+              <w:t>RNF-FIA-0</w:t>
+            </w:r>
+            <w:r>
+              <w:t>3</w:t>
+            </w:r>
+          </w:p>
         </w:tc>
         <w:tc>
           <w:tcPr>
@@ -3810,6 +3889,9 @@
             <w:pPr>
               <w:cnfStyle w:val="000000100000" w:firstRow="0" w:lastRow="0" w:firstColumn="0" w:lastColumn="0" w:oddVBand="0" w:evenVBand="0" w:oddHBand="1" w:evenHBand="0" w:firstRowFirstColumn="0" w:firstRowLastColumn="0" w:lastRowFirstColumn="0" w:lastRowLastColumn="0"/>
             </w:pPr>
+            <w:r>
+              <w:t>Validação de integridade de todas as mensagens recebidas</w:t>
+            </w:r>
           </w:p>
         </w:tc>
         <w:tc>
@@ -3821,6 +3903,9 @@
               <w:jc w:val="center"/>
               <w:cnfStyle w:val="000000100000" w:firstRow="0" w:lastRow="0" w:firstColumn="0" w:lastColumn="0" w:oddVBand="0" w:evenVBand="0" w:oddHBand="1" w:evenHBand="0" w:firstRowFirstColumn="0" w:firstRowLastColumn="0" w:lastRowFirstColumn="0" w:lastRowLastColumn="0"/>
             </w:pPr>
+            <w:r>
+              <w:t>Alta</w:t>
+            </w:r>
           </w:p>
         </w:tc>
         <w:tc>
@@ -3841,7 +3926,14 @@
             <w:cnfStyle w:val="001000000000" w:firstRow="0" w:lastRow="0" w:firstColumn="1" w:lastColumn="0" w:oddVBand="0" w:evenVBand="0" w:oddHBand="0" w:evenHBand="0" w:firstRowFirstColumn="0" w:firstRowLastColumn="0" w:lastRowFirstColumn="0" w:lastRowLastColumn="0"/>
             <w:tcW w:w="1413" w:type="dxa"/>
           </w:tcPr>
-          <w:p/>
+          <w:p>
+            <w:r>
+              <w:t>RNF-FIA-0</w:t>
+            </w:r>
+            <w:r>
+              <w:t>4</w:t>
+            </w:r>
+          </w:p>
         </w:tc>
         <w:tc>
           <w:tcPr>
@@ -3851,6 +3943,9 @@
             <w:pPr>
               <w:cnfStyle w:val="000000000000" w:firstRow="0" w:lastRow="0" w:firstColumn="0" w:lastColumn="0" w:oddVBand="0" w:evenVBand="0" w:oddHBand="0" w:evenHBand="0" w:firstRowFirstColumn="0" w:firstRowLastColumn="0" w:lastRowFirstColumn="0" w:lastRowLastColumn="0"/>
             </w:pPr>
+            <w:r>
+              <w:t>Sistema registar todas as operações em log para auditoria</w:t>
+            </w:r>
           </w:p>
         </w:tc>
         <w:tc>
@@ -3863,6 +3958,9 @@
               <w:jc w:val="center"/>
               <w:cnfStyle w:val="000000000000" w:firstRow="0" w:lastRow="0" w:firstColumn="0" w:lastColumn="0" w:oddVBand="0" w:evenVBand="0" w:oddHBand="0" w:evenHBand="0" w:firstRowFirstColumn="0" w:firstRowLastColumn="0" w:lastRowFirstColumn="0" w:lastRowLastColumn="0"/>
             </w:pPr>
+            <w:r>
+              <w:t>Alta</w:t>
+            </w:r>
           </w:p>
         </w:tc>
         <w:tc>
@@ -3941,9 +4039,9 @@
         <w:tblLook w:val="04A0" w:firstRow="1" w:lastRow="0" w:firstColumn="1" w:lastColumn="0" w:noHBand="0" w:noVBand="1"/>
       </w:tblPr>
       <w:tblGrid>
-        <w:gridCol w:w="1322"/>
-        <w:gridCol w:w="4976"/>
-        <w:gridCol w:w="1407"/>
+        <w:gridCol w:w="1321"/>
+        <w:gridCol w:w="4978"/>
+        <w:gridCol w:w="1406"/>
         <w:gridCol w:w="1689"/>
       </w:tblGrid>
       <w:tr>
@@ -4058,6 +4156,9 @@
             <w:pPr>
               <w:cnfStyle w:val="000000100000" w:firstRow="0" w:lastRow="0" w:firstColumn="0" w:lastColumn="0" w:oddVBand="0" w:evenVBand="0" w:oddHBand="1" w:evenHBand="0" w:firstRowFirstColumn="0" w:firstRowLastColumn="0" w:lastRowFirstColumn="0" w:lastRowLastColumn="0"/>
             </w:pPr>
+            <w:r>
+              <w:t>Utilizar criptografia assimétrica (RSA) para troca de chaves</w:t>
+            </w:r>
           </w:p>
         </w:tc>
         <w:tc>
@@ -4069,6 +4170,9 @@
               <w:jc w:val="center"/>
               <w:cnfStyle w:val="000000100000" w:firstRow="0" w:lastRow="0" w:firstColumn="0" w:lastColumn="0" w:oddVBand="0" w:evenVBand="0" w:oddHBand="1" w:evenHBand="0" w:firstRowFirstColumn="0" w:firstRowLastColumn="0" w:lastRowFirstColumn="0" w:lastRowLastColumn="0"/>
             </w:pPr>
+            <w:r>
+              <w:t>Alta</w:t>
+            </w:r>
           </w:p>
         </w:tc>
         <w:tc>
@@ -4089,7 +4193,14 @@
             <w:cnfStyle w:val="001000000000" w:firstRow="0" w:lastRow="0" w:firstColumn="1" w:lastColumn="0" w:oddVBand="0" w:evenVBand="0" w:oddHBand="0" w:evenHBand="0" w:firstRowFirstColumn="0" w:firstRowLastColumn="0" w:lastRowFirstColumn="0" w:lastRowLastColumn="0"/>
             <w:tcW w:w="1387" w:type="dxa"/>
           </w:tcPr>
-          <w:p/>
+          <w:p>
+            <w:r>
+              <w:t>RNF-SEG-0</w:t>
+            </w:r>
+            <w:r>
+              <w:t>2</w:t>
+            </w:r>
+          </w:p>
         </w:tc>
         <w:tc>
           <w:tcPr>
@@ -4099,6 +4210,9 @@
             <w:pPr>
               <w:cnfStyle w:val="000000000000" w:firstRow="0" w:lastRow="0" w:firstColumn="0" w:lastColumn="0" w:oddVBand="0" w:evenVBand="0" w:oddHBand="0" w:evenHBand="0" w:firstRowFirstColumn="0" w:firstRowLastColumn="0" w:lastRowFirstColumn="0" w:lastRowLastColumn="0"/>
             </w:pPr>
+            <w:r>
+              <w:t>Utilizar criptografia simétrica (AES) para cifrar mensagens</w:t>
+            </w:r>
           </w:p>
         </w:tc>
         <w:tc>
@@ -4110,6 +4224,9 @@
               <w:jc w:val="center"/>
               <w:cnfStyle w:val="000000000000" w:firstRow="0" w:lastRow="0" w:firstColumn="0" w:lastColumn="0" w:oddVBand="0" w:evenVBand="0" w:oddHBand="0" w:evenHBand="0" w:firstRowFirstColumn="0" w:firstRowLastColumn="0" w:lastRowFirstColumn="0" w:lastRowLastColumn="0"/>
             </w:pPr>
+            <w:r>
+              <w:t>Alta</w:t>
+            </w:r>
           </w:p>
         </w:tc>
         <w:tc>
@@ -4133,7 +4250,14 @@
             <w:cnfStyle w:val="001000000000" w:firstRow="0" w:lastRow="0" w:firstColumn="1" w:lastColumn="0" w:oddVBand="0" w:evenVBand="0" w:oddHBand="0" w:evenHBand="0" w:firstRowFirstColumn="0" w:firstRowLastColumn="0" w:lastRowFirstColumn="0" w:lastRowLastColumn="0"/>
             <w:tcW w:w="1387" w:type="dxa"/>
           </w:tcPr>
-          <w:p/>
+          <w:p>
+            <w:r>
+              <w:t>RNF-SEG-0</w:t>
+            </w:r>
+            <w:r>
+              <w:t>3</w:t>
+            </w:r>
+          </w:p>
         </w:tc>
         <w:tc>
           <w:tcPr>
@@ -4143,6 +4267,25 @@
             <w:pPr>
               <w:cnfStyle w:val="000000100000" w:firstRow="0" w:lastRow="0" w:firstColumn="0" w:lastColumn="0" w:oddVBand="0" w:evenVBand="0" w:oddHBand="1" w:evenHBand="0" w:firstRowFirstColumn="0" w:firstRowLastColumn="0" w:lastRowFirstColumn="0" w:lastRowLastColumn="0"/>
             </w:pPr>
+            <w:r>
+              <w:t xml:space="preserve">Armazenar credenciais com </w:t>
+            </w:r>
+            <w:proofErr w:type="spellStart"/>
+            <w:r>
+              <w:t>hash</w:t>
+            </w:r>
+            <w:proofErr w:type="spellEnd"/>
+            <w:r>
+              <w:t xml:space="preserve"> (MD5 com </w:t>
+            </w:r>
+            <w:proofErr w:type="spellStart"/>
+            <w:r>
+              <w:t>salt</w:t>
+            </w:r>
+            <w:proofErr w:type="spellEnd"/>
+            <w:r>
+              <w:t>)</w:t>
+            </w:r>
           </w:p>
         </w:tc>
         <w:tc>
@@ -4154,6 +4297,9 @@
               <w:jc w:val="center"/>
               <w:cnfStyle w:val="000000100000" w:firstRow="0" w:lastRow="0" w:firstColumn="0" w:lastColumn="0" w:oddVBand="0" w:evenVBand="0" w:oddHBand="1" w:evenHBand="0" w:firstRowFirstColumn="0" w:firstRowLastColumn="0" w:lastRowFirstColumn="0" w:lastRowLastColumn="0"/>
             </w:pPr>
+            <w:r>
+              <w:t>Alta</w:t>
+            </w:r>
           </w:p>
         </w:tc>
         <w:tc>
@@ -4174,7 +4320,14 @@
             <w:cnfStyle w:val="001000000000" w:firstRow="0" w:lastRow="0" w:firstColumn="1" w:lastColumn="0" w:oddVBand="0" w:evenVBand="0" w:oddHBand="0" w:evenHBand="0" w:firstRowFirstColumn="0" w:firstRowLastColumn="0" w:lastRowFirstColumn="0" w:lastRowLastColumn="0"/>
             <w:tcW w:w="1387" w:type="dxa"/>
           </w:tcPr>
-          <w:p/>
+          <w:p>
+            <w:r>
+              <w:t>RNF-SEG-0</w:t>
+            </w:r>
+            <w:r>
+              <w:t>4</w:t>
+            </w:r>
+          </w:p>
         </w:tc>
         <w:tc>
           <w:tcPr>
@@ -4184,6 +4337,9 @@
             <w:pPr>
               <w:cnfStyle w:val="000000000000" w:firstRow="0" w:lastRow="0" w:firstColumn="0" w:lastColumn="0" w:oddVBand="0" w:evenVBand="0" w:oddHBand="0" w:evenHBand="0" w:firstRowFirstColumn="0" w:firstRowLastColumn="0" w:lastRowFirstColumn="0" w:lastRowLastColumn="0"/>
             </w:pPr>
+            <w:r>
+              <w:t>Validar assinaturas digitais de todas as mensagens</w:t>
+            </w:r>
           </w:p>
         </w:tc>
         <w:tc>
@@ -4196,6 +4352,9 @@
               <w:jc w:val="center"/>
               <w:cnfStyle w:val="000000000000" w:firstRow="0" w:lastRow="0" w:firstColumn="0" w:lastColumn="0" w:oddVBand="0" w:evenVBand="0" w:oddHBand="0" w:evenHBand="0" w:firstRowFirstColumn="0" w:firstRowLastColumn="0" w:lastRowFirstColumn="0" w:lastRowLastColumn="0"/>
             </w:pPr>
+            <w:r>
+              <w:t>Alta</w:t>
+            </w:r>
           </w:p>
         </w:tc>
         <w:tc>
@@ -4279,9 +4438,9 @@
         <w:tblLook w:val="04A0" w:firstRow="1" w:lastRow="0" w:firstColumn="1" w:lastColumn="0" w:noHBand="0" w:noVBand="1"/>
       </w:tblPr>
       <w:tblGrid>
-        <w:gridCol w:w="1322"/>
-        <w:gridCol w:w="4976"/>
-        <w:gridCol w:w="1407"/>
+        <w:gridCol w:w="1320"/>
+        <w:gridCol w:w="4979"/>
+        <w:gridCol w:w="1406"/>
         <w:gridCol w:w="1689"/>
       </w:tblGrid>
       <w:tr>
@@ -4396,6 +4555,14 @@
             <w:pPr>
               <w:cnfStyle w:val="000000100000" w:firstRow="0" w:lastRow="0" w:firstColumn="0" w:lastColumn="0" w:oddVBand="0" w:evenVBand="0" w:oddHBand="1" w:evenHBand="0" w:firstRowFirstColumn="0" w:firstRowLastColumn="0" w:lastRowFirstColumn="0" w:lastRowLastColumn="0"/>
             </w:pPr>
+            <w:r>
+              <w:t xml:space="preserve">Servidor processar múltiplos clientes com </w:t>
+            </w:r>
+            <w:proofErr w:type="spellStart"/>
+            <w:r>
+              <w:t>threads</w:t>
+            </w:r>
+            <w:proofErr w:type="spellEnd"/>
           </w:p>
         </w:tc>
         <w:tc>
@@ -4407,6 +4574,9 @@
               <w:jc w:val="center"/>
               <w:cnfStyle w:val="000000100000" w:firstRow="0" w:lastRow="0" w:firstColumn="0" w:lastColumn="0" w:oddVBand="0" w:evenVBand="0" w:oddHBand="1" w:evenHBand="0" w:firstRowFirstColumn="0" w:firstRowLastColumn="0" w:lastRowFirstColumn="0" w:lastRowLastColumn="0"/>
             </w:pPr>
+            <w:r>
+              <w:t>Alta</w:t>
+            </w:r>
           </w:p>
         </w:tc>
         <w:tc>
@@ -4427,7 +4597,14 @@
             <w:cnfStyle w:val="001000000000" w:firstRow="0" w:lastRow="0" w:firstColumn="1" w:lastColumn="0" w:oddVBand="0" w:evenVBand="0" w:oddHBand="0" w:evenHBand="0" w:firstRowFirstColumn="0" w:firstRowLastColumn="0" w:lastRowFirstColumn="0" w:lastRowLastColumn="0"/>
             <w:tcW w:w="1387" w:type="dxa"/>
           </w:tcPr>
-          <w:p/>
+          <w:p>
+            <w:r>
+              <w:t>RNF-EFI-0</w:t>
+            </w:r>
+            <w:r>
+              <w:t>2</w:t>
+            </w:r>
+          </w:p>
         </w:tc>
         <w:tc>
           <w:tcPr>
@@ -4437,6 +4614,9 @@
             <w:pPr>
               <w:cnfStyle w:val="000000000000" w:firstRow="0" w:lastRow="0" w:firstColumn="0" w:lastColumn="0" w:oddVBand="0" w:evenVBand="0" w:oddHBand="0" w:evenHBand="0" w:firstRowFirstColumn="0" w:firstRowLastColumn="0" w:lastRowFirstColumn="0" w:lastRowLastColumn="0"/>
             </w:pPr>
+            <w:r>
+              <w:t>Tempo de resposta do servidor inferior a 500ms</w:t>
+            </w:r>
           </w:p>
         </w:tc>
         <w:tc>
@@ -4448,6 +4628,9 @@
               <w:jc w:val="center"/>
               <w:cnfStyle w:val="000000000000" w:firstRow="0" w:lastRow="0" w:firstColumn="0" w:lastColumn="0" w:oddVBand="0" w:evenVBand="0" w:oddHBand="0" w:evenHBand="0" w:firstRowFirstColumn="0" w:firstRowLastColumn="0" w:lastRowFirstColumn="0" w:lastRowLastColumn="0"/>
             </w:pPr>
+            <w:r>
+              <w:t>Média</w:t>
+            </w:r>
           </w:p>
         </w:tc>
         <w:tc>
@@ -4471,7 +4654,14 @@
             <w:cnfStyle w:val="001000000000" w:firstRow="0" w:lastRow="0" w:firstColumn="1" w:lastColumn="0" w:oddVBand="0" w:evenVBand="0" w:oddHBand="0" w:evenHBand="0" w:firstRowFirstColumn="0" w:firstRowLastColumn="0" w:lastRowFirstColumn="0" w:lastRowLastColumn="0"/>
             <w:tcW w:w="1387" w:type="dxa"/>
           </w:tcPr>
-          <w:p/>
+          <w:p>
+            <w:r>
+              <w:t>RNF-EFI-0</w:t>
+            </w:r>
+            <w:r>
+              <w:t>3</w:t>
+            </w:r>
+          </w:p>
         </w:tc>
         <w:tc>
           <w:tcPr>
@@ -4481,6 +4671,14 @@
             <w:pPr>
               <w:cnfStyle w:val="000000100000" w:firstRow="0" w:lastRow="0" w:firstColumn="0" w:lastColumn="0" w:oddVBand="0" w:evenVBand="0" w:oddHBand="1" w:evenHBand="0" w:firstRowFirstColumn="0" w:firstRowLastColumn="0" w:lastRowFirstColumn="0" w:lastRowLastColumn="0"/>
             </w:pPr>
+            <w:r>
+              <w:t xml:space="preserve">Operações de Criptografia </w:t>
+            </w:r>
+            <w:proofErr w:type="spellStart"/>
+            <w:r>
+              <w:t>optimizadas</w:t>
+            </w:r>
+            <w:proofErr w:type="spellEnd"/>
           </w:p>
         </w:tc>
         <w:tc>
@@ -4492,6 +4690,9 @@
               <w:jc w:val="center"/>
               <w:cnfStyle w:val="000000100000" w:firstRow="0" w:lastRow="0" w:firstColumn="0" w:lastColumn="0" w:oddVBand="0" w:evenVBand="0" w:oddHBand="1" w:evenHBand="0" w:firstRowFirstColumn="0" w:firstRowLastColumn="0" w:lastRowFirstColumn="0" w:lastRowLastColumn="0"/>
             </w:pPr>
+            <w:r>
+              <w:t>Média</w:t>
+            </w:r>
           </w:p>
         </w:tc>
         <w:tc>
@@ -4512,7 +4713,14 @@
             <w:cnfStyle w:val="001000000000" w:firstRow="0" w:lastRow="0" w:firstColumn="1" w:lastColumn="0" w:oddVBand="0" w:evenVBand="0" w:oddHBand="0" w:evenHBand="0" w:firstRowFirstColumn="0" w:firstRowLastColumn="0" w:lastRowFirstColumn="0" w:lastRowLastColumn="0"/>
             <w:tcW w:w="1387" w:type="dxa"/>
           </w:tcPr>
-          <w:p/>
+          <w:p>
+            <w:r>
+              <w:t>RNF-EFI-0</w:t>
+            </w:r>
+            <w:r>
+              <w:t>4</w:t>
+            </w:r>
+          </w:p>
         </w:tc>
         <w:tc>
           <w:tcPr>
@@ -4522,6 +4730,9 @@
             <w:pPr>
               <w:cnfStyle w:val="000000000000" w:firstRow="0" w:lastRow="0" w:firstColumn="0" w:lastColumn="0" w:oddVBand="0" w:evenVBand="0" w:oddHBand="0" w:evenHBand="0" w:firstRowFirstColumn="0" w:firstRowLastColumn="0" w:lastRowFirstColumn="0" w:lastRowLastColumn="0"/>
             </w:pPr>
+            <w:r>
+              <w:t>Log do sistema não exceder limite de memória</w:t>
+            </w:r>
           </w:p>
         </w:tc>
         <w:tc>
@@ -4534,6 +4745,9 @@
               <w:jc w:val="center"/>
               <w:cnfStyle w:val="000000000000" w:firstRow="0" w:lastRow="0" w:firstColumn="0" w:lastColumn="0" w:oddVBand="0" w:evenVBand="0" w:oddHBand="0" w:evenHBand="0" w:firstRowFirstColumn="0" w:firstRowLastColumn="0" w:lastRowFirstColumn="0" w:lastRowLastColumn="0"/>
             </w:pPr>
+            <w:r>
+              <w:t>Média</w:t>
+            </w:r>
           </w:p>
         </w:tc>
         <w:tc>
@@ -4622,9 +4836,9 @@
         <w:tblLook w:val="04A0" w:firstRow="1" w:lastRow="0" w:firstColumn="1" w:lastColumn="0" w:noHBand="0" w:noVBand="1"/>
       </w:tblPr>
       <w:tblGrid>
-        <w:gridCol w:w="1322"/>
-        <w:gridCol w:w="4976"/>
-        <w:gridCol w:w="1407"/>
+        <w:gridCol w:w="1311"/>
+        <w:gridCol w:w="4990"/>
+        <w:gridCol w:w="1404"/>
         <w:gridCol w:w="1689"/>
       </w:tblGrid>
       <w:tr>
@@ -4739,6 +4953,9 @@
             <w:pPr>
               <w:cnfStyle w:val="000000100000" w:firstRow="0" w:lastRow="0" w:firstColumn="0" w:lastColumn="0" w:oddVBand="0" w:evenVBand="0" w:oddHBand="1" w:evenHBand="0" w:firstRowFirstColumn="0" w:firstRowLastColumn="0" w:lastRowFirstColumn="0" w:lastRowLastColumn="0"/>
             </w:pPr>
+            <w:r>
+              <w:t>Servidor disponível 24/7 com mínimo de interrupções</w:t>
+            </w:r>
           </w:p>
         </w:tc>
         <w:tc>
@@ -4750,6 +4967,9 @@
               <w:jc w:val="center"/>
               <w:cnfStyle w:val="000000100000" w:firstRow="0" w:lastRow="0" w:firstColumn="0" w:lastColumn="0" w:oddVBand="0" w:evenVBand="0" w:oddHBand="1" w:evenHBand="0" w:firstRowFirstColumn="0" w:firstRowLastColumn="0" w:lastRowFirstColumn="0" w:lastRowLastColumn="0"/>
             </w:pPr>
+            <w:r>
+              <w:t>Alta</w:t>
+            </w:r>
           </w:p>
         </w:tc>
         <w:tc>
@@ -4770,7 +4990,14 @@
             <w:cnfStyle w:val="001000000000" w:firstRow="0" w:lastRow="0" w:firstColumn="1" w:lastColumn="0" w:oddVBand="0" w:evenVBand="0" w:oddHBand="0" w:evenHBand="0" w:firstRowFirstColumn="0" w:firstRowLastColumn="0" w:lastRowFirstColumn="0" w:lastRowLastColumn="0"/>
             <w:tcW w:w="1387" w:type="dxa"/>
           </w:tcPr>
-          <w:p/>
+          <w:p>
+            <w:r>
+              <w:t>RNF-DIS-0</w:t>
+            </w:r>
+            <w:r>
+              <w:t>2</w:t>
+            </w:r>
+          </w:p>
         </w:tc>
         <w:tc>
           <w:tcPr>
@@ -4780,6 +5007,9 @@
             <w:pPr>
               <w:cnfStyle w:val="000000000000" w:firstRow="0" w:lastRow="0" w:firstColumn="0" w:lastColumn="0" w:oddVBand="0" w:evenVBand="0" w:oddHBand="0" w:evenHBand="0" w:firstRowFirstColumn="0" w:firstRowLastColumn="0" w:lastRowFirstColumn="0" w:lastRowLastColumn="0"/>
             </w:pPr>
+            <w:r>
+              <w:t>Sistema recuperar automaticamente de falhas de conexão</w:t>
+            </w:r>
           </w:p>
         </w:tc>
         <w:tc>
@@ -4791,6 +5021,9 @@
               <w:jc w:val="center"/>
               <w:cnfStyle w:val="000000000000" w:firstRow="0" w:lastRow="0" w:firstColumn="0" w:lastColumn="0" w:oddVBand="0" w:evenVBand="0" w:oddHBand="0" w:evenHBand="0" w:firstRowFirstColumn="0" w:firstRowLastColumn="0" w:lastRowFirstColumn="0" w:lastRowLastColumn="0"/>
             </w:pPr>
+            <w:r>
+              <w:t>Alta</w:t>
+            </w:r>
           </w:p>
         </w:tc>
         <w:tc>
@@ -4814,7 +5047,14 @@
             <w:cnfStyle w:val="001000000000" w:firstRow="0" w:lastRow="0" w:firstColumn="1" w:lastColumn="0" w:oddVBand="0" w:evenVBand="0" w:oddHBand="0" w:evenHBand="0" w:firstRowFirstColumn="0" w:firstRowLastColumn="0" w:lastRowFirstColumn="0" w:lastRowLastColumn="0"/>
             <w:tcW w:w="1387" w:type="dxa"/>
           </w:tcPr>
-          <w:p/>
+          <w:p>
+            <w:r>
+              <w:t>RNF-DIS-0</w:t>
+            </w:r>
+            <w:r>
+              <w:t>3</w:t>
+            </w:r>
+          </w:p>
         </w:tc>
         <w:tc>
           <w:tcPr>
@@ -4824,6 +5064,9 @@
             <w:pPr>
               <w:cnfStyle w:val="000000100000" w:firstRow="0" w:lastRow="0" w:firstColumn="0" w:lastColumn="0" w:oddVBand="0" w:evenVBand="0" w:oddHBand="1" w:evenHBand="0" w:firstRowFirstColumn="0" w:firstRowLastColumn="0" w:lastRowFirstColumn="0" w:lastRowLastColumn="0"/>
             </w:pPr>
+            <w:r>
+              <w:t>Servidor suportar pelo menos 10 clientes simultâneos</w:t>
+            </w:r>
           </w:p>
         </w:tc>
         <w:tc>
@@ -4835,6 +5078,9 @@
               <w:jc w:val="center"/>
               <w:cnfStyle w:val="000000100000" w:firstRow="0" w:lastRow="0" w:firstColumn="0" w:lastColumn="0" w:oddVBand="0" w:evenVBand="0" w:oddHBand="1" w:evenHBand="0" w:firstRowFirstColumn="0" w:firstRowLastColumn="0" w:lastRowFirstColumn="0" w:lastRowLastColumn="0"/>
             </w:pPr>
+            <w:r>
+              <w:t>Média</w:t>
+            </w:r>
           </w:p>
         </w:tc>
         <w:tc>
@@ -4855,7 +5101,14 @@
             <w:cnfStyle w:val="001000000000" w:firstRow="0" w:lastRow="0" w:firstColumn="1" w:lastColumn="0" w:oddVBand="0" w:evenVBand="0" w:oddHBand="0" w:evenHBand="0" w:firstRowFirstColumn="0" w:firstRowLastColumn="0" w:lastRowFirstColumn="0" w:lastRowLastColumn="0"/>
             <w:tcW w:w="1387" w:type="dxa"/>
           </w:tcPr>
-          <w:p/>
+          <w:p>
+            <w:r>
+              <w:t>RNF-DIS-0</w:t>
+            </w:r>
+            <w:r>
+              <w:t>4</w:t>
+            </w:r>
+          </w:p>
         </w:tc>
         <w:tc>
           <w:tcPr>
@@ -4865,6 +5118,9 @@
             <w:pPr>
               <w:cnfStyle w:val="000000000000" w:firstRow="0" w:lastRow="0" w:firstColumn="0" w:lastColumn="0" w:oddVBand="0" w:evenVBand="0" w:oddHBand="0" w:evenHBand="0" w:firstRowFirstColumn="0" w:firstRowLastColumn="0" w:lastRowFirstColumn="0" w:lastRowLastColumn="0"/>
             </w:pPr>
+            <w:r>
+              <w:t>Mensagens não perdidas mesmo com desconexão inesperada</w:t>
+            </w:r>
           </w:p>
         </w:tc>
         <w:tc>
@@ -4877,6 +5133,9 @@
               <w:jc w:val="center"/>
               <w:cnfStyle w:val="000000000000" w:firstRow="0" w:lastRow="0" w:firstColumn="0" w:lastColumn="0" w:oddVBand="0" w:evenVBand="0" w:oddHBand="0" w:evenHBand="0" w:firstRowFirstColumn="0" w:firstRowLastColumn="0" w:lastRowFirstColumn="0" w:lastRowLastColumn="0"/>
             </w:pPr>
+            <w:r>
+              <w:t>Alta</w:t>
+            </w:r>
           </w:p>
         </w:tc>
         <w:tc>
@@ -4961,8 +5220,8 @@
         <w:tblLook w:val="04A0" w:firstRow="1" w:lastRow="0" w:firstColumn="1" w:lastColumn="0" w:noHBand="0" w:noVBand="1"/>
       </w:tblPr>
       <w:tblGrid>
-        <w:gridCol w:w="1362"/>
-        <w:gridCol w:w="5330"/>
+        <w:gridCol w:w="1355"/>
+        <w:gridCol w:w="5337"/>
         <w:gridCol w:w="1274"/>
         <w:gridCol w:w="1689"/>
       </w:tblGrid>
@@ -5080,6 +5339,9 @@
             <w:pPr>
               <w:cnfStyle w:val="000000100000" w:firstRow="0" w:lastRow="0" w:firstColumn="0" w:lastColumn="0" w:oddVBand="0" w:evenVBand="0" w:oddHBand="1" w:evenHBand="0" w:firstRowFirstColumn="0" w:firstRowLastColumn="0" w:lastRowFirstColumn="0" w:lastRowLastColumn="0"/>
             </w:pPr>
+            <w:r>
+              <w:t>Compatibilidade com Windows 7 ou superior</w:t>
+            </w:r>
           </w:p>
         </w:tc>
         <w:tc>
@@ -5091,6 +5353,9 @@
               <w:jc w:val="center"/>
               <w:cnfStyle w:val="000000100000" w:firstRow="0" w:lastRow="0" w:firstColumn="0" w:lastColumn="0" w:oddVBand="0" w:evenVBand="0" w:oddHBand="1" w:evenHBand="0" w:firstRowFirstColumn="0" w:firstRowLastColumn="0" w:lastRowFirstColumn="0" w:lastRowLastColumn="0"/>
             </w:pPr>
+            <w:r>
+              <w:t>Alta</w:t>
+            </w:r>
           </w:p>
         </w:tc>
         <w:tc>
@@ -5114,7 +5379,14 @@
             <w:cnfStyle w:val="001000000000" w:firstRow="0" w:lastRow="0" w:firstColumn="1" w:lastColumn="0" w:oddVBand="0" w:evenVBand="0" w:oddHBand="0" w:evenHBand="0" w:firstRowFirstColumn="0" w:firstRowLastColumn="0" w:lastRowFirstColumn="0" w:lastRowLastColumn="0"/>
             <w:tcW w:w="1413" w:type="dxa"/>
           </w:tcPr>
-          <w:p/>
+          <w:p>
+            <w:r>
+              <w:t>RNF-AMB-0</w:t>
+            </w:r>
+            <w:r>
+              <w:t>2</w:t>
+            </w:r>
+          </w:p>
         </w:tc>
         <w:tc>
           <w:tcPr>
@@ -5124,6 +5396,9 @@
             <w:pPr>
               <w:cnfStyle w:val="000000000000" w:firstRow="0" w:lastRow="0" w:firstColumn="0" w:lastColumn="0" w:oddVBand="0" w:evenVBand="0" w:oddHBand="0" w:evenHBand="0" w:firstRowFirstColumn="0" w:firstRowLastColumn="0" w:lastRowFirstColumn="0" w:lastRowLastColumn="0"/>
             </w:pPr>
+            <w:r>
+              <w:t>Requer .NET Framework 4.8 ou superior</w:t>
+            </w:r>
           </w:p>
         </w:tc>
         <w:tc>
@@ -5135,6 +5410,9 @@
               <w:jc w:val="center"/>
               <w:cnfStyle w:val="000000000000" w:firstRow="0" w:lastRow="0" w:firstColumn="0" w:lastColumn="0" w:oddVBand="0" w:evenVBand="0" w:oddHBand="0" w:evenHBand="0" w:firstRowFirstColumn="0" w:firstRowLastColumn="0" w:lastRowFirstColumn="0" w:lastRowLastColumn="0"/>
             </w:pPr>
+            <w:r>
+              <w:t>Alta</w:t>
+            </w:r>
           </w:p>
         </w:tc>
         <w:tc>
@@ -5159,7 +5437,14 @@
             <w:cnfStyle w:val="001000000000" w:firstRow="0" w:lastRow="0" w:firstColumn="1" w:lastColumn="0" w:oddVBand="0" w:evenVBand="0" w:oddHBand="0" w:evenHBand="0" w:firstRowFirstColumn="0" w:firstRowLastColumn="0" w:lastRowFirstColumn="0" w:lastRowLastColumn="0"/>
             <w:tcW w:w="1413" w:type="dxa"/>
           </w:tcPr>
-          <w:p/>
+          <w:p>
+            <w:r>
+              <w:t>RNF-AMB-0</w:t>
+            </w:r>
+            <w:r>
+              <w:t>3</w:t>
+            </w:r>
+          </w:p>
         </w:tc>
         <w:tc>
           <w:tcPr>
@@ -5169,6 +5454,17 @@
             <w:pPr>
               <w:cnfStyle w:val="000000100000" w:firstRow="0" w:lastRow="0" w:firstColumn="0" w:lastColumn="0" w:oddVBand="0" w:evenVBand="0" w:oddHBand="1" w:evenHBand="0" w:firstRowFirstColumn="0" w:firstRowLastColumn="0" w:lastRowFirstColumn="0" w:lastRowLastColumn="0"/>
             </w:pPr>
+            <w:r>
+              <w:t xml:space="preserve">Suportar Visual </w:t>
+            </w:r>
+            <w:proofErr w:type="spellStart"/>
+            <w:r>
+              <w:t>Studio</w:t>
+            </w:r>
+            <w:proofErr w:type="spellEnd"/>
+            <w:r>
+              <w:t xml:space="preserve"> 2019 ou superior</w:t>
+            </w:r>
           </w:p>
         </w:tc>
         <w:tc>
@@ -5180,6 +5476,9 @@
               <w:jc w:val="center"/>
               <w:cnfStyle w:val="000000100000" w:firstRow="0" w:lastRow="0" w:firstColumn="0" w:lastColumn="0" w:oddVBand="0" w:evenVBand="0" w:oddHBand="1" w:evenHBand="0" w:firstRowFirstColumn="0" w:firstRowLastColumn="0" w:lastRowFirstColumn="0" w:lastRowLastColumn="0"/>
             </w:pPr>
+            <w:r>
+              <w:t>Média</w:t>
+            </w:r>
           </w:p>
         </w:tc>
         <w:tc>
@@ -5203,7 +5502,14 @@
             <w:cnfStyle w:val="001000000000" w:firstRow="0" w:lastRow="0" w:firstColumn="1" w:lastColumn="0" w:oddVBand="0" w:evenVBand="0" w:oddHBand="0" w:evenHBand="0" w:firstRowFirstColumn="0" w:firstRowLastColumn="0" w:lastRowFirstColumn="0" w:lastRowLastColumn="0"/>
             <w:tcW w:w="1413" w:type="dxa"/>
           </w:tcPr>
-          <w:p/>
+          <w:p>
+            <w:r>
+              <w:t>RNF-AMB-0</w:t>
+            </w:r>
+            <w:r>
+              <w:t>4</w:t>
+            </w:r>
+          </w:p>
         </w:tc>
         <w:tc>
           <w:tcPr>
@@ -5213,6 +5519,17 @@
             <w:pPr>
               <w:cnfStyle w:val="000000000000" w:firstRow="0" w:lastRow="0" w:firstColumn="0" w:lastColumn="0" w:oddVBand="0" w:evenVBand="0" w:oddHBand="0" w:evenHBand="0" w:firstRowFirstColumn="0" w:firstRowLastColumn="0" w:lastRowFirstColumn="0" w:lastRowLastColumn="0"/>
             </w:pPr>
+            <w:r>
+              <w:t xml:space="preserve">Base de dados SQL Server ou </w:t>
+            </w:r>
+            <w:proofErr w:type="spellStart"/>
+            <w:r>
+              <w:t>Entity</w:t>
+            </w:r>
+            <w:proofErr w:type="spellEnd"/>
+            <w:r>
+              <w:t xml:space="preserve"> Framework</w:t>
+            </w:r>
           </w:p>
         </w:tc>
         <w:tc>
@@ -5225,6 +5542,9 @@
               <w:jc w:val="center"/>
               <w:cnfStyle w:val="000000000000" w:firstRow="0" w:lastRow="0" w:firstColumn="0" w:lastColumn="0" w:oddVBand="0" w:evenVBand="0" w:oddHBand="0" w:evenHBand="0" w:firstRowFirstColumn="0" w:firstRowLastColumn="0" w:lastRowFirstColumn="0" w:lastRowLastColumn="0"/>
             </w:pPr>
+            <w:r>
+              <w:t>Média</w:t>
+            </w:r>
           </w:p>
         </w:tc>
         <w:tc>
@@ -5275,19 +5595,10 @@
     <w:p/>
     <w:p>
       <w:pPr>
-        <w:spacing w:after="160" w:line="259" w:lineRule="auto"/>
-        <w:jc w:val="left"/>
-      </w:pPr>
-      <w:r>
-        <w:br w:type="page"/>
-      </w:r>
-    </w:p>
-    <w:p/>
-    <w:p>
-      <w:pPr>
         <w:pStyle w:val="Ttulo4"/>
       </w:pPr>
       <w:r>
+        <w:lastRenderedPageBreak/>
         <w:t>Requisitos Não Funcionais de Desenvolvimento</w:t>
       </w:r>
     </w:p>
@@ -5316,9 +5627,9 @@
         <w:tblLook w:val="04A0" w:firstRow="1" w:lastRow="0" w:firstColumn="1" w:lastColumn="0" w:noHBand="0" w:noVBand="1"/>
       </w:tblPr>
       <w:tblGrid>
-        <w:gridCol w:w="1322"/>
-        <w:gridCol w:w="4976"/>
-        <w:gridCol w:w="1407"/>
+        <w:gridCol w:w="1316"/>
+        <w:gridCol w:w="4984"/>
+        <w:gridCol w:w="1405"/>
         <w:gridCol w:w="1689"/>
       </w:tblGrid>
       <w:tr>
@@ -5433,6 +5744,9 @@
             <w:pPr>
               <w:cnfStyle w:val="000000100000" w:firstRow="0" w:lastRow="0" w:firstColumn="0" w:lastColumn="0" w:oddVBand="0" w:evenVBand="0" w:oddHBand="1" w:evenHBand="0" w:firstRowFirstColumn="0" w:firstRowLastColumn="0" w:lastRowFirstColumn="0" w:lastRowLastColumn="0"/>
             </w:pPr>
+            <w:r>
+              <w:t>Código comentado com documentação de funções</w:t>
+            </w:r>
           </w:p>
         </w:tc>
         <w:tc>
@@ -5444,6 +5758,9 @@
               <w:jc w:val="center"/>
               <w:cnfStyle w:val="000000100000" w:firstRow="0" w:lastRow="0" w:firstColumn="0" w:lastColumn="0" w:oddVBand="0" w:evenVBand="0" w:oddHBand="1" w:evenHBand="0" w:firstRowFirstColumn="0" w:firstRowLastColumn="0" w:lastRowFirstColumn="0" w:lastRowLastColumn="0"/>
             </w:pPr>
+            <w:r>
+              <w:t>Alta</w:t>
+            </w:r>
           </w:p>
         </w:tc>
         <w:tc>
@@ -5464,7 +5781,14 @@
             <w:cnfStyle w:val="001000000000" w:firstRow="0" w:lastRow="0" w:firstColumn="1" w:lastColumn="0" w:oddVBand="0" w:evenVBand="0" w:oddHBand="0" w:evenHBand="0" w:firstRowFirstColumn="0" w:firstRowLastColumn="0" w:lastRowFirstColumn="0" w:lastRowLastColumn="0"/>
             <w:tcW w:w="1387" w:type="dxa"/>
           </w:tcPr>
-          <w:p/>
+          <w:p>
+            <w:r>
+              <w:t>RNF-DES-0</w:t>
+            </w:r>
+            <w:r>
+              <w:t>2</w:t>
+            </w:r>
+          </w:p>
         </w:tc>
         <w:tc>
           <w:tcPr>
@@ -5474,6 +5798,9 @@
             <w:pPr>
               <w:cnfStyle w:val="000000000000" w:firstRow="0" w:lastRow="0" w:firstColumn="0" w:lastColumn="0" w:oddVBand="0" w:evenVBand="0" w:oddHBand="0" w:evenHBand="0" w:firstRowFirstColumn="0" w:firstRowLastColumn="0" w:lastRowFirstColumn="0" w:lastRowLastColumn="0"/>
             </w:pPr>
+            <w:r>
+              <w:t>Guia de instalação e configuração fornecido</w:t>
+            </w:r>
           </w:p>
         </w:tc>
         <w:tc>
@@ -5485,6 +5812,9 @@
               <w:jc w:val="center"/>
               <w:cnfStyle w:val="000000000000" w:firstRow="0" w:lastRow="0" w:firstColumn="0" w:lastColumn="0" w:oddVBand="0" w:evenVBand="0" w:oddHBand="0" w:evenHBand="0" w:firstRowFirstColumn="0" w:firstRowLastColumn="0" w:lastRowFirstColumn="0" w:lastRowLastColumn="0"/>
             </w:pPr>
+            <w:r>
+              <w:t>Alta</w:t>
+            </w:r>
           </w:p>
         </w:tc>
         <w:tc>
@@ -5508,7 +5838,14 @@
             <w:cnfStyle w:val="001000000000" w:firstRow="0" w:lastRow="0" w:firstColumn="1" w:lastColumn="0" w:oddVBand="0" w:evenVBand="0" w:oddHBand="0" w:evenHBand="0" w:firstRowFirstColumn="0" w:firstRowLastColumn="0" w:lastRowFirstColumn="0" w:lastRowLastColumn="0"/>
             <w:tcW w:w="1387" w:type="dxa"/>
           </w:tcPr>
-          <w:p/>
+          <w:p>
+            <w:r>
+              <w:t>RNF-DES-0</w:t>
+            </w:r>
+            <w:r>
+              <w:t>3</w:t>
+            </w:r>
+          </w:p>
         </w:tc>
         <w:tc>
           <w:tcPr>
@@ -5518,6 +5855,9 @@
             <w:pPr>
               <w:cnfStyle w:val="000000100000" w:firstRow="0" w:lastRow="0" w:firstColumn="0" w:lastColumn="0" w:oddVBand="0" w:evenVBand="0" w:oddHBand="1" w:evenHBand="0" w:firstRowFirstColumn="0" w:firstRowLastColumn="0" w:lastRowFirstColumn="0" w:lastRowLastColumn="0"/>
             </w:pPr>
+            <w:r>
+              <w:t>Projeto testado em ambiente de raiz</w:t>
+            </w:r>
           </w:p>
         </w:tc>
         <w:tc>
@@ -5529,6 +5869,9 @@
               <w:jc w:val="center"/>
               <w:cnfStyle w:val="000000100000" w:firstRow="0" w:lastRow="0" w:firstColumn="0" w:lastColumn="0" w:oddVBand="0" w:evenVBand="0" w:oddHBand="1" w:evenHBand="0" w:firstRowFirstColumn="0" w:firstRowLastColumn="0" w:lastRowFirstColumn="0" w:lastRowLastColumn="0"/>
             </w:pPr>
+            <w:r>
+              <w:t>Alta</w:t>
+            </w:r>
           </w:p>
         </w:tc>
         <w:tc>
@@ -5549,7 +5892,14 @@
             <w:cnfStyle w:val="001000000000" w:firstRow="0" w:lastRow="0" w:firstColumn="1" w:lastColumn="0" w:oddVBand="0" w:evenVBand="0" w:oddHBand="0" w:evenHBand="0" w:firstRowFirstColumn="0" w:firstRowLastColumn="0" w:lastRowFirstColumn="0" w:lastRowLastColumn="0"/>
             <w:tcW w:w="1387" w:type="dxa"/>
           </w:tcPr>
-          <w:p/>
+          <w:p>
+            <w:r>
+              <w:t>RNF-DES-0</w:t>
+            </w:r>
+            <w:r>
+              <w:t>4</w:t>
+            </w:r>
+          </w:p>
         </w:tc>
         <w:tc>
           <w:tcPr>
@@ -5559,6 +5909,17 @@
             <w:pPr>
               <w:cnfStyle w:val="000000000000" w:firstRow="0" w:lastRow="0" w:firstColumn="0" w:lastColumn="0" w:oddVBand="0" w:evenVBand="0" w:oddHBand="0" w:evenHBand="0" w:firstRowFirstColumn="0" w:firstRowLastColumn="0" w:lastRowFirstColumn="0" w:lastRowLastColumn="0"/>
             </w:pPr>
+            <w:r>
+              <w:t>Ficheiro .</w:t>
+            </w:r>
+            <w:proofErr w:type="spellStart"/>
+            <w:r>
+              <w:t>sql</w:t>
+            </w:r>
+            <w:proofErr w:type="spellEnd"/>
+            <w:r>
+              <w:t xml:space="preserve"> fornecido se utilizar base de dados</w:t>
+            </w:r>
           </w:p>
         </w:tc>
         <w:tc>
@@ -5571,6 +5932,9 @@
               <w:jc w:val="center"/>
               <w:cnfStyle w:val="000000000000" w:firstRow="0" w:lastRow="0" w:firstColumn="0" w:lastColumn="0" w:oddVBand="0" w:evenVBand="0" w:oddHBand="0" w:evenHBand="0" w:firstRowFirstColumn="0" w:firstRowLastColumn="0" w:lastRowFirstColumn="0" w:lastRowLastColumn="0"/>
             </w:pPr>
+            <w:r>
+              <w:t>Média</w:t>
+            </w:r>
           </w:p>
         </w:tc>
         <w:tc>

</xml_diff>

<commit_message>
Organize: Move JIRA scripts and tasks into /JIRA folder, clean up root directory
</commit_message>
<xml_diff>
--- a/IPL-TeSP-PSI-TS-2024_Relatório.docx
+++ b/IPL-TeSP-PSI-TS-2024_Relatório.docx
@@ -2692,10 +2692,7 @@
           </w:tcPr>
           <w:p>
             <w:r>
-              <w:t>RF-0</w:t>
-            </w:r>
-            <w:r>
-              <w:t>2</w:t>
+              <w:t>RF-02</w:t>
             </w:r>
           </w:p>
         </w:tc>
@@ -2749,10 +2746,7 @@
           </w:tcPr>
           <w:p>
             <w:r>
-              <w:t>RF-0</w:t>
-            </w:r>
-            <w:r>
-              <w:t>3</w:t>
+              <w:t>RF-03</w:t>
             </w:r>
           </w:p>
         </w:tc>
@@ -2803,10 +2797,7 @@
           </w:tcPr>
           <w:p>
             <w:r>
-              <w:t>RF-0</w:t>
-            </w:r>
-            <w:r>
-              <w:t>4</w:t>
+              <w:t>RF-04</w:t>
             </w:r>
           </w:p>
         </w:tc>
@@ -2861,10 +2852,7 @@
           <w:p>
             <w:r>
               <w:lastRenderedPageBreak/>
-              <w:t>RF-0</w:t>
-            </w:r>
-            <w:r>
-              <w:t>5</w:t>
+              <w:t>RF-05</w:t>
             </w:r>
           </w:p>
         </w:tc>
@@ -2917,10 +2905,7 @@
           </w:tcPr>
           <w:p>
             <w:r>
-              <w:t>RF-0</w:t>
-            </w:r>
-            <w:r>
-              <w:t>6</w:t>
+              <w:t>RF-06</w:t>
             </w:r>
           </w:p>
         </w:tc>
@@ -2976,10 +2961,7 @@
           </w:tcPr>
           <w:p>
             <w:r>
-              <w:t>RF-0</w:t>
-            </w:r>
-            <w:r>
-              <w:t>7</w:t>
+              <w:t>RF-07</w:t>
             </w:r>
           </w:p>
         </w:tc>
@@ -3032,10 +3014,7 @@
           </w:tcPr>
           <w:p>
             <w:r>
-              <w:t>RF-0</w:t>
-            </w:r>
-            <w:r>
-              <w:t>8</w:t>
+              <w:t>RF-08</w:t>
             </w:r>
           </w:p>
         </w:tc>
@@ -3091,10 +3070,7 @@
           </w:tcPr>
           <w:p>
             <w:r>
-              <w:t>RF-0</w:t>
-            </w:r>
-            <w:r>
-              <w:t>9</w:t>
+              <w:t>RF-09</w:t>
             </w:r>
           </w:p>
         </w:tc>
@@ -3147,10 +3123,7 @@
           </w:tcPr>
           <w:p>
             <w:r>
-              <w:t>RF-</w:t>
-            </w:r>
-            <w:r>
-              <w:t>10</w:t>
+              <w:t>RF-10</w:t>
             </w:r>
           </w:p>
         </w:tc>
@@ -3439,10 +3412,7 @@
           </w:tcPr>
           <w:p>
             <w:r>
-              <w:t>RNF-USA-0</w:t>
-            </w:r>
-            <w:r>
-              <w:t>2</w:t>
+              <w:t>RNF-USA-02</w:t>
             </w:r>
           </w:p>
         </w:tc>
@@ -3496,10 +3466,7 @@
           </w:tcPr>
           <w:p>
             <w:r>
-              <w:t>RNF-USA-0</w:t>
-            </w:r>
-            <w:r>
-              <w:t>3</w:t>
+              <w:t>RNF-USA-03</w:t>
             </w:r>
           </w:p>
         </w:tc>
@@ -3550,10 +3517,7 @@
           </w:tcPr>
           <w:p>
             <w:r>
-              <w:t>RNF-USA-0</w:t>
-            </w:r>
-            <w:r>
-              <w:t>4</w:t>
+              <w:t>RNF-USA-04</w:t>
             </w:r>
           </w:p>
         </w:tc>
@@ -3817,10 +3781,7 @@
           </w:tcPr>
           <w:p>
             <w:r>
-              <w:t>RNF-FIA-0</w:t>
-            </w:r>
-            <w:r>
-              <w:t>2</w:t>
+              <w:t>RNF-FIA-02</w:t>
             </w:r>
           </w:p>
         </w:tc>
@@ -3874,10 +3835,7 @@
           </w:tcPr>
           <w:p>
             <w:r>
-              <w:t>RNF-FIA-0</w:t>
-            </w:r>
-            <w:r>
-              <w:t>3</w:t>
+              <w:t>RNF-FIA-03</w:t>
             </w:r>
           </w:p>
         </w:tc>
@@ -3928,10 +3886,7 @@
           </w:tcPr>
           <w:p>
             <w:r>
-              <w:t>RNF-FIA-0</w:t>
-            </w:r>
-            <w:r>
-              <w:t>4</w:t>
+              <w:t>RNF-FIA-04</w:t>
             </w:r>
           </w:p>
         </w:tc>
@@ -4195,10 +4150,7 @@
           </w:tcPr>
           <w:p>
             <w:r>
-              <w:t>RNF-SEG-0</w:t>
-            </w:r>
-            <w:r>
-              <w:t>2</w:t>
+              <w:t>RNF-SEG-02</w:t>
             </w:r>
           </w:p>
         </w:tc>
@@ -4252,10 +4204,7 @@
           </w:tcPr>
           <w:p>
             <w:r>
-              <w:t>RNF-SEG-0</w:t>
-            </w:r>
-            <w:r>
-              <w:t>3</w:t>
+              <w:t>RNF-SEG-03</w:t>
             </w:r>
           </w:p>
         </w:tc>
@@ -4322,10 +4271,7 @@
           </w:tcPr>
           <w:p>
             <w:r>
-              <w:t>RNF-SEG-0</w:t>
-            </w:r>
-            <w:r>
-              <w:t>4</w:t>
+              <w:t>RNF-SEG-04</w:t>
             </w:r>
           </w:p>
         </w:tc>
@@ -4599,10 +4545,7 @@
           </w:tcPr>
           <w:p>
             <w:r>
-              <w:t>RNF-EFI-0</w:t>
-            </w:r>
-            <w:r>
-              <w:t>2</w:t>
+              <w:t>RNF-EFI-02</w:t>
             </w:r>
           </w:p>
         </w:tc>
@@ -4656,10 +4599,7 @@
           </w:tcPr>
           <w:p>
             <w:r>
-              <w:t>RNF-EFI-0</w:t>
-            </w:r>
-            <w:r>
-              <w:t>3</w:t>
+              <w:t>RNF-EFI-03</w:t>
             </w:r>
           </w:p>
         </w:tc>
@@ -4715,10 +4655,7 @@
           </w:tcPr>
           <w:p>
             <w:r>
-              <w:t>RNF-EFI-0</w:t>
-            </w:r>
-            <w:r>
-              <w:t>4</w:t>
+              <w:t>RNF-EFI-04</w:t>
             </w:r>
           </w:p>
         </w:tc>
@@ -4992,10 +4929,7 @@
           </w:tcPr>
           <w:p>
             <w:r>
-              <w:t>RNF-DIS-0</w:t>
-            </w:r>
-            <w:r>
-              <w:t>2</w:t>
+              <w:t>RNF-DIS-02</w:t>
             </w:r>
           </w:p>
         </w:tc>
@@ -5049,10 +4983,7 @@
           </w:tcPr>
           <w:p>
             <w:r>
-              <w:t>RNF-DIS-0</w:t>
-            </w:r>
-            <w:r>
-              <w:t>3</w:t>
+              <w:t>RNF-DIS-03</w:t>
             </w:r>
           </w:p>
         </w:tc>
@@ -5103,10 +5034,7 @@
           </w:tcPr>
           <w:p>
             <w:r>
-              <w:t>RNF-DIS-0</w:t>
-            </w:r>
-            <w:r>
-              <w:t>4</w:t>
+              <w:t>RNF-DIS-04</w:t>
             </w:r>
           </w:p>
         </w:tc>
@@ -5381,10 +5309,7 @@
           </w:tcPr>
           <w:p>
             <w:r>
-              <w:t>RNF-AMB-0</w:t>
-            </w:r>
-            <w:r>
-              <w:t>2</w:t>
+              <w:t>RNF-AMB-02</w:t>
             </w:r>
           </w:p>
         </w:tc>
@@ -5439,10 +5364,7 @@
           </w:tcPr>
           <w:p>
             <w:r>
-              <w:t>RNF-AMB-0</w:t>
-            </w:r>
-            <w:r>
-              <w:t>3</w:t>
+              <w:t>RNF-AMB-03</w:t>
             </w:r>
           </w:p>
         </w:tc>
@@ -5504,10 +5426,7 @@
           </w:tcPr>
           <w:p>
             <w:r>
-              <w:t>RNF-AMB-0</w:t>
-            </w:r>
-            <w:r>
-              <w:t>4</w:t>
+              <w:t>RNF-AMB-04</w:t>
             </w:r>
           </w:p>
         </w:tc>
@@ -5783,10 +5702,7 @@
           </w:tcPr>
           <w:p>
             <w:r>
-              <w:t>RNF-DES-0</w:t>
-            </w:r>
-            <w:r>
-              <w:t>2</w:t>
+              <w:t>RNF-DES-02</w:t>
             </w:r>
           </w:p>
         </w:tc>
@@ -5840,10 +5756,7 @@
           </w:tcPr>
           <w:p>
             <w:r>
-              <w:t>RNF-DES-0</w:t>
-            </w:r>
-            <w:r>
-              <w:t>3</w:t>
+              <w:t>RNF-DES-03</w:t>
             </w:r>
           </w:p>
         </w:tc>
@@ -5894,10 +5807,7 @@
           </w:tcPr>
           <w:p>
             <w:r>
-              <w:t>RNF-DES-0</w:t>
-            </w:r>
-            <w:r>
-              <w:t>4</w:t>
+              <w:t>RNF-DES-04</w:t>
             </w:r>
           </w:p>
         </w:tc>
@@ -7706,6 +7616,7 @@
   <w:style w:type="character" w:default="1" w:styleId="Tipodeletrapredefinidodopargrafo">
     <w:name w:val="Default Paragraph Font"/>
     <w:uiPriority w:val="1"/>
+    <w:semiHidden/>
     <w:unhideWhenUsed/>
   </w:style>
   <w:style w:type="table" w:default="1" w:styleId="Tabelanormal">
@@ -8958,15 +8869,16 @@
 </file>
 
 <file path=customXml/item1.xml><?xml version="1.0" encoding="utf-8"?>
-<?mso-contentType ?>
-<FormTemplates xmlns="http://schemas.microsoft.com/sharepoint/v3/contenttype/forms">
-  <Display>DocumentLibraryForm</Display>
-  <Edit>DocumentLibraryForm</Edit>
-  <New>DocumentLibraryForm</New>
-</FormTemplates>
+<b:Sources xmlns:b="http://schemas.openxmlformats.org/officeDocument/2006/bibliography" xmlns="http://schemas.openxmlformats.org/officeDocument/2006/bibliography" SelectedStyle="/APASixthEditionOfficeOnline.xsl" StyleName="APA" Version="6"/>
 </file>
 
 <file path=customXml/item2.xml><?xml version="1.0" encoding="utf-8"?>
+<p:properties xmlns:p="http://schemas.microsoft.com/office/2006/metadata/properties" xmlns:xsi="http://www.w3.org/2001/XMLSchema-instance" xmlns:pc="http://schemas.microsoft.com/office/infopath/2007/PartnerControls">
+  <documentManagement/>
+</p:properties>
+</file>
+
+<file path=customXml/item3.xml><?xml version="1.0" encoding="utf-8"?>
 <ct:contentTypeSchema xmlns:ct="http://schemas.microsoft.com/office/2006/metadata/contentType" xmlns:ma="http://schemas.microsoft.com/office/2006/metadata/properties/metaAttributes" ct:_="" ma:_="" ma:contentTypeName="Documento" ma:contentTypeID="0x0101003F8ECAAF88AFCB4AB1D806FDE394FD03" ma:contentTypeVersion="7" ma:contentTypeDescription="Criar um novo documento." ma:contentTypeScope="" ma:versionID="798687853898f8ed54c489be77f9a2ad">
   <xsd:schema xmlns:xsd="http://www.w3.org/2001/XMLSchema" xmlns:xs="http://www.w3.org/2001/XMLSchema" xmlns:p="http://schemas.microsoft.com/office/2006/metadata/properties" xmlns:ns2="52a6887f-9537-4a34-8793-b765f13d0873" targetNamespace="http://schemas.microsoft.com/office/2006/metadata/properties" ma:root="true" ma:fieldsID="68a63200760ff0df8e2889a3ca50214f" ns2:_="">
     <xsd:import namespace="52a6887f-9537-4a34-8793-b765f13d0873"/>
@@ -9130,25 +9042,33 @@
 </ct:contentTypeSchema>
 </file>
 
-<file path=customXml/item3.xml><?xml version="1.0" encoding="utf-8"?>
-<p:properties xmlns:p="http://schemas.microsoft.com/office/2006/metadata/properties" xmlns:xsi="http://www.w3.org/2001/XMLSchema-instance" xmlns:pc="http://schemas.microsoft.com/office/infopath/2007/PartnerControls">
-  <documentManagement/>
-</p:properties>
-</file>
-
 <file path=customXml/item4.xml><?xml version="1.0" encoding="utf-8"?>
-<b:Sources xmlns:b="http://schemas.openxmlformats.org/officeDocument/2006/bibliography" xmlns="http://schemas.openxmlformats.org/officeDocument/2006/bibliography" SelectedStyle="/APASixthEditionOfficeOnline.xsl" StyleName="APA" Version="6"/>
+<?mso-contentType ?>
+<FormTemplates xmlns="http://schemas.microsoft.com/sharepoint/v3/contenttype/forms">
+  <Display>DocumentLibraryForm</Display>
+  <Edit>DocumentLibraryForm</Edit>
+  <New>DocumentLibraryForm</New>
+</FormTemplates>
 </file>
 
 <file path=customXml/itemProps1.xml><?xml version="1.0" encoding="utf-8"?>
-<ds:datastoreItem xmlns:ds="http://schemas.openxmlformats.org/officeDocument/2006/customXml" ds:itemID="{3049E901-D460-4040-BE52-BFB2CA5EF0CE}">
+<ds:datastoreItem xmlns:ds="http://schemas.openxmlformats.org/officeDocument/2006/customXml" ds:itemID="{19617398-908E-4614-909E-0F810C8F0377}">
   <ds:schemaRefs>
-    <ds:schemaRef ds:uri="http://schemas.microsoft.com/sharepoint/v3/contenttype/forms"/>
+    <ds:schemaRef ds:uri="http://schemas.openxmlformats.org/officeDocument/2006/bibliography"/>
   </ds:schemaRefs>
 </ds:datastoreItem>
 </file>
 
 <file path=customXml/itemProps2.xml><?xml version="1.0" encoding="utf-8"?>
+<ds:datastoreItem xmlns:ds="http://schemas.openxmlformats.org/officeDocument/2006/customXml" ds:itemID="{0D05F977-E0EB-4BDE-9CCC-35AE7F3468D1}">
+  <ds:schemaRefs>
+    <ds:schemaRef ds:uri="http://schemas.microsoft.com/office/2006/metadata/properties"/>
+    <ds:schemaRef ds:uri="http://schemas.microsoft.com/office/infopath/2007/PartnerControls"/>
+  </ds:schemaRefs>
+</ds:datastoreItem>
+</file>
+
+<file path=customXml/itemProps3.xml><?xml version="1.0" encoding="utf-8"?>
 <ds:datastoreItem xmlns:ds="http://schemas.openxmlformats.org/officeDocument/2006/customXml" ds:itemID="{4E47A284-D0FB-4EA5-B440-9D7D3810D8E5}">
   <ds:schemaRefs>
     <ds:schemaRef ds:uri="http://schemas.microsoft.com/office/2006/metadata/contentType"/>
@@ -9166,19 +9086,10 @@
 </ds:datastoreItem>
 </file>
 
-<file path=customXml/itemProps3.xml><?xml version="1.0" encoding="utf-8"?>
-<ds:datastoreItem xmlns:ds="http://schemas.openxmlformats.org/officeDocument/2006/customXml" ds:itemID="{0D05F977-E0EB-4BDE-9CCC-35AE7F3468D1}">
+<file path=customXml/itemProps4.xml><?xml version="1.0" encoding="utf-8"?>
+<ds:datastoreItem xmlns:ds="http://schemas.openxmlformats.org/officeDocument/2006/customXml" ds:itemID="{3049E901-D460-4040-BE52-BFB2CA5EF0CE}">
   <ds:schemaRefs>
-    <ds:schemaRef ds:uri="http://schemas.microsoft.com/office/2006/metadata/properties"/>
-    <ds:schemaRef ds:uri="http://schemas.microsoft.com/office/infopath/2007/PartnerControls"/>
-  </ds:schemaRefs>
-</ds:datastoreItem>
-</file>
-
-<file path=customXml/itemProps4.xml><?xml version="1.0" encoding="utf-8"?>
-<ds:datastoreItem xmlns:ds="http://schemas.openxmlformats.org/officeDocument/2006/customXml" ds:itemID="{19617398-908E-4614-909E-0F810C8F0377}">
-  <ds:schemaRefs>
-    <ds:schemaRef ds:uri="http://schemas.openxmlformats.org/officeDocument/2006/bibliography"/>
+    <ds:schemaRef ds:uri="http://schemas.microsoft.com/sharepoint/v3/contenttype/forms"/>
   </ds:schemaRefs>
 </ds:datastoreItem>
 </file>
</xml_diff>

<commit_message>
refactor: reorganize repository structure and clean up unnecessary files
- Move all documentation to documentacao/ folder (README, analysis, reports)
- Remove JIRA scripts from repository (manage in external system)
- Update .gitignore to exclude test scripts, logs, and build artifacts
- Keep only essential project code and documentation in main tree
- Clean up root directory - only project and documentation remain

Structure:
  /TrabalhoPratico/ - Source code (ChatClient, ChatServer)
  /documentacao/ - All project documentation and analysis

Reduces repository clutter while maintaining full traceability.
</commit_message>
<xml_diff>
--- a/IPL-TeSP-PSI-TS-2024_Relatório.docx
+++ b/IPL-TeSP-PSI-TS-2024_Relatório.docx
@@ -732,33 +732,16 @@
               </w:rPr>
               <w:t xml:space="preserve">Nº </w:t>
             </w:r>
-            <w:r>
-              <w:rPr>
-                <w:rFonts w:asciiTheme="minorHAnsi" w:hAnsiTheme="minorHAnsi" w:cstheme="minorHAnsi"/>
-                <w:b/>
-                <w:sz w:val="20"/>
-                <w:highlight w:val="yellow"/>
-              </w:rPr>
-              <w:t>2</w:t>
-            </w:r>
-            <w:r>
-              <w:rPr>
-                <w:rFonts w:asciiTheme="minorHAnsi" w:hAnsiTheme="minorHAnsi" w:cstheme="minorHAnsi"/>
-                <w:b/>
-                <w:sz w:val="20"/>
-                <w:highlight w:val="yellow"/>
-              </w:rPr>
-              <w:t>3</w:t>
-            </w:r>
-            <w:r>
-              <w:rPr>
-                <w:rFonts w:asciiTheme="minorHAnsi" w:hAnsiTheme="minorHAnsi" w:cstheme="minorHAnsi"/>
-                <w:b/>
-                <w:sz w:val="20"/>
-                <w:highlight w:val="yellow"/>
-              </w:rPr>
-              <w:t>90000</w:t>
-            </w:r>
+            <w:hyperlink r:id="rId12" w:history="1">
+              <w:r>
+                <w:rPr>
+                  <w:rFonts w:asciiTheme="minorHAnsi" w:hAnsiTheme="minorHAnsi" w:cstheme="minorHAnsi"/>
+                  <w:b/>
+                  <w:sz w:val="20"/>
+                </w:rPr>
+                <w:t>2025152794</w:t>
+              </w:r>
+            </w:hyperlink>
           </w:p>
         </w:tc>
         <w:tc>
@@ -780,32 +763,31 @@
                 <w:sz w:val="20"/>
               </w:rPr>
             </w:pPr>
+            <w:proofErr w:type="spellStart"/>
             <w:r>
               <w:rPr>
                 <w:rFonts w:asciiTheme="minorHAnsi" w:hAnsiTheme="minorHAnsi" w:cstheme="minorHAnsi"/>
                 <w:bCs/>
                 <w:sz w:val="20"/>
-                <w:highlight w:val="yellow"/>
-              </w:rPr>
-              <w:t xml:space="preserve">&lt;Nome aluno </w:t>
+              </w:rPr>
+              <w:t>V</w:t>
             </w:r>
             <w:r>
               <w:rPr>
                 <w:rFonts w:asciiTheme="minorHAnsi" w:hAnsiTheme="minorHAnsi" w:cstheme="minorHAnsi"/>
                 <w:bCs/>
                 <w:sz w:val="20"/>
-                <w:highlight w:val="yellow"/>
-              </w:rPr>
-              <w:t>2</w:t>
-            </w:r>
+              </w:rPr>
+              <w:t>itor</w:t>
+            </w:r>
+            <w:proofErr w:type="spellEnd"/>
             <w:r>
               <w:rPr>
                 <w:rFonts w:asciiTheme="minorHAnsi" w:hAnsiTheme="minorHAnsi" w:cstheme="minorHAnsi"/>
                 <w:bCs/>
                 <w:sz w:val="20"/>
-                <w:highlight w:val="yellow"/>
-              </w:rPr>
-              <w:t>&gt;</w:t>
+              </w:rPr>
+              <w:t xml:space="preserve"> Emanuel Louro Leonardo</w:t>
             </w:r>
           </w:p>
         </w:tc>
@@ -844,33 +826,16 @@
               </w:rPr>
               <w:t xml:space="preserve">Nº </w:t>
             </w:r>
-            <w:r>
-              <w:rPr>
-                <w:rFonts w:asciiTheme="minorHAnsi" w:hAnsiTheme="minorHAnsi" w:cstheme="minorHAnsi"/>
-                <w:b/>
-                <w:sz w:val="20"/>
-                <w:highlight w:val="yellow"/>
-              </w:rPr>
-              <w:t>2</w:t>
-            </w:r>
-            <w:r>
-              <w:rPr>
-                <w:rFonts w:asciiTheme="minorHAnsi" w:hAnsiTheme="minorHAnsi" w:cstheme="minorHAnsi"/>
-                <w:b/>
-                <w:sz w:val="20"/>
-                <w:highlight w:val="yellow"/>
-              </w:rPr>
-              <w:t>3</w:t>
-            </w:r>
-            <w:r>
-              <w:rPr>
-                <w:rFonts w:asciiTheme="minorHAnsi" w:hAnsiTheme="minorHAnsi" w:cstheme="minorHAnsi"/>
-                <w:b/>
-                <w:sz w:val="20"/>
-                <w:highlight w:val="yellow"/>
-              </w:rPr>
-              <w:t>90000</w:t>
-            </w:r>
+            <w:hyperlink r:id="rId13" w:history="1">
+              <w:r>
+                <w:rPr>
+                  <w:rFonts w:asciiTheme="minorHAnsi" w:hAnsiTheme="minorHAnsi" w:cstheme="minorHAnsi"/>
+                  <w:b/>
+                  <w:sz w:val="20"/>
+                </w:rPr>
+                <w:t>2025153175</w:t>
+              </w:r>
+            </w:hyperlink>
           </w:p>
         </w:tc>
         <w:tc>
@@ -897,142 +862,8 @@
                 <w:rFonts w:asciiTheme="minorHAnsi" w:hAnsiTheme="minorHAnsi" w:cstheme="minorHAnsi"/>
                 <w:bCs/>
                 <w:sz w:val="20"/>
-                <w:highlight w:val="yellow"/>
-              </w:rPr>
-              <w:t xml:space="preserve">&lt;Nome aluno </w:t>
-            </w:r>
-            <w:r>
-              <w:rPr>
-                <w:rFonts w:asciiTheme="minorHAnsi" w:hAnsiTheme="minorHAnsi" w:cstheme="minorHAnsi"/>
-                <w:bCs/>
-                <w:sz w:val="20"/>
-                <w:highlight w:val="yellow"/>
-              </w:rPr>
-              <w:t>3</w:t>
-            </w:r>
-            <w:r>
-              <w:rPr>
-                <w:rFonts w:asciiTheme="minorHAnsi" w:hAnsiTheme="minorHAnsi" w:cstheme="minorHAnsi"/>
-                <w:bCs/>
-                <w:sz w:val="20"/>
-                <w:highlight w:val="yellow"/>
-              </w:rPr>
-              <w:t>&gt;</w:t>
-            </w:r>
-          </w:p>
-        </w:tc>
-      </w:tr>
-      <w:tr>
-        <w:trPr>
-          <w:trHeight w:val="358"/>
-        </w:trPr>
-        <w:tc>
-          <w:tcPr>
-            <w:tcW w:w="2258" w:type="dxa"/>
-            <w:tcBorders>
-              <w:left w:val="dashSmallGap" w:sz="8" w:space="0" w:color="000001"/>
-              <w:bottom w:val="dashSmallGap" w:sz="4" w:space="0" w:color="auto"/>
-              <w:right w:val="dashSmallGap" w:sz="4" w:space="0" w:color="auto"/>
-            </w:tcBorders>
-            <w:tcMar>
-              <w:left w:w="88" w:type="dxa"/>
-            </w:tcMar>
-            <w:vAlign w:val="center"/>
-          </w:tcPr>
-          <w:p>
-            <w:pPr>
-              <w:pStyle w:val="TextBody"/>
-              <w:spacing w:before="40" w:after="40"/>
-              <w:rPr>
-                <w:rFonts w:asciiTheme="minorHAnsi" w:hAnsiTheme="minorHAnsi" w:cstheme="minorHAnsi"/>
-                <w:b/>
-                <w:sz w:val="20"/>
-              </w:rPr>
-            </w:pPr>
-            <w:r>
-              <w:rPr>
-                <w:rFonts w:asciiTheme="minorHAnsi" w:hAnsiTheme="minorHAnsi" w:cstheme="minorHAnsi"/>
-                <w:b/>
-                <w:sz w:val="20"/>
-              </w:rPr>
-              <w:t xml:space="preserve">Nº </w:t>
-            </w:r>
-            <w:r>
-              <w:rPr>
-                <w:rFonts w:asciiTheme="minorHAnsi" w:hAnsiTheme="minorHAnsi" w:cstheme="minorHAnsi"/>
-                <w:b/>
-                <w:sz w:val="20"/>
-                <w:highlight w:val="yellow"/>
-              </w:rPr>
-              <w:t>2</w:t>
-            </w:r>
-            <w:r>
-              <w:rPr>
-                <w:rFonts w:asciiTheme="minorHAnsi" w:hAnsiTheme="minorHAnsi" w:cstheme="minorHAnsi"/>
-                <w:b/>
-                <w:sz w:val="20"/>
-                <w:highlight w:val="yellow"/>
-              </w:rPr>
-              <w:t>3</w:t>
-            </w:r>
-            <w:r>
-              <w:rPr>
-                <w:rFonts w:asciiTheme="minorHAnsi" w:hAnsiTheme="minorHAnsi" w:cstheme="minorHAnsi"/>
-                <w:b/>
-                <w:sz w:val="20"/>
-                <w:highlight w:val="yellow"/>
-              </w:rPr>
-              <w:t>90000</w:t>
-            </w:r>
-          </w:p>
-        </w:tc>
-        <w:tc>
-          <w:tcPr>
-            <w:tcW w:w="7371" w:type="dxa"/>
-            <w:gridSpan w:val="2"/>
-            <w:tcBorders>
-              <w:left w:val="dashSmallGap" w:sz="8" w:space="0" w:color="000001"/>
-              <w:bottom w:val="dashSmallGap" w:sz="4" w:space="0" w:color="auto"/>
-              <w:right w:val="dashSmallGap" w:sz="4" w:space="0" w:color="auto"/>
-            </w:tcBorders>
-          </w:tcPr>
-          <w:p>
-            <w:pPr>
-              <w:pStyle w:val="TextBody"/>
-              <w:spacing w:before="40" w:after="40"/>
-              <w:rPr>
-                <w:rFonts w:asciiTheme="minorHAnsi" w:hAnsiTheme="minorHAnsi" w:cstheme="minorHAnsi"/>
-                <w:bCs/>
-                <w:sz w:val="20"/>
-                <w:highlight w:val="yellow"/>
-              </w:rPr>
-            </w:pPr>
-            <w:r>
-              <w:rPr>
-                <w:rFonts w:asciiTheme="minorHAnsi" w:hAnsiTheme="minorHAnsi" w:cstheme="minorHAnsi"/>
-                <w:bCs/>
-                <w:sz w:val="20"/>
-                <w:highlight w:val="yellow"/>
-              </w:rPr>
-              <w:t xml:space="preserve">&lt;Nome aluno </w:t>
-            </w:r>
-            <w:r>
-              <w:rPr>
-                <w:rFonts w:asciiTheme="minorHAnsi" w:hAnsiTheme="minorHAnsi" w:cstheme="minorHAnsi"/>
-                <w:bCs/>
-                <w:sz w:val="20"/>
-                <w:highlight w:val="yellow"/>
-              </w:rPr>
-              <w:t>4</w:t>
-            </w:r>
-            <w:r>
-              <w:rPr>
-                <w:rFonts w:asciiTheme="minorHAnsi" w:hAnsiTheme="minorHAnsi" w:cstheme="minorHAnsi"/>
-                <w:bCs/>
-                <w:sz w:val="20"/>
-                <w:highlight w:val="yellow"/>
-              </w:rPr>
-              <w:t>&gt;</w:t>
+              </w:rPr>
+              <w:t>Kelly Ferreira</w:t>
             </w:r>
           </w:p>
         </w:tc>
@@ -1072,9 +903,9 @@
           <w:sz w:val="11"/>
         </w:rPr>
         <w:sectPr>
-          <w:headerReference w:type="default" r:id="rId12"/>
-          <w:footerReference w:type="default" r:id="rId13"/>
-          <w:footerReference w:type="first" r:id="rId14"/>
+          <w:headerReference w:type="default" r:id="rId14"/>
+          <w:footerReference w:type="default" r:id="rId15"/>
+          <w:footerReference w:type="first" r:id="rId16"/>
           <w:pgSz w:w="12240" w:h="15840"/>
           <w:pgMar w:top="1134" w:right="1418" w:bottom="912" w:left="1418" w:header="709" w:footer="709" w:gutter="0"/>
           <w:cols w:space="720"/>
@@ -2443,7 +2274,19 @@
     </w:p>
     <w:p>
       <w:r>
-        <w:t xml:space="preserve">Este projeto tem como objetivo o desenvolvimento de um sistema de chat seguro em C#, implementando mecanismos de criptografia (simétrica e assimétrica), autenticação e validação de dados através de assinaturas digitais. O sistema será composto por um módulo cliente com interface gráfica (Windows </w:t>
+        <w:t>Este projeto tem como objetivo o desenvolvimento de um sistema de chat seguro em C#, implementando mecanismos de criptografia (simétrica e assimétrica), autenticação e validação de dados</w:t>
+      </w:r>
+      <w:r>
+        <w:t>,</w:t>
+      </w:r>
+      <w:r>
+        <w:t xml:space="preserve"> </w:t>
+      </w:r>
+      <w:r>
+        <w:t>o</w:t>
+      </w:r>
+      <w:r>
+        <w:t xml:space="preserve"> sistema será composto por um módulo cliente com interface gráfica (Windows </w:t>
       </w:r>
       <w:proofErr w:type="spellStart"/>
       <w:r>
@@ -2451,7 +2294,13 @@
       </w:r>
       <w:proofErr w:type="spellEnd"/>
       <w:r>
-        <w:t xml:space="preserve">) e um módulo servidor console, permitindo comunicação segura entre múltiplos clientes. </w:t>
+        <w:t xml:space="preserve">) e um módulo servidor console, permitindo comunicação segura entre </w:t>
+      </w:r>
+      <w:r>
+        <w:t>vários</w:t>
+      </w:r>
+      <w:r>
+        <w:t xml:space="preserve"> clientes. </w:t>
       </w:r>
     </w:p>
     <w:p>
@@ -2464,7 +2313,7 @@
       </w:r>
       <w:proofErr w:type="spellEnd"/>
       <w:r>
-        <w:t xml:space="preserve"> TCP/IP e protocolos de autenticação robustos.</w:t>
+        <w:t xml:space="preserve"> TCP/IP e protocolos de autenticação.</w:t>
       </w:r>
     </w:p>
     <w:p>
@@ -7616,7 +7465,6 @@
   <w:style w:type="character" w:default="1" w:styleId="Tipodeletrapredefinidodopargrafo">
     <w:name w:val="Default Paragraph Font"/>
     <w:uiPriority w:val="1"/>
-    <w:semiHidden/>
     <w:unhideWhenUsed/>
   </w:style>
   <w:style w:type="table" w:default="1" w:styleId="Tabelanormal">
@@ -8570,6 +8418,18 @@
       </w:tcPr>
     </w:tblStylePr>
   </w:style>
+  <w:style w:type="character" w:styleId="MenoNoResolvida">
+    <w:name w:val="Unresolved Mention"/>
+    <w:basedOn w:val="Tipodeletrapredefinidodopargrafo"/>
+    <w:uiPriority w:val="99"/>
+    <w:semiHidden/>
+    <w:unhideWhenUsed/>
+    <w:rsid w:val="009744B9"/>
+    <w:rPr>
+      <w:color w:val="605E5C"/>
+      <w:shd w:val="clear" w:color="auto" w:fill="E1DFDD"/>
+    </w:rPr>
+  </w:style>
 </w:styles>
 </file>
 
@@ -8869,16 +8729,6 @@
 </file>
 
 <file path=customXml/item1.xml><?xml version="1.0" encoding="utf-8"?>
-<b:Sources xmlns:b="http://schemas.openxmlformats.org/officeDocument/2006/bibliography" xmlns="http://schemas.openxmlformats.org/officeDocument/2006/bibliography" SelectedStyle="/APASixthEditionOfficeOnline.xsl" StyleName="APA" Version="6"/>
-</file>
-
-<file path=customXml/item2.xml><?xml version="1.0" encoding="utf-8"?>
-<p:properties xmlns:p="http://schemas.microsoft.com/office/2006/metadata/properties" xmlns:xsi="http://www.w3.org/2001/XMLSchema-instance" xmlns:pc="http://schemas.microsoft.com/office/infopath/2007/PartnerControls">
-  <documentManagement/>
-</p:properties>
-</file>
-
-<file path=customXml/item3.xml><?xml version="1.0" encoding="utf-8"?>
 <ct:contentTypeSchema xmlns:ct="http://schemas.microsoft.com/office/2006/metadata/contentType" xmlns:ma="http://schemas.microsoft.com/office/2006/metadata/properties/metaAttributes" ct:_="" ma:_="" ma:contentTypeName="Documento" ma:contentTypeID="0x0101003F8ECAAF88AFCB4AB1D806FDE394FD03" ma:contentTypeVersion="7" ma:contentTypeDescription="Criar um novo documento." ma:contentTypeScope="" ma:versionID="798687853898f8ed54c489be77f9a2ad">
   <xsd:schema xmlns:xsd="http://www.w3.org/2001/XMLSchema" xmlns:xs="http://www.w3.org/2001/XMLSchema" xmlns:p="http://schemas.microsoft.com/office/2006/metadata/properties" xmlns:ns2="52a6887f-9537-4a34-8793-b765f13d0873" targetNamespace="http://schemas.microsoft.com/office/2006/metadata/properties" ma:root="true" ma:fieldsID="68a63200760ff0df8e2889a3ca50214f" ns2:_="">
     <xsd:import namespace="52a6887f-9537-4a34-8793-b765f13d0873"/>
@@ -9042,6 +8892,16 @@
 </ct:contentTypeSchema>
 </file>
 
+<file path=customXml/item2.xml><?xml version="1.0" encoding="utf-8"?>
+<p:properties xmlns:p="http://schemas.microsoft.com/office/2006/metadata/properties" xmlns:xsi="http://www.w3.org/2001/XMLSchema-instance" xmlns:pc="http://schemas.microsoft.com/office/infopath/2007/PartnerControls">
+  <documentManagement/>
+</p:properties>
+</file>
+
+<file path=customXml/item3.xml><?xml version="1.0" encoding="utf-8"?>
+<b:Sources xmlns:b="http://schemas.openxmlformats.org/officeDocument/2006/bibliography" xmlns="http://schemas.openxmlformats.org/officeDocument/2006/bibliography" SelectedStyle="/APASixthEditionOfficeOnline.xsl" StyleName="APA" Version="6"/>
+</file>
+
 <file path=customXml/item4.xml><?xml version="1.0" encoding="utf-8"?>
 <?mso-contentType ?>
 <FormTemplates xmlns="http://schemas.microsoft.com/sharepoint/v3/contenttype/forms">
@@ -9052,23 +8912,6 @@
 </file>
 
 <file path=customXml/itemProps1.xml><?xml version="1.0" encoding="utf-8"?>
-<ds:datastoreItem xmlns:ds="http://schemas.openxmlformats.org/officeDocument/2006/customXml" ds:itemID="{19617398-908E-4614-909E-0F810C8F0377}">
-  <ds:schemaRefs>
-    <ds:schemaRef ds:uri="http://schemas.openxmlformats.org/officeDocument/2006/bibliography"/>
-  </ds:schemaRefs>
-</ds:datastoreItem>
-</file>
-
-<file path=customXml/itemProps2.xml><?xml version="1.0" encoding="utf-8"?>
-<ds:datastoreItem xmlns:ds="http://schemas.openxmlformats.org/officeDocument/2006/customXml" ds:itemID="{0D05F977-E0EB-4BDE-9CCC-35AE7F3468D1}">
-  <ds:schemaRefs>
-    <ds:schemaRef ds:uri="http://schemas.microsoft.com/office/2006/metadata/properties"/>
-    <ds:schemaRef ds:uri="http://schemas.microsoft.com/office/infopath/2007/PartnerControls"/>
-  </ds:schemaRefs>
-</ds:datastoreItem>
-</file>
-
-<file path=customXml/itemProps3.xml><?xml version="1.0" encoding="utf-8"?>
 <ds:datastoreItem xmlns:ds="http://schemas.openxmlformats.org/officeDocument/2006/customXml" ds:itemID="{4E47A284-D0FB-4EA5-B440-9D7D3810D8E5}">
   <ds:schemaRefs>
     <ds:schemaRef ds:uri="http://schemas.microsoft.com/office/2006/metadata/contentType"/>
@@ -9086,10 +8929,33 @@
 </ds:datastoreItem>
 </file>
 
+<file path=customXml/itemProps2.xml><?xml version="1.0" encoding="utf-8"?>
+<ds:datastoreItem xmlns:ds="http://schemas.openxmlformats.org/officeDocument/2006/customXml" ds:itemID="{0D05F977-E0EB-4BDE-9CCC-35AE7F3468D1}">
+  <ds:schemaRefs>
+    <ds:schemaRef ds:uri="http://schemas.microsoft.com/office/2006/metadata/properties"/>
+    <ds:schemaRef ds:uri="http://schemas.microsoft.com/office/infopath/2007/PartnerControls"/>
+  </ds:schemaRefs>
+</ds:datastoreItem>
+</file>
+
+<file path=customXml/itemProps3.xml><?xml version="1.0" encoding="utf-8"?>
+<ds:datastoreItem xmlns:ds="http://schemas.openxmlformats.org/officeDocument/2006/customXml" ds:itemID="{19617398-908E-4614-909E-0F810C8F0377}">
+  <ds:schemaRefs>
+    <ds:schemaRef ds:uri="http://schemas.openxmlformats.org/officeDocument/2006/bibliography"/>
+  </ds:schemaRefs>
+</ds:datastoreItem>
+</file>
+
 <file path=customXml/itemProps4.xml><?xml version="1.0" encoding="utf-8"?>
 <ds:datastoreItem xmlns:ds="http://schemas.openxmlformats.org/officeDocument/2006/customXml" ds:itemID="{3049E901-D460-4040-BE52-BFB2CA5EF0CE}">
   <ds:schemaRefs>
     <ds:schemaRef ds:uri="http://schemas.microsoft.com/sharepoint/v3/contenttype/forms"/>
   </ds:schemaRefs>
 </ds:datastoreItem>
+</file>
+
+<file path=docMetadata/LabelInfo.xml><?xml version="1.0" encoding="utf-8"?>
+<clbl:labelList xmlns:clbl="http://schemas.microsoft.com/office/2020/mipLabelMetadata">
+  <clbl:label id="{536b85ad-a448-4186-a9af-e3ccad3302c5}" enabled="0" method="" siteId="{536b85ad-a448-4186-a9af-e3ccad3302c5}" removed="1"/>
+</clbl:labelList>
 </file>
</xml_diff>

<commit_message>
terminei as descrições dos requisitos
</commit_message>
<xml_diff>
--- a/IPL-TeSP-PSI-TS-2024_Relatório.docx
+++ b/IPL-TeSP-PSI-TS-2024_Relatório.docx
@@ -737,27 +737,8 @@
                 <w:rFonts w:asciiTheme="minorHAnsi" w:hAnsiTheme="minorHAnsi" w:cstheme="minorHAnsi"/>
                 <w:b/>
                 <w:sz w:val="20"/>
-                <w:highlight w:val="yellow"/>
-              </w:rPr>
-              <w:t>2</w:t>
-            </w:r>
-            <w:r>
-              <w:rPr>
-                <w:rFonts w:asciiTheme="minorHAnsi" w:hAnsiTheme="minorHAnsi" w:cstheme="minorHAnsi"/>
-                <w:b/>
-                <w:sz w:val="20"/>
-                <w:highlight w:val="yellow"/>
-              </w:rPr>
-              <w:t>3</w:t>
-            </w:r>
-            <w:r>
-              <w:rPr>
-                <w:rFonts w:asciiTheme="minorHAnsi" w:hAnsiTheme="minorHAnsi" w:cstheme="minorHAnsi"/>
-                <w:b/>
-                <w:sz w:val="20"/>
-                <w:highlight w:val="yellow"/>
-              </w:rPr>
-              <w:t>90000</w:t>
+              </w:rPr>
+              <w:t>2025153175</w:t>
             </w:r>
           </w:p>
         </w:tc>
@@ -785,27 +766,8 @@
                 <w:rFonts w:asciiTheme="minorHAnsi" w:hAnsiTheme="minorHAnsi" w:cstheme="minorHAnsi"/>
                 <w:bCs/>
                 <w:sz w:val="20"/>
-                <w:highlight w:val="yellow"/>
-              </w:rPr>
-              <w:t xml:space="preserve">&lt;Nome aluno </w:t>
-            </w:r>
-            <w:r>
-              <w:rPr>
-                <w:rFonts w:asciiTheme="minorHAnsi" w:hAnsiTheme="minorHAnsi" w:cstheme="minorHAnsi"/>
-                <w:bCs/>
-                <w:sz w:val="20"/>
-                <w:highlight w:val="yellow"/>
-              </w:rPr>
-              <w:t>2</w:t>
-            </w:r>
-            <w:r>
-              <w:rPr>
-                <w:rFonts w:asciiTheme="minorHAnsi" w:hAnsiTheme="minorHAnsi" w:cstheme="minorHAnsi"/>
-                <w:bCs/>
-                <w:sz w:val="20"/>
-                <w:highlight w:val="yellow"/>
-              </w:rPr>
-              <w:t>&gt;</w:t>
+              </w:rPr>
+              <w:t>Kelly Ferreira</w:t>
             </w:r>
           </w:p>
         </w:tc>
@@ -2507,24 +2469,32 @@
       </w:r>
       <w:bookmarkEnd w:id="2"/>
     </w:p>
+    <w:p>
+      <w:r>
+        <w:t>Nesta secção poderemos encontrar os requisitos necessários para a funcionalidade do nosso sistema. Tendo em conta que o sistema consiste de um programa de troca de mensagens entre dois servidores, decidimos e juntámos os requisitos ideais para o programa ter melhor usabilidade, segurança, fiabilidade, eficiência, disponibilidade, desenvolvimento e ambiente. Juntamente com os nossos requisitos funcionais, os requisitos não funcionais irão garantir o sucesso do programa.</w:t>
+      </w:r>
+    </w:p>
+    <w:p>
+      <w:pPr>
+        <w:pStyle w:val="Ttulo3"/>
+      </w:pPr>
+      <w:bookmarkStart w:id="3" w:name="_Toc67476481"/>
+      <w:r>
+        <w:t>Requisitos Funcionais (RF)</w:t>
+      </w:r>
+      <w:bookmarkEnd w:id="3"/>
+    </w:p>
+    <w:p>
+      <w:r>
+        <w:t>Os requisitos funcionais ajudam-nos a desenvolver o programa e ajudam o cliente a garantir que ambos estamos a atingir o mesmo objetivo. Esta fase é necessária para garantir o sucesso na definição dos requisitos e evitar falhas na comunicação entre a equipa e o cliente. A ideia é então nos certificarmos que as ideias chave principais sobre o propósito do programa estão esclarecidas e quem serão os atores.</w:t>
+      </w:r>
+    </w:p>
     <w:p/>
     <w:p>
-      <w:pPr>
-        <w:pStyle w:val="Ttulo3"/>
-      </w:pPr>
-      <w:bookmarkStart w:id="3" w:name="_Toc67476481"/>
-      <w:r>
-        <w:t>Requisitos Funcionais (RF)</w:t>
-      </w:r>
-      <w:bookmarkEnd w:id="3"/>
-    </w:p>
-    <w:p>
-      <w:r>
-        <w:t>&lt;Contextualização de requisitos funcionais a implementar&gt;</w:t>
-      </w:r>
-    </w:p>
-    <w:p>
-      <w:r>
+      <w:r>
+        <w:rPr>
+          <w:highlight w:val="yellow"/>
+        </w:rPr>
         <w:t>&lt;etapa II – marcar com um X na coluna “Implementado”&gt;</w:t>
       </w:r>
     </w:p>
@@ -2562,6 +2532,7 @@
               <w:rPr>
                 <w:color w:val="FFFFFF" w:themeColor="background1"/>
               </w:rPr>
+              <w:lastRenderedPageBreak/>
               <w:t># ID</w:t>
             </w:r>
           </w:p>
@@ -2692,10 +2663,7 @@
           </w:tcPr>
           <w:p>
             <w:r>
-              <w:t>RF-0</w:t>
-            </w:r>
-            <w:r>
-              <w:t>2</w:t>
+              <w:t>RF-02</w:t>
             </w:r>
           </w:p>
         </w:tc>
@@ -2749,10 +2717,7 @@
           </w:tcPr>
           <w:p>
             <w:r>
-              <w:t>RF-0</w:t>
-            </w:r>
-            <w:r>
-              <w:t>3</w:t>
+              <w:t>RF-03</w:t>
             </w:r>
           </w:p>
         </w:tc>
@@ -2803,10 +2768,7 @@
           </w:tcPr>
           <w:p>
             <w:r>
-              <w:t>RF-0</w:t>
-            </w:r>
-            <w:r>
-              <w:t>4</w:t>
+              <w:t>RF-04</w:t>
             </w:r>
           </w:p>
         </w:tc>
@@ -2860,11 +2822,7 @@
           </w:tcPr>
           <w:p>
             <w:r>
-              <w:lastRenderedPageBreak/>
-              <w:t>RF-0</w:t>
-            </w:r>
-            <w:r>
-              <w:t>5</w:t>
+              <w:t>RF-05</w:t>
             </w:r>
           </w:p>
         </w:tc>
@@ -2917,10 +2875,7 @@
           </w:tcPr>
           <w:p>
             <w:r>
-              <w:t>RF-0</w:t>
-            </w:r>
-            <w:r>
-              <w:t>6</w:t>
+              <w:t>RF-06</w:t>
             </w:r>
           </w:p>
         </w:tc>
@@ -2976,10 +2931,7 @@
           </w:tcPr>
           <w:p>
             <w:r>
-              <w:t>RF-0</w:t>
-            </w:r>
-            <w:r>
-              <w:t>7</w:t>
+              <w:t>RF-07</w:t>
             </w:r>
           </w:p>
         </w:tc>
@@ -3032,10 +2984,7 @@
           </w:tcPr>
           <w:p>
             <w:r>
-              <w:t>RF-0</w:t>
-            </w:r>
-            <w:r>
-              <w:t>8</w:t>
+              <w:t>RF-08</w:t>
             </w:r>
           </w:p>
         </w:tc>
@@ -3091,10 +3040,7 @@
           </w:tcPr>
           <w:p>
             <w:r>
-              <w:t>RF-0</w:t>
-            </w:r>
-            <w:r>
-              <w:t>9</w:t>
+              <w:t>RF-09</w:t>
             </w:r>
           </w:p>
         </w:tc>
@@ -3147,10 +3093,7 @@
           </w:tcPr>
           <w:p>
             <w:r>
-              <w:t>RF-</w:t>
-            </w:r>
-            <w:r>
-              <w:t>10</w:t>
+              <w:t>RF-10</w:t>
             </w:r>
           </w:p>
         </w:tc>
@@ -3243,23 +3186,22 @@
     </w:p>
     <w:p>
       <w:r>
-        <w:t>&lt;Contextualização de requisitos não funcionais a implementar &gt;</w:t>
+        <w:t xml:space="preserve">Requisitos não funcionais irão assegurar que o nosso programa que funcione corretamente além dos requisitos funcionais. Isso garantirá a sua devida execução de forma segura e eficiente, e irá salientar algumas necessidades que o sistema cumprir sob a responsabilidade do programador. </w:t>
       </w:r>
     </w:p>
     <w:p/>
+    <w:p>
+      <w:pPr>
+        <w:pStyle w:val="Ttulo4"/>
+      </w:pPr>
+      <w:r>
+        <w:t>Requisitos Não Funcionais de Usabilidade</w:t>
+      </w:r>
+    </w:p>
     <w:p/>
     <w:p>
-      <w:pPr>
-        <w:pStyle w:val="Ttulo4"/>
-      </w:pPr>
-      <w:r>
-        <w:t>Requisitos Não Funcionais de Usabilidade</w:t>
-      </w:r>
-    </w:p>
-    <w:p/>
-    <w:p>
-      <w:r>
-        <w:t>&lt;Contextualização de requisitos não funcionais de usabilidade a implementar&gt;</w:t>
+      <w:r>
+        <w:t>Os requisitos não funcionais de usabilidade refletem à facilidade com que o utilizador consegue aprender a utilizar o sistema. Isto é importante referir pois quanto mais intuitivo e fácil de aprender é um sistema, melhor será a experiência do utilizador e aumentará a sua produtividade.</w:t>
       </w:r>
     </w:p>
     <w:p>
@@ -3439,10 +3381,7 @@
           </w:tcPr>
           <w:p>
             <w:r>
-              <w:t>RNF-USA-0</w:t>
-            </w:r>
-            <w:r>
-              <w:t>2</w:t>
+              <w:t>RNF-USA-02</w:t>
             </w:r>
           </w:p>
         </w:tc>
@@ -3496,10 +3435,7 @@
           </w:tcPr>
           <w:p>
             <w:r>
-              <w:t>RNF-USA-0</w:t>
-            </w:r>
-            <w:r>
-              <w:t>3</w:t>
+              <w:t>RNF-USA-03</w:t>
             </w:r>
           </w:p>
         </w:tc>
@@ -3550,10 +3486,7 @@
           </w:tcPr>
           <w:p>
             <w:r>
-              <w:t>RNF-USA-0</w:t>
-            </w:r>
-            <w:r>
-              <w:t>4</w:t>
+              <w:t>RNF-USA-04</w:t>
             </w:r>
           </w:p>
         </w:tc>
@@ -3645,7 +3578,18 @@
     <w:p/>
     <w:p>
       <w:r>
-        <w:t>&lt;Contextualização de requisitos não funcionais de fiabilidade a implementar&gt;</w:t>
+        <w:t>Requisitos Não Funcionais de Fiabilidade</w:t>
+      </w:r>
+      <w:r>
+        <w:t xml:space="preserve"> referem-se à capacidade </w:t>
+      </w:r>
+      <w:proofErr w:type="gramStart"/>
+      <w:r>
+        <w:t>do</w:t>
+      </w:r>
+      <w:proofErr w:type="gramEnd"/>
+      <w:r>
+        <w:t xml:space="preserve"> sistema funcionar correta e eficientemente. Estes requisitos serão utilizados para garantir que não há falhas no sistema, o que garante a confiança do utilizador no sistema e reduz perda de dados.</w:t>
       </w:r>
     </w:p>
     <w:p>
@@ -3817,10 +3761,7 @@
           </w:tcPr>
           <w:p>
             <w:r>
-              <w:t>RNF-FIA-0</w:t>
-            </w:r>
-            <w:r>
-              <w:t>2</w:t>
+              <w:t>RNF-FIA-02</w:t>
             </w:r>
           </w:p>
         </w:tc>
@@ -3874,10 +3815,7 @@
           </w:tcPr>
           <w:p>
             <w:r>
-              <w:t>RNF-FIA-0</w:t>
-            </w:r>
-            <w:r>
-              <w:t>3</w:t>
+              <w:t>RNF-FIA-03</w:t>
             </w:r>
           </w:p>
         </w:tc>
@@ -3928,10 +3866,7 @@
           </w:tcPr>
           <w:p>
             <w:r>
-              <w:t>RNF-FIA-0</w:t>
-            </w:r>
-            <w:r>
-              <w:t>4</w:t>
+              <w:t>RNF-FIA-04</w:t>
             </w:r>
           </w:p>
         </w:tc>
@@ -4023,7 +3958,27 @@
     <w:p/>
     <w:p>
       <w:r>
-        <w:t>&lt;Contextualização de requisitos não funcionais de segurança a implementar&gt;</w:t>
+        <w:t xml:space="preserve">Requisitos Não Funcionais de </w:t>
+      </w:r>
+      <w:r>
+        <w:t xml:space="preserve">segurança é relacionado com a proteção dos dados do </w:t>
+      </w:r>
+      <w:r>
+        <w:t>utilizador e</w:t>
+      </w:r>
+      <w:r>
+        <w:t xml:space="preserve"> de controlo de acesso aos mesmos. Garantir que estes requisitos são implementados é crucial para proteger as informações sensíveis do utilizador e proteger </w:t>
+      </w:r>
+      <w:proofErr w:type="gramStart"/>
+      <w:r>
+        <w:t>contra ataques</w:t>
+      </w:r>
+      <w:proofErr w:type="gramEnd"/>
+      <w:r>
+        <w:t xml:space="preserve"> indevidos.</w:t>
+      </w:r>
+      <w:r>
+        <w:t xml:space="preserve"> </w:t>
       </w:r>
     </w:p>
     <w:p>
@@ -4195,10 +4150,7 @@
           </w:tcPr>
           <w:p>
             <w:r>
-              <w:t>RNF-SEG-0</w:t>
-            </w:r>
-            <w:r>
-              <w:t>2</w:t>
+              <w:t>RNF-SEG-02</w:t>
             </w:r>
           </w:p>
         </w:tc>
@@ -4252,10 +4204,7 @@
           </w:tcPr>
           <w:p>
             <w:r>
-              <w:t>RNF-SEG-0</w:t>
-            </w:r>
-            <w:r>
-              <w:t>3</w:t>
+              <w:t>RNF-SEG-03</w:t>
             </w:r>
           </w:p>
         </w:tc>
@@ -4311,6 +4260,9 @@
               <w:jc w:val="center"/>
               <w:cnfStyle w:val="000000100000" w:firstRow="0" w:lastRow="0" w:firstColumn="0" w:lastColumn="0" w:oddVBand="0" w:evenVBand="0" w:oddHBand="1" w:evenHBand="0" w:firstRowFirstColumn="0" w:firstRowLastColumn="0" w:lastRowFirstColumn="0" w:lastRowLastColumn="0"/>
             </w:pPr>
+            <w:r>
+              <w:t xml:space="preserve"> </w:t>
+            </w:r>
           </w:p>
         </w:tc>
       </w:tr>
@@ -4322,10 +4274,7 @@
           </w:tcPr>
           <w:p>
             <w:r>
-              <w:t>RNF-SEG-0</w:t>
-            </w:r>
-            <w:r>
-              <w:t>4</w:t>
+              <w:t>RNF-SEG-04</w:t>
             </w:r>
           </w:p>
         </w:tc>
@@ -4416,13 +4365,13 @@
     <w:p/>
     <w:p>
       <w:r>
-        <w:t>&lt;Contextualização de requisitos não funcionais de eficiência</w:t>
+        <w:t xml:space="preserve">Requisitos Não Funcionais de </w:t>
+      </w:r>
+      <w:r>
+        <w:t>eficiência diz respeito ao desempenho do sistema, como por exemplo o tempo de resposta e uso de recursos. Implementar estes requisitos irá assegurar o bom funcionamento do sistema.</w:t>
       </w:r>
       <w:r>
         <w:t xml:space="preserve"> </w:t>
-      </w:r>
-      <w:r>
-        <w:t>a implementar&gt;</w:t>
       </w:r>
     </w:p>
     <w:p>
@@ -4599,10 +4548,7 @@
           </w:tcPr>
           <w:p>
             <w:r>
-              <w:t>RNF-EFI-0</w:t>
-            </w:r>
-            <w:r>
-              <w:t>2</w:t>
+              <w:t>RNF-EFI-02</w:t>
             </w:r>
           </w:p>
         </w:tc>
@@ -4656,10 +4602,7 @@
           </w:tcPr>
           <w:p>
             <w:r>
-              <w:t>RNF-EFI-0</w:t>
-            </w:r>
-            <w:r>
-              <w:t>3</w:t>
+              <w:t>RNF-EFI-03</w:t>
             </w:r>
           </w:p>
         </w:tc>
@@ -4715,10 +4658,7 @@
           </w:tcPr>
           <w:p>
             <w:r>
-              <w:t>RNF-EFI-0</w:t>
-            </w:r>
-            <w:r>
-              <w:t>4</w:t>
+              <w:t>RNF-EFI-04</w:t>
             </w:r>
           </w:p>
         </w:tc>
@@ -4805,6 +4745,7 @@
         <w:jc w:val="left"/>
       </w:pPr>
       <w:r>
+        <w:lastRenderedPageBreak/>
         <w:br w:type="page"/>
       </w:r>
     </w:p>
@@ -4820,7 +4761,13 @@
     <w:p/>
     <w:p>
       <w:r>
-        <w:t>&lt;Contextualização de requisitos não funcionais de disponibilidade a implementar&gt;</w:t>
+        <w:t xml:space="preserve">Requisitos Não Funcionais de </w:t>
+      </w:r>
+      <w:r>
+        <w:t>Disponibilidade é utilizado para se referir ao tempo que o sistema está operacional e acessível. A sua importância é garantir que o sistema pode ser utilizado quando necessário.</w:t>
+      </w:r>
+      <w:r>
+        <w:t xml:space="preserve"> </w:t>
       </w:r>
     </w:p>
     <w:p>
@@ -4992,10 +4939,7 @@
           </w:tcPr>
           <w:p>
             <w:r>
-              <w:t>RNF-DIS-0</w:t>
-            </w:r>
-            <w:r>
-              <w:t>2</w:t>
+              <w:t>RNF-DIS-02</w:t>
             </w:r>
           </w:p>
         </w:tc>
@@ -5049,10 +4993,7 @@
           </w:tcPr>
           <w:p>
             <w:r>
-              <w:t>RNF-DIS-0</w:t>
-            </w:r>
-            <w:r>
-              <w:t>3</w:t>
+              <w:t>RNF-DIS-03</w:t>
             </w:r>
           </w:p>
         </w:tc>
@@ -5103,10 +5044,7 @@
           </w:tcPr>
           <w:p>
             <w:r>
-              <w:t>RNF-DIS-0</w:t>
-            </w:r>
-            <w:r>
-              <w:t>4</w:t>
+              <w:t>RNF-DIS-04</w:t>
             </w:r>
           </w:p>
         </w:tc>
@@ -5198,13 +5136,13 @@
     <w:p/>
     <w:p>
       <w:r>
-        <w:t>&lt;Contextualização de requisitos não funcionais de ambiente</w:t>
+        <w:t xml:space="preserve">Requisitos Não Funcionais de </w:t>
+      </w:r>
+      <w:r>
+        <w:t>Ambiente refere-se às condições técnicas onde o sistema opera. É necessário configurar estes requisitos para assegurar a compatibilidade e funcionamento adequado do programa.</w:t>
       </w:r>
       <w:r>
         <w:t xml:space="preserve"> </w:t>
-      </w:r>
-      <w:r>
-        <w:t>a implementar&gt;</w:t>
       </w:r>
     </w:p>
     <w:p>
@@ -5381,10 +5319,7 @@
           </w:tcPr>
           <w:p>
             <w:r>
-              <w:t>RNF-AMB-0</w:t>
-            </w:r>
-            <w:r>
-              <w:t>2</w:t>
+              <w:t>RNF-AMB-02</w:t>
             </w:r>
           </w:p>
         </w:tc>
@@ -5439,10 +5374,7 @@
           </w:tcPr>
           <w:p>
             <w:r>
-              <w:t>RNF-AMB-0</w:t>
-            </w:r>
-            <w:r>
-              <w:t>3</w:t>
+              <w:t>RNF-AMB-03</w:t>
             </w:r>
           </w:p>
         </w:tc>
@@ -5504,10 +5436,7 @@
           </w:tcPr>
           <w:p>
             <w:r>
-              <w:t>RNF-AMB-0</w:t>
-            </w:r>
-            <w:r>
-              <w:t>4</w:t>
+              <w:t>RNF-AMB-04</w:t>
             </w:r>
           </w:p>
         </w:tc>
@@ -5598,20 +5527,22 @@
         <w:pStyle w:val="Ttulo4"/>
       </w:pPr>
       <w:r>
-        <w:lastRenderedPageBreak/>
         <w:t>Requisitos Não Funcionais de Desenvolvimento</w:t>
       </w:r>
     </w:p>
     <w:p/>
     <w:p>
       <w:r>
-        <w:t>&lt;Contextualização de requisitos não funcionais de desenvolvimento</w:t>
+        <w:t xml:space="preserve">Requisitos Não Funcionais de </w:t>
+      </w:r>
+      <w:r>
+        <w:t>desenvolvimento refere-se às práticas que devem ser seguidas durante o desenvolvimento do sistema. Seguir os padrões escolhidos permite garantir a qualidade e manutenção</w:t>
       </w:r>
       <w:r>
         <w:t xml:space="preserve"> </w:t>
       </w:r>
       <w:r>
-        <w:t>a implementar&gt;</w:t>
+        <w:t>do sistema. Irá também facilitar o trabalho de equipa de desenvolvimento, assim garantido a consistência do trabalho ao longo do tempo.</w:t>
       </w:r>
     </w:p>
     <w:p>
@@ -5783,10 +5714,7 @@
           </w:tcPr>
           <w:p>
             <w:r>
-              <w:t>RNF-DES-0</w:t>
-            </w:r>
-            <w:r>
-              <w:t>2</w:t>
+              <w:t>RNF-DES-02</w:t>
             </w:r>
           </w:p>
         </w:tc>
@@ -5840,10 +5768,7 @@
           </w:tcPr>
           <w:p>
             <w:r>
-              <w:t>RNF-DES-0</w:t>
-            </w:r>
-            <w:r>
-              <w:t>3</w:t>
+              <w:t>RNF-DES-03</w:t>
             </w:r>
           </w:p>
         </w:tc>
@@ -5894,10 +5819,7 @@
           </w:tcPr>
           <w:p>
             <w:r>
-              <w:t>RNF-DES-0</w:t>
-            </w:r>
-            <w:r>
-              <w:t>4</w:t>
+              <w:t>RNF-DES-04</w:t>
             </w:r>
           </w:p>
         </w:tc>
@@ -8958,15 +8880,6 @@
 </file>
 
 <file path=customXml/item1.xml><?xml version="1.0" encoding="utf-8"?>
-<?mso-contentType ?>
-<FormTemplates xmlns="http://schemas.microsoft.com/sharepoint/v3/contenttype/forms">
-  <Display>DocumentLibraryForm</Display>
-  <Edit>DocumentLibraryForm</Edit>
-  <New>DocumentLibraryForm</New>
-</FormTemplates>
-</file>
-
-<file path=customXml/item2.xml><?xml version="1.0" encoding="utf-8"?>
 <ct:contentTypeSchema xmlns:ct="http://schemas.microsoft.com/office/2006/metadata/contentType" xmlns:ma="http://schemas.microsoft.com/office/2006/metadata/properties/metaAttributes" ct:_="" ma:_="" ma:contentTypeName="Documento" ma:contentTypeID="0x0101003F8ECAAF88AFCB4AB1D806FDE394FD03" ma:contentTypeVersion="7" ma:contentTypeDescription="Criar um novo documento." ma:contentTypeScope="" ma:versionID="798687853898f8ed54c489be77f9a2ad">
   <xsd:schema xmlns:xsd="http://www.w3.org/2001/XMLSchema" xmlns:xs="http://www.w3.org/2001/XMLSchema" xmlns:p="http://schemas.microsoft.com/office/2006/metadata/properties" xmlns:ns2="52a6887f-9537-4a34-8793-b765f13d0873" targetNamespace="http://schemas.microsoft.com/office/2006/metadata/properties" ma:root="true" ma:fieldsID="68a63200760ff0df8e2889a3ca50214f" ns2:_="">
     <xsd:import namespace="52a6887f-9537-4a34-8793-b765f13d0873"/>
@@ -9130,25 +9043,26 @@
 </ct:contentTypeSchema>
 </file>
 
-<file path=customXml/item3.xml><?xml version="1.0" encoding="utf-8"?>
+<file path=customXml/item2.xml><?xml version="1.0" encoding="utf-8"?>
 <p:properties xmlns:p="http://schemas.microsoft.com/office/2006/metadata/properties" xmlns:xsi="http://www.w3.org/2001/XMLSchema-instance" xmlns:pc="http://schemas.microsoft.com/office/infopath/2007/PartnerControls">
   <documentManagement/>
 </p:properties>
 </file>
 
-<file path=customXml/item4.xml><?xml version="1.0" encoding="utf-8"?>
+<file path=customXml/item3.xml><?xml version="1.0" encoding="utf-8"?>
 <b:Sources xmlns:b="http://schemas.openxmlformats.org/officeDocument/2006/bibliography" xmlns="http://schemas.openxmlformats.org/officeDocument/2006/bibliography" SelectedStyle="/APASixthEditionOfficeOnline.xsl" StyleName="APA" Version="6"/>
 </file>
 
-<file path=customXml/itemProps1.xml><?xml version="1.0" encoding="utf-8"?>
-<ds:datastoreItem xmlns:ds="http://schemas.openxmlformats.org/officeDocument/2006/customXml" ds:itemID="{3049E901-D460-4040-BE52-BFB2CA5EF0CE}">
-  <ds:schemaRefs>
-    <ds:schemaRef ds:uri="http://schemas.microsoft.com/sharepoint/v3/contenttype/forms"/>
-  </ds:schemaRefs>
-</ds:datastoreItem>
+<file path=customXml/item4.xml><?xml version="1.0" encoding="utf-8"?>
+<?mso-contentType ?>
+<FormTemplates xmlns="http://schemas.microsoft.com/sharepoint/v3/contenttype/forms">
+  <Display>DocumentLibraryForm</Display>
+  <Edit>DocumentLibraryForm</Edit>
+  <New>DocumentLibraryForm</New>
+</FormTemplates>
 </file>
 
-<file path=customXml/itemProps2.xml><?xml version="1.0" encoding="utf-8"?>
+<file path=customXml/itemProps1.xml><?xml version="1.0" encoding="utf-8"?>
 <ds:datastoreItem xmlns:ds="http://schemas.openxmlformats.org/officeDocument/2006/customXml" ds:itemID="{4E47A284-D0FB-4EA5-B440-9D7D3810D8E5}">
   <ds:schemaRefs>
     <ds:schemaRef ds:uri="http://schemas.microsoft.com/office/2006/metadata/contentType"/>
@@ -9166,7 +9080,7 @@
 </ds:datastoreItem>
 </file>
 
-<file path=customXml/itemProps3.xml><?xml version="1.0" encoding="utf-8"?>
+<file path=customXml/itemProps2.xml><?xml version="1.0" encoding="utf-8"?>
 <ds:datastoreItem xmlns:ds="http://schemas.openxmlformats.org/officeDocument/2006/customXml" ds:itemID="{0D05F977-E0EB-4BDE-9CCC-35AE7F3468D1}">
   <ds:schemaRefs>
     <ds:schemaRef ds:uri="http://schemas.microsoft.com/office/2006/metadata/properties"/>
@@ -9175,10 +9089,18 @@
 </ds:datastoreItem>
 </file>
 
-<file path=customXml/itemProps4.xml><?xml version="1.0" encoding="utf-8"?>
+<file path=customXml/itemProps3.xml><?xml version="1.0" encoding="utf-8"?>
 <ds:datastoreItem xmlns:ds="http://schemas.openxmlformats.org/officeDocument/2006/customXml" ds:itemID="{19617398-908E-4614-909E-0F810C8F0377}">
   <ds:schemaRefs>
     <ds:schemaRef ds:uri="http://schemas.openxmlformats.org/officeDocument/2006/bibliography"/>
   </ds:schemaRefs>
 </ds:datastoreItem>
+</file>
+
+<file path=customXml/itemProps4.xml><?xml version="1.0" encoding="utf-8"?>
+<ds:datastoreItem xmlns:ds="http://schemas.openxmlformats.org/officeDocument/2006/customXml" ds:itemID="{3049E901-D460-4040-BE52-BFB2CA5EF0CE}">
+  <ds:schemaRefs>
+    <ds:schemaRef ds:uri="http://schemas.microsoft.com/sharepoint/v3/contenttype/forms"/>
+  </ds:schemaRefs>
+</ds:datastoreItem>
 </file>
</xml_diff>

<commit_message>
Detalhes da parte do servidor
</commit_message>
<xml_diff>
--- a/IPL-TeSP-PSI-TS-2024_Relatório.docx
+++ b/IPL-TeSP-PSI-TS-2024_Relatório.docx
@@ -97,15 +97,7 @@
               <w:jc w:val="center"/>
             </w:pPr>
             <w:r>
-              <w:t xml:space="preserve">Curso de </w:t>
-            </w:r>
-            <w:proofErr w:type="spellStart"/>
-            <w:r>
-              <w:t>TeSP</w:t>
-            </w:r>
-            <w:proofErr w:type="spellEnd"/>
-            <w:r>
-              <w:t xml:space="preserve"> em </w:t>
+              <w:t xml:space="preserve">Curso de TeSP em </w:t>
             </w:r>
             <w:r>
               <w:br/>
@@ -811,27 +803,8 @@
                 <w:rFonts w:asciiTheme="minorHAnsi" w:hAnsiTheme="minorHAnsi" w:cstheme="minorHAnsi"/>
                 <w:b/>
                 <w:sz w:val="20"/>
-                <w:highlight w:val="yellow"/>
-              </w:rPr>
-              <w:t>2</w:t>
-            </w:r>
-            <w:r>
-              <w:rPr>
-                <w:rFonts w:asciiTheme="minorHAnsi" w:hAnsiTheme="minorHAnsi" w:cstheme="minorHAnsi"/>
-                <w:b/>
-                <w:sz w:val="20"/>
-                <w:highlight w:val="yellow"/>
-              </w:rPr>
-              <w:t>3</w:t>
-            </w:r>
-            <w:r>
-              <w:rPr>
-                <w:rFonts w:asciiTheme="minorHAnsi" w:hAnsiTheme="minorHAnsi" w:cstheme="minorHAnsi"/>
-                <w:b/>
-                <w:sz w:val="20"/>
-                <w:highlight w:val="yellow"/>
-              </w:rPr>
-              <w:t>90000</w:t>
+              </w:rPr>
+              <w:t>2025152794</w:t>
             </w:r>
           </w:p>
         </w:tc>
@@ -859,27 +832,8 @@
                 <w:rFonts w:asciiTheme="minorHAnsi" w:hAnsiTheme="minorHAnsi" w:cstheme="minorHAnsi"/>
                 <w:bCs/>
                 <w:sz w:val="20"/>
-                <w:highlight w:val="yellow"/>
-              </w:rPr>
-              <w:t xml:space="preserve">&lt;Nome aluno </w:t>
-            </w:r>
-            <w:r>
-              <w:rPr>
-                <w:rFonts w:asciiTheme="minorHAnsi" w:hAnsiTheme="minorHAnsi" w:cstheme="minorHAnsi"/>
-                <w:bCs/>
-                <w:sz w:val="20"/>
-                <w:highlight w:val="yellow"/>
-              </w:rPr>
-              <w:t>3</w:t>
-            </w:r>
-            <w:r>
-              <w:rPr>
-                <w:rFonts w:asciiTheme="minorHAnsi" w:hAnsiTheme="minorHAnsi" w:cstheme="minorHAnsi"/>
-                <w:bCs/>
-                <w:sz w:val="20"/>
-                <w:highlight w:val="yellow"/>
-              </w:rPr>
-              <w:t>&gt;</w:t>
+              </w:rPr>
+              <w:t>Vitor Leonardo</w:t>
             </w:r>
           </w:p>
         </w:tc>
@@ -2405,28 +2359,12 @@
     </w:p>
     <w:p>
       <w:r>
-        <w:t xml:space="preserve">Este projeto tem como objetivo o desenvolvimento de um sistema de chat seguro em C#, implementando mecanismos de criptografia (simétrica e assimétrica), autenticação e validação de dados através de assinaturas digitais. O sistema será composto por um módulo cliente com interface gráfica (Windows </w:t>
-      </w:r>
-      <w:proofErr w:type="spellStart"/>
-      <w:r>
-        <w:t>Forms</w:t>
-      </w:r>
-      <w:proofErr w:type="spellEnd"/>
-      <w:r>
-        <w:t xml:space="preserve">) e um módulo servidor console, permitindo comunicação segura entre múltiplos clientes. </w:t>
-      </w:r>
-    </w:p>
-    <w:p>
-      <w:r>
-        <w:t xml:space="preserve">A segurança das comunicações será garantida através do uso de algoritmos criptográficos, </w:t>
-      </w:r>
-      <w:proofErr w:type="spellStart"/>
-      <w:r>
-        <w:t>sockets</w:t>
-      </w:r>
-      <w:proofErr w:type="spellEnd"/>
-      <w:r>
-        <w:t xml:space="preserve"> TCP/IP e protocolos de autenticação robustos.</w:t>
+        <w:t xml:space="preserve">Este projeto tem como objetivo o desenvolvimento de um sistema de chat seguro em C#, implementando mecanismos de criptografia (simétrica e assimétrica), autenticação e validação de dados através de assinaturas digitais. O sistema será composto por um módulo cliente com interface gráfica (Windows Forms) e um módulo servidor console, permitindo comunicação segura entre múltiplos clientes. </w:t>
+      </w:r>
+    </w:p>
+    <w:p>
+      <w:r>
+        <w:t>A segurança das comunicações será garantida através do uso de algoritmos criptográficos, sockets TCP/IP e protocolos de autenticação robustos.</w:t>
       </w:r>
     </w:p>
     <w:p>
@@ -3335,15 +3273,7 @@
               <w:cnfStyle w:val="000000100000" w:firstRow="0" w:lastRow="0" w:firstColumn="0" w:lastColumn="0" w:oddVBand="0" w:evenVBand="0" w:oddHBand="1" w:evenHBand="0" w:firstRowFirstColumn="0" w:firstRowLastColumn="0" w:lastRowFirstColumn="0" w:lastRowLastColumn="0"/>
             </w:pPr>
             <w:r>
-              <w:t xml:space="preserve">Interface gráfica em Windows </w:t>
-            </w:r>
-            <w:proofErr w:type="spellStart"/>
-            <w:r>
-              <w:t>Forms</w:t>
-            </w:r>
-            <w:proofErr w:type="spellEnd"/>
-            <w:r>
-              <w:t xml:space="preserve"> clara e intuitiva</w:t>
+              <w:t>Interface gráfica em Windows Forms clara e intuitiva</w:t>
             </w:r>
           </w:p>
         </w:tc>
@@ -3581,15 +3511,7 @@
         <w:t>Requisitos Não Funcionais de Fiabilidade</w:t>
       </w:r>
       <w:r>
-        <w:t xml:space="preserve"> referem-se à capacidade </w:t>
-      </w:r>
-      <w:proofErr w:type="gramStart"/>
-      <w:r>
-        <w:t>do</w:t>
-      </w:r>
-      <w:proofErr w:type="gramEnd"/>
-      <w:r>
-        <w:t xml:space="preserve"> sistema funcionar correta e eficientemente. Estes requisitos serão utilizados para garantir que não há falhas no sistema, o que garante a confiança do utilizador no sistema e reduz perda de dados.</w:t>
+        <w:t xml:space="preserve"> referem-se à capacidade do sistema funcionar correta e eficientemente. Estes requisitos serão utilizados para garantir que não há falhas no sistema, o que garante a confiança do utilizador no sistema e reduz perda de dados.</w:t>
       </w:r>
     </w:p>
     <w:p>
@@ -3967,18 +3889,7 @@
         <w:t>utilizador e</w:t>
       </w:r>
       <w:r>
-        <w:t xml:space="preserve"> de controlo de acesso aos mesmos. Garantir que estes requisitos são implementados é crucial para proteger as informações sensíveis do utilizador e proteger </w:t>
-      </w:r>
-      <w:proofErr w:type="gramStart"/>
-      <w:r>
-        <w:t>contra ataques</w:t>
-      </w:r>
-      <w:proofErr w:type="gramEnd"/>
-      <w:r>
-        <w:t xml:space="preserve"> indevidos.</w:t>
-      </w:r>
-      <w:r>
-        <w:t xml:space="preserve"> </w:t>
+        <w:t xml:space="preserve"> de controlo de acesso aos mesmos. Garantir que estes requisitos são implementados é crucial para proteger as informações sensíveis do utilizador e proteger contra ataques indevidos. </w:t>
       </w:r>
     </w:p>
     <w:p>
@@ -4217,23 +4128,7 @@
               <w:cnfStyle w:val="000000100000" w:firstRow="0" w:lastRow="0" w:firstColumn="0" w:lastColumn="0" w:oddVBand="0" w:evenVBand="0" w:oddHBand="1" w:evenHBand="0" w:firstRowFirstColumn="0" w:firstRowLastColumn="0" w:lastRowFirstColumn="0" w:lastRowLastColumn="0"/>
             </w:pPr>
             <w:r>
-              <w:t xml:space="preserve">Armazenar credenciais com </w:t>
-            </w:r>
-            <w:proofErr w:type="spellStart"/>
-            <w:r>
-              <w:t>hash</w:t>
-            </w:r>
-            <w:proofErr w:type="spellEnd"/>
-            <w:r>
-              <w:t xml:space="preserve"> (MD5 com </w:t>
-            </w:r>
-            <w:proofErr w:type="spellStart"/>
-            <w:r>
-              <w:t>salt</w:t>
-            </w:r>
-            <w:proofErr w:type="spellEnd"/>
-            <w:r>
-              <w:t>)</w:t>
+              <w:t>Armazenar credenciais com hash (MD5 com salt)</w:t>
             </w:r>
           </w:p>
         </w:tc>
@@ -4368,10 +4263,7 @@
         <w:t xml:space="preserve">Requisitos Não Funcionais de </w:t>
       </w:r>
       <w:r>
-        <w:t>eficiência diz respeito ao desempenho do sistema, como por exemplo o tempo de resposta e uso de recursos. Implementar estes requisitos irá assegurar o bom funcionamento do sistema.</w:t>
-      </w:r>
-      <w:r>
-        <w:t xml:space="preserve"> </w:t>
+        <w:t xml:space="preserve">eficiência diz respeito ao desempenho do sistema, como por exemplo o tempo de resposta e uso de recursos. Implementar estes requisitos irá assegurar o bom funcionamento do sistema. </w:t>
       </w:r>
     </w:p>
     <w:p>
@@ -4505,13 +4397,8 @@
               <w:cnfStyle w:val="000000100000" w:firstRow="0" w:lastRow="0" w:firstColumn="0" w:lastColumn="0" w:oddVBand="0" w:evenVBand="0" w:oddHBand="1" w:evenHBand="0" w:firstRowFirstColumn="0" w:firstRowLastColumn="0" w:lastRowFirstColumn="0" w:lastRowLastColumn="0"/>
             </w:pPr>
             <w:r>
-              <w:t xml:space="preserve">Servidor processar múltiplos clientes com </w:t>
-            </w:r>
-            <w:proofErr w:type="spellStart"/>
-            <w:r>
-              <w:t>threads</w:t>
-            </w:r>
-            <w:proofErr w:type="spellEnd"/>
+              <w:t>Servidor processar múltiplos clientes com threads</w:t>
+            </w:r>
           </w:p>
         </w:tc>
         <w:tc>
@@ -4617,11 +4504,9 @@
             <w:r>
               <w:t xml:space="preserve">Operações de Criptografia </w:t>
             </w:r>
-            <w:proofErr w:type="spellStart"/>
             <w:r>
               <w:t>optimizadas</w:t>
             </w:r>
-            <w:proofErr w:type="spellEnd"/>
           </w:p>
         </w:tc>
         <w:tc>
@@ -4764,10 +4649,7 @@
         <w:t xml:space="preserve">Requisitos Não Funcionais de </w:t>
       </w:r>
       <w:r>
-        <w:t>Disponibilidade é utilizado para se referir ao tempo que o sistema está operacional e acessível. A sua importância é garantir que o sistema pode ser utilizado quando necessário.</w:t>
-      </w:r>
-      <w:r>
-        <w:t xml:space="preserve"> </w:t>
+        <w:t xml:space="preserve">Disponibilidade é utilizado para se referir ao tempo que o sistema está operacional e acessível. A sua importância é garantir que o sistema pode ser utilizado quando necessário. </w:t>
       </w:r>
     </w:p>
     <w:p>
@@ -5139,10 +5021,7 @@
         <w:t xml:space="preserve">Requisitos Não Funcionais de </w:t>
       </w:r>
       <w:r>
-        <w:t>Ambiente refere-se às condições técnicas onde o sistema opera. É necessário configurar estes requisitos para assegurar a compatibilidade e funcionamento adequado do programa.</w:t>
-      </w:r>
-      <w:r>
-        <w:t xml:space="preserve"> </w:t>
+        <w:t xml:space="preserve">Ambiente refere-se às condições técnicas onde o sistema opera. É necessário configurar estes requisitos para assegurar a compatibilidade e funcionamento adequado do programa. </w:t>
       </w:r>
     </w:p>
     <w:p>
@@ -5387,15 +5266,7 @@
               <w:cnfStyle w:val="000000100000" w:firstRow="0" w:lastRow="0" w:firstColumn="0" w:lastColumn="0" w:oddVBand="0" w:evenVBand="0" w:oddHBand="1" w:evenHBand="0" w:firstRowFirstColumn="0" w:firstRowLastColumn="0" w:lastRowFirstColumn="0" w:lastRowLastColumn="0"/>
             </w:pPr>
             <w:r>
-              <w:t xml:space="preserve">Suportar Visual </w:t>
-            </w:r>
-            <w:proofErr w:type="spellStart"/>
-            <w:r>
-              <w:t>Studio</w:t>
-            </w:r>
-            <w:proofErr w:type="spellEnd"/>
-            <w:r>
-              <w:t xml:space="preserve"> 2019 ou superior</w:t>
+              <w:t>Suportar Visual Studio 2019 ou superior</w:t>
             </w:r>
           </w:p>
         </w:tc>
@@ -5449,15 +5320,7 @@
               <w:cnfStyle w:val="000000000000" w:firstRow="0" w:lastRow="0" w:firstColumn="0" w:lastColumn="0" w:oddVBand="0" w:evenVBand="0" w:oddHBand="0" w:evenHBand="0" w:firstRowFirstColumn="0" w:firstRowLastColumn="0" w:lastRowFirstColumn="0" w:lastRowLastColumn="0"/>
             </w:pPr>
             <w:r>
-              <w:t xml:space="preserve">Base de dados SQL Server ou </w:t>
-            </w:r>
-            <w:proofErr w:type="spellStart"/>
-            <w:r>
-              <w:t>Entity</w:t>
-            </w:r>
-            <w:proofErr w:type="spellEnd"/>
-            <w:r>
-              <w:t xml:space="preserve"> Framework</w:t>
+              <w:t>Base de dados SQL Server ou Entity Framework</w:t>
             </w:r>
           </w:p>
         </w:tc>
@@ -5536,13 +5399,7 @@
         <w:t xml:space="preserve">Requisitos Não Funcionais de </w:t>
       </w:r>
       <w:r>
-        <w:t>desenvolvimento refere-se às práticas que devem ser seguidas durante o desenvolvimento do sistema. Seguir os padrões escolhidos permite garantir a qualidade e manutenção</w:t>
-      </w:r>
-      <w:r>
-        <w:t xml:space="preserve"> </w:t>
-      </w:r>
-      <w:r>
-        <w:t>do sistema. Irá também facilitar o trabalho de equipa de desenvolvimento, assim garantido a consistência do trabalho ao longo do tempo.</w:t>
+        <w:t>desenvolvimento refere-se às práticas que devem ser seguidas durante o desenvolvimento do sistema. Seguir os padrões escolhidos permite garantir a qualidade e manutenção do sistema. Irá também facilitar o trabalho de equipa de desenvolvimento, assim garantido a consistência do trabalho ao longo do tempo.</w:t>
       </w:r>
     </w:p>
     <w:p>
@@ -5832,15 +5689,7 @@
               <w:cnfStyle w:val="000000000000" w:firstRow="0" w:lastRow="0" w:firstColumn="0" w:lastColumn="0" w:oddVBand="0" w:evenVBand="0" w:oddHBand="0" w:evenHBand="0" w:firstRowFirstColumn="0" w:firstRowLastColumn="0" w:lastRowFirstColumn="0" w:lastRowLastColumn="0"/>
             </w:pPr>
             <w:r>
-              <w:t>Ficheiro .</w:t>
-            </w:r>
-            <w:proofErr w:type="spellStart"/>
-            <w:r>
-              <w:t>sql</w:t>
-            </w:r>
-            <w:proofErr w:type="spellEnd"/>
-            <w:r>
-              <w:t xml:space="preserve"> fornecido se utilizar base de dados</w:t>
+              <w:t>Ficheiro .sql fornecido se utilizar base de dados</w:t>
             </w:r>
           </w:p>
         </w:tc>
@@ -5912,29 +5761,16 @@
       </w:pPr>
       <w:bookmarkStart w:id="13" w:name="_Toc67476432"/>
       <w:bookmarkStart w:id="14" w:name="_Toc67476483"/>
-      <w:proofErr w:type="spellStart"/>
       <w:r>
         <w:lastRenderedPageBreak/>
-        <w:t>Wireframes</w:t>
-      </w:r>
-      <w:proofErr w:type="spellEnd"/>
-      <w:r>
-        <w:t xml:space="preserve"> UI</w:t>
+        <w:t>Wireframes UI</w:t>
       </w:r>
       <w:bookmarkEnd w:id="13"/>
       <w:bookmarkEnd w:id="14"/>
     </w:p>
     <w:p>
       <w:r>
-        <w:t xml:space="preserve">&lt;Contextualização das </w:t>
-      </w:r>
-      <w:proofErr w:type="spellStart"/>
-      <w:r>
-        <w:t>wireframes</w:t>
-      </w:r>
-      <w:proofErr w:type="spellEnd"/>
-      <w:r>
-        <w:t xml:space="preserve"> desenvolvidas&gt;</w:t>
+        <w:t>&lt;Contextualização das wireframes desenvolvidas&gt;</w:t>
       </w:r>
     </w:p>
     <w:p/>
@@ -7628,6 +7464,7 @@
   <w:style w:type="character" w:default="1" w:styleId="Tipodeletrapredefinidodopargrafo">
     <w:name w:val="Default Paragraph Font"/>
     <w:uiPriority w:val="1"/>
+    <w:semiHidden/>
     <w:unhideWhenUsed/>
   </w:style>
   <w:style w:type="table" w:default="1" w:styleId="Tabelanormal">

</xml_diff>

<commit_message>
chore: update build artifacts and relatório files
</commit_message>
<xml_diff>
--- a/IPL-TeSP-PSI-TS-2024_Relatório.docx
+++ b/IPL-TeSP-PSI-TS-2024_Relatório.docx
@@ -97,7 +97,15 @@
               <w:jc w:val="center"/>
             </w:pPr>
             <w:r>
-              <w:t xml:space="preserve">Curso de TeSP em </w:t>
+              <w:t xml:space="preserve">Curso de </w:t>
+            </w:r>
+            <w:proofErr w:type="spellStart"/>
+            <w:r>
+              <w:t>TeSP</w:t>
+            </w:r>
+            <w:proofErr w:type="spellEnd"/>
+            <w:r>
+              <w:t xml:space="preserve"> em </w:t>
             </w:r>
             <w:r>
               <w:br/>
@@ -827,128 +835,23 @@
                 <w:sz w:val="20"/>
               </w:rPr>
             </w:pPr>
+            <w:proofErr w:type="spellStart"/>
             <w:r>
               <w:rPr>
                 <w:rFonts w:asciiTheme="minorHAnsi" w:hAnsiTheme="minorHAnsi" w:cstheme="minorHAnsi"/>
                 <w:bCs/>
                 <w:sz w:val="20"/>
               </w:rPr>
-              <w:t>Vitor Leonardo</w:t>
-            </w:r>
-          </w:p>
-        </w:tc>
-      </w:tr>
-      <w:tr>
-        <w:trPr>
-          <w:trHeight w:val="358"/>
-        </w:trPr>
-        <w:tc>
-          <w:tcPr>
-            <w:tcW w:w="2258" w:type="dxa"/>
-            <w:tcBorders>
-              <w:left w:val="dashSmallGap" w:sz="8" w:space="0" w:color="000001"/>
-              <w:bottom w:val="dashSmallGap" w:sz="4" w:space="0" w:color="auto"/>
-              <w:right w:val="dashSmallGap" w:sz="4" w:space="0" w:color="auto"/>
-            </w:tcBorders>
-            <w:tcMar>
-              <w:left w:w="88" w:type="dxa"/>
-            </w:tcMar>
-            <w:vAlign w:val="center"/>
-          </w:tcPr>
-          <w:p>
-            <w:pPr>
-              <w:pStyle w:val="TextBody"/>
-              <w:spacing w:before="40" w:after="40"/>
-              <w:rPr>
-                <w:rFonts w:asciiTheme="minorHAnsi" w:hAnsiTheme="minorHAnsi" w:cstheme="minorHAnsi"/>
-                <w:b/>
-                <w:sz w:val="20"/>
-              </w:rPr>
-            </w:pPr>
-            <w:r>
-              <w:rPr>
-                <w:rFonts w:asciiTheme="minorHAnsi" w:hAnsiTheme="minorHAnsi" w:cstheme="minorHAnsi"/>
-                <w:b/>
-                <w:sz w:val="20"/>
-              </w:rPr>
-              <w:t xml:space="preserve">Nº </w:t>
-            </w:r>
-            <w:r>
-              <w:rPr>
-                <w:rFonts w:asciiTheme="minorHAnsi" w:hAnsiTheme="minorHAnsi" w:cstheme="minorHAnsi"/>
-                <w:b/>
-                <w:sz w:val="20"/>
-                <w:highlight w:val="yellow"/>
-              </w:rPr>
-              <w:t>2</w:t>
-            </w:r>
-            <w:r>
-              <w:rPr>
-                <w:rFonts w:asciiTheme="minorHAnsi" w:hAnsiTheme="minorHAnsi" w:cstheme="minorHAnsi"/>
-                <w:b/>
-                <w:sz w:val="20"/>
-                <w:highlight w:val="yellow"/>
-              </w:rPr>
-              <w:t>3</w:t>
-            </w:r>
-            <w:r>
-              <w:rPr>
-                <w:rFonts w:asciiTheme="minorHAnsi" w:hAnsiTheme="minorHAnsi" w:cstheme="minorHAnsi"/>
-                <w:b/>
-                <w:sz w:val="20"/>
-                <w:highlight w:val="yellow"/>
-              </w:rPr>
-              <w:t>90000</w:t>
-            </w:r>
-          </w:p>
-        </w:tc>
-        <w:tc>
-          <w:tcPr>
-            <w:tcW w:w="7371" w:type="dxa"/>
-            <w:gridSpan w:val="2"/>
-            <w:tcBorders>
-              <w:left w:val="dashSmallGap" w:sz="8" w:space="0" w:color="000001"/>
-              <w:bottom w:val="dashSmallGap" w:sz="4" w:space="0" w:color="auto"/>
-              <w:right w:val="dashSmallGap" w:sz="4" w:space="0" w:color="auto"/>
-            </w:tcBorders>
-          </w:tcPr>
-          <w:p>
-            <w:pPr>
-              <w:pStyle w:val="TextBody"/>
-              <w:spacing w:before="40" w:after="40"/>
+              <w:t>Vitor</w:t>
+            </w:r>
+            <w:proofErr w:type="spellEnd"/>
+            <w:r>
               <w:rPr>
                 <w:rFonts w:asciiTheme="minorHAnsi" w:hAnsiTheme="minorHAnsi" w:cstheme="minorHAnsi"/>
                 <w:bCs/>
                 <w:sz w:val="20"/>
-                <w:highlight w:val="yellow"/>
-              </w:rPr>
-            </w:pPr>
-            <w:r>
-              <w:rPr>
-                <w:rFonts w:asciiTheme="minorHAnsi" w:hAnsiTheme="minorHAnsi" w:cstheme="minorHAnsi"/>
-                <w:bCs/>
-                <w:sz w:val="20"/>
-                <w:highlight w:val="yellow"/>
-              </w:rPr>
-              <w:t xml:space="preserve">&lt;Nome aluno </w:t>
-            </w:r>
-            <w:r>
-              <w:rPr>
-                <w:rFonts w:asciiTheme="minorHAnsi" w:hAnsiTheme="minorHAnsi" w:cstheme="minorHAnsi"/>
-                <w:bCs/>
-                <w:sz w:val="20"/>
-                <w:highlight w:val="yellow"/>
-              </w:rPr>
-              <w:t>4</w:t>
-            </w:r>
-            <w:r>
-              <w:rPr>
-                <w:rFonts w:asciiTheme="minorHAnsi" w:hAnsiTheme="minorHAnsi" w:cstheme="minorHAnsi"/>
-                <w:bCs/>
-                <w:sz w:val="20"/>
-                <w:highlight w:val="yellow"/>
-              </w:rPr>
-              <w:t>&gt;</w:t>
+              </w:rPr>
+              <w:t xml:space="preserve"> Leonardo</w:t>
             </w:r>
           </w:p>
         </w:tc>
@@ -2359,12 +2262,33 @@
     </w:p>
     <w:p>
       <w:r>
-        <w:t xml:space="preserve">Este projeto tem como objetivo o desenvolvimento de um sistema de chat seguro em C#, implementando mecanismos de criptografia (simétrica e assimétrica), autenticação e validação de dados através de assinaturas digitais. O sistema será composto por um módulo cliente com interface gráfica (Windows Forms) e um módulo servidor console, permitindo comunicação segura entre múltiplos clientes. </w:t>
+        <w:t xml:space="preserve">Este projeto tem como objetivo o desenvolvimento de um sistema de chat seguro em C#, implementando mecanismos de criptografia (simétrica e assimétrica), autenticação e validação de dados através de assinaturas digitais. </w:t>
       </w:r>
     </w:p>
     <w:p>
       <w:r>
-        <w:t>A segurança das comunicações será garantida através do uso de algoritmos criptográficos, sockets TCP/IP e protocolos de autenticação robustos.</w:t>
+        <w:t xml:space="preserve">O sistema será composto por um módulo cliente com interface gráfica (Windows </w:t>
+      </w:r>
+      <w:proofErr w:type="spellStart"/>
+      <w:r>
+        <w:t>Forms</w:t>
+      </w:r>
+      <w:proofErr w:type="spellEnd"/>
+      <w:r>
+        <w:t xml:space="preserve">) e um módulo servidor console, permitindo comunicação segura entre múltiplos clientes. </w:t>
+      </w:r>
+    </w:p>
+    <w:p>
+      <w:r>
+        <w:t xml:space="preserve">A segurança das comunicações será garantida através do uso de algoritmos criptográficos, </w:t>
+      </w:r>
+      <w:proofErr w:type="spellStart"/>
+      <w:r>
+        <w:t>sockets</w:t>
+      </w:r>
+      <w:proofErr w:type="spellEnd"/>
+      <w:r>
+        <w:t xml:space="preserve"> TCP/IP e protocolos de autenticação robustos.</w:t>
       </w:r>
     </w:p>
     <w:p>
@@ -2397,6 +2321,7 @@
       </w:r>
     </w:p>
     <w:p/>
+    <w:p/>
     <w:p>
       <w:pPr>
         <w:pStyle w:val="Ttulo2"/>
@@ -2408,11 +2333,6 @@
       <w:bookmarkEnd w:id="2"/>
     </w:p>
     <w:p>
-      <w:r>
-        <w:t>Nesta secção poderemos encontrar os requisitos necessários para a funcionalidade do nosso sistema. Tendo em conta que o sistema consiste de um programa de troca de mensagens entre dois servidores, decidimos e juntámos os requisitos ideais para o programa ter melhor usabilidade, segurança, fiabilidade, eficiência, disponibilidade, desenvolvimento e ambiente. Juntamente com os nossos requisitos funcionais, os requisitos não funcionais irão garantir o sucesso do programa.</w:t>
-      </w:r>
-    </w:p>
-    <w:p>
       <w:pPr>
         <w:pStyle w:val="Ttulo3"/>
       </w:pPr>
@@ -2421,20 +2341,6 @@
         <w:t>Requisitos Funcionais (RF)</w:t>
       </w:r>
       <w:bookmarkEnd w:id="3"/>
-    </w:p>
-    <w:p>
-      <w:r>
-        <w:t>Os requisitos funcionais ajudam-nos a desenvolver o programa e ajudam o cliente a garantir que ambos estamos a atingir o mesmo objetivo. Esta fase é necessária para garantir o sucesso na definição dos requisitos e evitar falhas na comunicação entre a equipa e o cliente. A ideia é então nos certificarmos que as ideias chave principais sobre o propósito do programa estão esclarecidas e quem serão os atores.</w:t>
-      </w:r>
-    </w:p>
-    <w:p/>
-    <w:p>
-      <w:r>
-        <w:rPr>
-          <w:highlight w:val="yellow"/>
-        </w:rPr>
-        <w:t>&lt;etapa II – marcar com um X na coluna “Implementado”&gt;</w:t>
-      </w:r>
     </w:p>
     <w:p/>
     <w:tbl>
@@ -2470,7 +2376,6 @@
               <w:rPr>
                 <w:color w:val="FFFFFF" w:themeColor="background1"/>
               </w:rPr>
-              <w:lastRenderedPageBreak/>
               <w:t># ID</w:t>
             </w:r>
           </w:p>
@@ -2869,6 +2774,7 @@
           </w:tcPr>
           <w:p>
             <w:r>
+              <w:lastRenderedPageBreak/>
               <w:t>RF-07</w:t>
             </w:r>
           </w:p>
@@ -3101,32 +3007,28 @@
       </w:r>
       <w:bookmarkEnd w:id="4"/>
     </w:p>
-    <w:p/>
     <w:p>
       <w:pPr>
         <w:spacing w:after="160" w:line="259" w:lineRule="auto"/>
         <w:jc w:val="left"/>
       </w:pPr>
-      <w:r>
-        <w:br w:type="page"/>
-      </w:r>
     </w:p>
     <w:p>
       <w:pPr>
+        <w:spacing w:after="160" w:line="259" w:lineRule="auto"/>
+        <w:jc w:val="left"/>
+      </w:pPr>
+    </w:p>
+    <w:p>
+      <w:pPr>
         <w:pStyle w:val="Ttulo3"/>
       </w:pPr>
       <w:bookmarkStart w:id="5" w:name="_Toc67476482"/>
       <w:r>
-        <w:lastRenderedPageBreak/>
         <w:t>Requisitos Não Funcionais (RNF)</w:t>
       </w:r>
       <w:bookmarkEnd w:id="5"/>
     </w:p>
-    <w:p>
-      <w:r>
-        <w:t xml:space="preserve">Requisitos não funcionais irão assegurar que o nosso programa que funcione corretamente além dos requisitos funcionais. Isso garantirá a sua devida execução de forma segura e eficiente, e irá salientar algumas necessidades que o sistema cumprir sob a responsabilidade do programador. </w:t>
-      </w:r>
-    </w:p>
     <w:p/>
     <w:p>
       <w:pPr>
@@ -3134,17 +3036,6 @@
       </w:pPr>
       <w:r>
         <w:t>Requisitos Não Funcionais de Usabilidade</w:t>
-      </w:r>
-    </w:p>
-    <w:p/>
-    <w:p>
-      <w:r>
-        <w:t>Os requisitos não funcionais de usabilidade refletem à facilidade com que o utilizador consegue aprender a utilizar o sistema. Isto é importante referir pois quanto mais intuitivo e fácil de aprender é um sistema, melhor será a experiência do utilizador e aumentará a sua produtividade.</w:t>
-      </w:r>
-    </w:p>
-    <w:p>
-      <w:r>
-        <w:t>&lt;etapa II – marcar com um X na coluna “Implementado”&gt;</w:t>
       </w:r>
     </w:p>
     <w:p/>
@@ -3252,6 +3143,8 @@
       <w:tr>
         <w:trPr>
           <w:cnfStyle w:val="000000100000" w:firstRow="0" w:lastRow="0" w:firstColumn="0" w:lastColumn="0" w:oddVBand="0" w:evenVBand="0" w:oddHBand="1" w:evenHBand="0" w:firstRowFirstColumn="0" w:firstRowLastColumn="0" w:lastRowFirstColumn="0" w:lastRowLastColumn="0"/>
+          <w:cantSplit/>
+          <w:trHeight w:val="1134"/>
         </w:trPr>
         <w:tc>
           <w:tcPr>
@@ -3273,7 +3166,15 @@
               <w:cnfStyle w:val="000000100000" w:firstRow="0" w:lastRow="0" w:firstColumn="0" w:lastColumn="0" w:oddVBand="0" w:evenVBand="0" w:oddHBand="1" w:evenHBand="0" w:firstRowFirstColumn="0" w:firstRowLastColumn="0" w:lastRowFirstColumn="0" w:lastRowLastColumn="0"/>
             </w:pPr>
             <w:r>
-              <w:t>Interface gráfica em Windows Forms clara e intuitiva</w:t>
+              <w:t xml:space="preserve">Interface gráfica em Windows </w:t>
+            </w:r>
+            <w:proofErr w:type="spellStart"/>
+            <w:r>
+              <w:t>Forms</w:t>
+            </w:r>
+            <w:proofErr w:type="spellEnd"/>
+            <w:r>
+              <w:t xml:space="preserve"> clara e intuitiva</w:t>
             </w:r>
           </w:p>
         </w:tc>
@@ -3294,16 +3195,30 @@
         <w:tc>
           <w:tcPr>
             <w:tcW w:w="1219" w:type="dxa"/>
-          </w:tcPr>
-          <w:p>
-            <w:pPr>
+            <w:vAlign w:val="center"/>
+          </w:tcPr>
+          <w:p>
+            <w:pPr>
+              <w:spacing w:line="240" w:lineRule="auto"/>
               <w:jc w:val="center"/>
               <w:cnfStyle w:val="000000100000" w:firstRow="0" w:lastRow="0" w:firstColumn="0" w:lastColumn="0" w:oddVBand="0" w:evenVBand="0" w:oddHBand="1" w:evenHBand="0" w:firstRowFirstColumn="0" w:firstRowLastColumn="0" w:lastRowFirstColumn="0" w:lastRowLastColumn="0"/>
             </w:pPr>
+            <w:r>
+              <w:rPr>
+                <w:noProof/>
+                <w:sz w:val="52"/>
+                <w:szCs w:val="52"/>
+              </w:rPr>
+              <w:sym w:font="Wingdings 2" w:char="F0D2"/>
+            </w:r>
           </w:p>
         </w:tc>
       </w:tr>
       <w:tr>
+        <w:trPr>
+          <w:cantSplit/>
+          <w:trHeight w:val="1134"/>
+        </w:trPr>
         <w:tc>
           <w:tcPr>
             <w:cnfStyle w:val="001000000000" w:firstRow="0" w:lastRow="0" w:firstColumn="1" w:lastColumn="0" w:oddVBand="0" w:evenVBand="0" w:oddHBand="0" w:evenHBand="0" w:firstRowFirstColumn="0" w:firstRowLastColumn="0" w:lastRowFirstColumn="0" w:lastRowLastColumn="0"/>
@@ -3345,12 +3260,22 @@
         <w:tc>
           <w:tcPr>
             <w:tcW w:w="1219" w:type="dxa"/>
-          </w:tcPr>
-          <w:p>
-            <w:pPr>
+            <w:vAlign w:val="center"/>
+          </w:tcPr>
+          <w:p>
+            <w:pPr>
+              <w:spacing w:line="240" w:lineRule="auto"/>
               <w:jc w:val="center"/>
               <w:cnfStyle w:val="000000000000" w:firstRow="0" w:lastRow="0" w:firstColumn="0" w:lastColumn="0" w:oddVBand="0" w:evenVBand="0" w:oddHBand="0" w:evenHBand="0" w:firstRowFirstColumn="0" w:firstRowLastColumn="0" w:lastRowFirstColumn="0" w:lastRowLastColumn="0"/>
             </w:pPr>
+            <w:r>
+              <w:rPr>
+                <w:noProof/>
+                <w:sz w:val="52"/>
+                <w:szCs w:val="52"/>
+              </w:rPr>
+              <w:sym w:font="Wingdings 2" w:char="F0D2"/>
+            </w:r>
           </w:p>
         </w:tc>
       </w:tr>
@@ -3399,9 +3324,11 @@
         <w:tc>
           <w:tcPr>
             <w:tcW w:w="1219" w:type="dxa"/>
-          </w:tcPr>
-          <w:p>
-            <w:pPr>
+            <w:vAlign w:val="center"/>
+          </w:tcPr>
+          <w:p>
+            <w:pPr>
+              <w:spacing w:line="240" w:lineRule="auto"/>
               <w:jc w:val="center"/>
               <w:cnfStyle w:val="000000100000" w:firstRow="0" w:lastRow="0" w:firstColumn="0" w:lastColumn="0" w:oddVBand="0" w:evenVBand="0" w:oddHBand="1" w:evenHBand="0" w:firstRowFirstColumn="0" w:firstRowLastColumn="0" w:lastRowFirstColumn="0" w:lastRowLastColumn="0"/>
             </w:pPr>
@@ -3416,6 +3343,7 @@
           </w:tcPr>
           <w:p>
             <w:r>
+              <w:lastRenderedPageBreak/>
               <w:t>RNF-USA-04</w:t>
             </w:r>
           </w:p>
@@ -3451,13 +3379,22 @@
         <w:tc>
           <w:tcPr>
             <w:tcW w:w="1219" w:type="dxa"/>
-          </w:tcPr>
-          <w:p>
-            <w:pPr>
-              <w:keepNext/>
+            <w:vAlign w:val="center"/>
+          </w:tcPr>
+          <w:p>
+            <w:pPr>
+              <w:spacing w:line="240" w:lineRule="auto"/>
               <w:jc w:val="center"/>
               <w:cnfStyle w:val="000000000000" w:firstRow="0" w:lastRow="0" w:firstColumn="0" w:lastColumn="0" w:oddVBand="0" w:evenVBand="0" w:oddHBand="0" w:evenHBand="0" w:firstRowFirstColumn="0" w:firstRowLastColumn="0" w:lastRowFirstColumn="0" w:lastRowLastColumn="0"/>
             </w:pPr>
+            <w:r>
+              <w:rPr>
+                <w:noProof/>
+                <w:sz w:val="52"/>
+                <w:szCs w:val="52"/>
+              </w:rPr>
+              <w:sym w:font="Wingdings 2" w:char="F0D2"/>
+            </w:r>
           </w:p>
         </w:tc>
       </w:tr>
@@ -3487,15 +3424,8 @@
       <w:bookmarkEnd w:id="6"/>
     </w:p>
     <w:p/>
-    <w:p>
-      <w:pPr>
-        <w:spacing w:after="160" w:line="259" w:lineRule="auto"/>
-        <w:jc w:val="left"/>
-      </w:pPr>
-      <w:r>
-        <w:br w:type="page"/>
-      </w:r>
-    </w:p>
+    <w:p/>
+    <w:p/>
     <w:p/>
     <w:p>
       <w:pPr>
@@ -3503,20 +3433,6 @@
       </w:pPr>
       <w:r>
         <w:t>Requisitos Não Funcionais de Fiabilidade</w:t>
-      </w:r>
-    </w:p>
-    <w:p/>
-    <w:p>
-      <w:r>
-        <w:t>Requisitos Não Funcionais de Fiabilidade</w:t>
-      </w:r>
-      <w:r>
-        <w:t xml:space="preserve"> referem-se à capacidade do sistema funcionar correta e eficientemente. Estes requisitos serão utilizados para garantir que não há falhas no sistema, o que garante a confiança do utilizador no sistema e reduz perda de dados.</w:t>
-      </w:r>
-    </w:p>
-    <w:p>
-      <w:r>
-        <w:t>&lt;etapa II – marcar com um X na coluna “Implementado”&gt;</w:t>
       </w:r>
     </w:p>
     <w:p/>
@@ -3666,12 +3582,27 @@
         <w:tc>
           <w:tcPr>
             <w:tcW w:w="1689" w:type="dxa"/>
-          </w:tcPr>
-          <w:p>
-            <w:pPr>
+            <w:vAlign w:val="center"/>
+          </w:tcPr>
+          <w:p>
+            <w:pPr>
+              <w:spacing w:line="240" w:lineRule="auto"/>
               <w:jc w:val="center"/>
               <w:cnfStyle w:val="000000100000" w:firstRow="0" w:lastRow="0" w:firstColumn="0" w:lastColumn="0" w:oddVBand="0" w:evenVBand="0" w:oddHBand="1" w:evenHBand="0" w:firstRowFirstColumn="0" w:firstRowLastColumn="0" w:lastRowFirstColumn="0" w:lastRowLastColumn="0"/>
-            </w:pPr>
+              <w:rPr>
+                <w:noProof/>
+                <w:sz w:val="52"/>
+                <w:szCs w:val="52"/>
+              </w:rPr>
+            </w:pPr>
+            <w:r>
+              <w:rPr>
+                <w:noProof/>
+                <w:sz w:val="52"/>
+                <w:szCs w:val="52"/>
+              </w:rPr>
+              <w:sym w:font="Wingdings 2" w:char="F0D2"/>
+            </w:r>
           </w:p>
         </w:tc>
       </w:tr>
@@ -3696,7 +3627,7 @@
               <w:cnfStyle w:val="000000000000" w:firstRow="0" w:lastRow="0" w:firstColumn="0" w:lastColumn="0" w:oddVBand="0" w:evenVBand="0" w:oddHBand="0" w:evenHBand="0" w:firstRowFirstColumn="0" w:firstRowLastColumn="0" w:lastRowFirstColumn="0" w:lastRowLastColumn="0"/>
             </w:pPr>
             <w:r>
-              <w:t>Reconexão automática do cliente em caso de perda de conexão</w:t>
+              <w:t>Mensagem de erro ao desconectar</w:t>
             </w:r>
           </w:p>
         </w:tc>
@@ -3720,8 +3651,14 @@
           </w:tcPr>
           <w:p>
             <w:pPr>
+              <w:spacing w:line="240" w:lineRule="auto"/>
               <w:jc w:val="center"/>
               <w:cnfStyle w:val="000000000000" w:firstRow="0" w:lastRow="0" w:firstColumn="0" w:lastColumn="0" w:oddVBand="0" w:evenVBand="0" w:oddHBand="0" w:evenHBand="0" w:firstRowFirstColumn="0" w:firstRowLastColumn="0" w:lastRowFirstColumn="0" w:lastRowLastColumn="0"/>
+              <w:rPr>
+                <w:noProof/>
+                <w:sz w:val="52"/>
+                <w:szCs w:val="52"/>
+              </w:rPr>
             </w:pPr>
           </w:p>
         </w:tc>
@@ -3750,7 +3687,16 @@
               <w:cnfStyle w:val="000000100000" w:firstRow="0" w:lastRow="0" w:firstColumn="0" w:lastColumn="0" w:oddVBand="0" w:evenVBand="0" w:oddHBand="1" w:evenHBand="0" w:firstRowFirstColumn="0" w:firstRowLastColumn="0" w:lastRowFirstColumn="0" w:lastRowLastColumn="0"/>
             </w:pPr>
             <w:r>
-              <w:t>Validação de integridade de todas as mensagens recebidas</w:t>
+              <w:t xml:space="preserve">Validação </w:t>
+            </w:r>
+            <w:r>
+              <w:t>básica de</w:t>
+            </w:r>
+            <w:r>
+              <w:t xml:space="preserve"> mensagens</w:t>
+            </w:r>
+            <w:r>
+              <w:t>, verifica se está vazia</w:t>
             </w:r>
           </w:p>
         </w:tc>
@@ -3774,8 +3720,14 @@
           </w:tcPr>
           <w:p>
             <w:pPr>
+              <w:spacing w:line="240" w:lineRule="auto"/>
               <w:jc w:val="center"/>
               <w:cnfStyle w:val="000000100000" w:firstRow="0" w:lastRow="0" w:firstColumn="0" w:lastColumn="0" w:oddVBand="0" w:evenVBand="0" w:oddHBand="1" w:evenHBand="0" w:firstRowFirstColumn="0" w:firstRowLastColumn="0" w:lastRowFirstColumn="0" w:lastRowLastColumn="0"/>
+              <w:rPr>
+                <w:noProof/>
+                <w:sz w:val="52"/>
+                <w:szCs w:val="52"/>
+              </w:rPr>
             </w:pPr>
           </w:p>
         </w:tc>
@@ -3801,7 +3753,7 @@
               <w:cnfStyle w:val="000000000000" w:firstRow="0" w:lastRow="0" w:firstColumn="0" w:lastColumn="0" w:oddVBand="0" w:evenVBand="0" w:oddHBand="0" w:evenHBand="0" w:firstRowFirstColumn="0" w:firstRowLastColumn="0" w:lastRowFirstColumn="0" w:lastRowLastColumn="0"/>
             </w:pPr>
             <w:r>
-              <w:t>Sistema registar todas as operações em log para auditoria</w:t>
+              <w:t>Log simples em ficheiro de texto</w:t>
             </w:r>
           </w:p>
         </w:tc>
@@ -3826,9 +3778,14 @@
           </w:tcPr>
           <w:p>
             <w:pPr>
-              <w:keepNext/>
+              <w:spacing w:line="240" w:lineRule="auto"/>
               <w:jc w:val="center"/>
               <w:cnfStyle w:val="000000000000" w:firstRow="0" w:lastRow="0" w:firstColumn="0" w:lastColumn="0" w:oddVBand="0" w:evenVBand="0" w:oddHBand="0" w:evenHBand="0" w:firstRowFirstColumn="0" w:firstRowLastColumn="0" w:lastRowFirstColumn="0" w:lastRowLastColumn="0"/>
+              <w:rPr>
+                <w:noProof/>
+                <w:sz w:val="52"/>
+                <w:szCs w:val="52"/>
+              </w:rPr>
             </w:pPr>
           </w:p>
         </w:tc>
@@ -3859,15 +3816,11 @@
       <w:bookmarkEnd w:id="7"/>
     </w:p>
     <w:p/>
-    <w:p>
-      <w:pPr>
-        <w:spacing w:after="160" w:line="259" w:lineRule="auto"/>
-        <w:jc w:val="left"/>
-      </w:pPr>
-      <w:r>
-        <w:br w:type="page"/>
-      </w:r>
-    </w:p>
+    <w:p/>
+    <w:p/>
+    <w:p/>
+    <w:p/>
+    <w:p/>
     <w:p/>
     <w:p>
       <w:pPr>
@@ -3875,26 +3828,6 @@
       </w:pPr>
       <w:r>
         <w:t>Requisitos Não Funcionais de Segurança</w:t>
-      </w:r>
-    </w:p>
-    <w:p/>
-    <w:p>
-      <w:r>
-        <w:t xml:space="preserve">Requisitos Não Funcionais de </w:t>
-      </w:r>
-      <w:r>
-        <w:t xml:space="preserve">segurança é relacionado com a proteção dos dados do </w:t>
-      </w:r>
-      <w:r>
-        <w:t>utilizador e</w:t>
-      </w:r>
-      <w:r>
-        <w:t xml:space="preserve"> de controlo de acesso aos mesmos. Garantir que estes requisitos são implementados é crucial para proteger as informações sensíveis do utilizador e proteger contra ataques indevidos. </w:t>
-      </w:r>
-    </w:p>
-    <w:p>
-      <w:r>
-        <w:t>&lt;etapa II – marcar com um X na coluna “Implementado”&gt;</w:t>
       </w:r>
     </w:p>
     <w:p/>
@@ -4128,7 +4061,23 @@
               <w:cnfStyle w:val="000000100000" w:firstRow="0" w:lastRow="0" w:firstColumn="0" w:lastColumn="0" w:oddVBand="0" w:evenVBand="0" w:oddHBand="1" w:evenHBand="0" w:firstRowFirstColumn="0" w:firstRowLastColumn="0" w:lastRowFirstColumn="0" w:lastRowLastColumn="0"/>
             </w:pPr>
             <w:r>
-              <w:t>Armazenar credenciais com hash (MD5 com salt)</w:t>
+              <w:t xml:space="preserve">Armazenar credenciais com </w:t>
+            </w:r>
+            <w:proofErr w:type="spellStart"/>
+            <w:r>
+              <w:t>hash</w:t>
+            </w:r>
+            <w:proofErr w:type="spellEnd"/>
+            <w:r>
+              <w:t xml:space="preserve"> (MD5 com </w:t>
+            </w:r>
+            <w:proofErr w:type="spellStart"/>
+            <w:r>
+              <w:t>salt</w:t>
+            </w:r>
+            <w:proofErr w:type="spellEnd"/>
+            <w:r>
+              <w:t>)</w:t>
             </w:r>
           </w:p>
         </w:tc>
@@ -4239,15 +4188,6 @@
       </w:r>
       <w:bookmarkEnd w:id="8"/>
     </w:p>
-    <w:p>
-      <w:pPr>
-        <w:spacing w:after="160" w:line="259" w:lineRule="auto"/>
-        <w:jc w:val="left"/>
-      </w:pPr>
-      <w:r>
-        <w:br w:type="page"/>
-      </w:r>
-    </w:p>
     <w:p/>
     <w:p>
       <w:pPr>
@@ -4255,20 +4195,6 @@
       </w:pPr>
       <w:r>
         <w:t xml:space="preserve">Requisitos Não Funcionais de Eficiência </w:t>
-      </w:r>
-    </w:p>
-    <w:p/>
-    <w:p>
-      <w:r>
-        <w:t xml:space="preserve">Requisitos Não Funcionais de </w:t>
-      </w:r>
-      <w:r>
-        <w:t xml:space="preserve">eficiência diz respeito ao desempenho do sistema, como por exemplo o tempo de resposta e uso de recursos. Implementar estes requisitos irá assegurar o bom funcionamento do sistema. </w:t>
-      </w:r>
-    </w:p>
-    <w:p>
-      <w:r>
-        <w:t>&lt;etapa II – marcar com um X na coluna “Implementado”&gt;</w:t>
       </w:r>
     </w:p>
     <w:p/>
@@ -4376,6 +4302,8 @@
       <w:tr>
         <w:trPr>
           <w:cnfStyle w:val="000000100000" w:firstRow="0" w:lastRow="0" w:firstColumn="0" w:lastColumn="0" w:oddVBand="0" w:evenVBand="0" w:oddHBand="1" w:evenHBand="0" w:firstRowFirstColumn="0" w:firstRowLastColumn="0" w:lastRowFirstColumn="0" w:lastRowLastColumn="0"/>
+          <w:cantSplit/>
+          <w:trHeight w:val="1134"/>
         </w:trPr>
         <w:tc>
           <w:tcPr>
@@ -4391,19 +4319,27 @@
         <w:tc>
           <w:tcPr>
             <w:tcW w:w="5365" w:type="dxa"/>
-          </w:tcPr>
-          <w:p>
-            <w:pPr>
+            <w:vAlign w:val="center"/>
+          </w:tcPr>
+          <w:p>
+            <w:pPr>
+              <w:jc w:val="center"/>
               <w:cnfStyle w:val="000000100000" w:firstRow="0" w:lastRow="0" w:firstColumn="0" w:lastColumn="0" w:oddVBand="0" w:evenVBand="0" w:oddHBand="1" w:evenHBand="0" w:firstRowFirstColumn="0" w:firstRowLastColumn="0" w:lastRowFirstColumn="0" w:lastRowLastColumn="0"/>
             </w:pPr>
             <w:r>
-              <w:t>Servidor processar múltiplos clientes com threads</w:t>
-            </w:r>
+              <w:t xml:space="preserve">Servidor processar múltiplos clientes com </w:t>
+            </w:r>
+            <w:proofErr w:type="spellStart"/>
+            <w:r>
+              <w:t>threads</w:t>
+            </w:r>
+            <w:proofErr w:type="spellEnd"/>
           </w:p>
         </w:tc>
         <w:tc>
           <w:tcPr>
             <w:tcW w:w="1422" w:type="dxa"/>
+            <w:vAlign w:val="center"/>
           </w:tcPr>
           <w:p>
             <w:pPr>
@@ -4418,16 +4354,29 @@
         <w:tc>
           <w:tcPr>
             <w:tcW w:w="1220" w:type="dxa"/>
+            <w:vAlign w:val="center"/>
           </w:tcPr>
           <w:p>
             <w:pPr>
               <w:jc w:val="center"/>
               <w:cnfStyle w:val="000000100000" w:firstRow="0" w:lastRow="0" w:firstColumn="0" w:lastColumn="0" w:oddVBand="0" w:evenVBand="0" w:oddHBand="1" w:evenHBand="0" w:firstRowFirstColumn="0" w:firstRowLastColumn="0" w:lastRowFirstColumn="0" w:lastRowLastColumn="0"/>
             </w:pPr>
+            <w:r>
+              <w:rPr>
+                <w:noProof/>
+                <w:sz w:val="52"/>
+                <w:szCs w:val="52"/>
+              </w:rPr>
+              <w:sym w:font="Wingdings 2" w:char="F0D2"/>
+            </w:r>
           </w:p>
         </w:tc>
       </w:tr>
       <w:tr>
+        <w:trPr>
+          <w:cantSplit/>
+          <w:trHeight w:val="1134"/>
+        </w:trPr>
         <w:tc>
           <w:tcPr>
             <w:cnfStyle w:val="001000000000" w:firstRow="0" w:lastRow="0" w:firstColumn="1" w:lastColumn="0" w:oddVBand="0" w:evenVBand="0" w:oddHBand="0" w:evenHBand="0" w:firstRowFirstColumn="0" w:firstRowLastColumn="0" w:lastRowFirstColumn="0" w:lastRowLastColumn="0"/>
@@ -4442,9 +4391,11 @@
         <w:tc>
           <w:tcPr>
             <w:tcW w:w="5365" w:type="dxa"/>
-          </w:tcPr>
-          <w:p>
-            <w:pPr>
+            <w:vAlign w:val="center"/>
+          </w:tcPr>
+          <w:p>
+            <w:pPr>
+              <w:jc w:val="center"/>
               <w:cnfStyle w:val="000000000000" w:firstRow="0" w:lastRow="0" w:firstColumn="0" w:lastColumn="0" w:oddVBand="0" w:evenVBand="0" w:oddHBand="0" w:evenHBand="0" w:firstRowFirstColumn="0" w:firstRowLastColumn="0" w:lastRowFirstColumn="0" w:lastRowLastColumn="0"/>
             </w:pPr>
             <w:r>
@@ -4455,6 +4406,7 @@
         <w:tc>
           <w:tcPr>
             <w:tcW w:w="1422" w:type="dxa"/>
+            <w:vAlign w:val="center"/>
           </w:tcPr>
           <w:p>
             <w:pPr>
@@ -4469,12 +4421,21 @@
         <w:tc>
           <w:tcPr>
             <w:tcW w:w="1220" w:type="dxa"/>
+            <w:vAlign w:val="center"/>
           </w:tcPr>
           <w:p>
             <w:pPr>
               <w:jc w:val="center"/>
               <w:cnfStyle w:val="000000000000" w:firstRow="0" w:lastRow="0" w:firstColumn="0" w:lastColumn="0" w:oddVBand="0" w:evenVBand="0" w:oddHBand="0" w:evenHBand="0" w:firstRowFirstColumn="0" w:firstRowLastColumn="0" w:lastRowFirstColumn="0" w:lastRowLastColumn="0"/>
             </w:pPr>
+            <w:r>
+              <w:rPr>
+                <w:noProof/>
+                <w:sz w:val="52"/>
+                <w:szCs w:val="52"/>
+              </w:rPr>
+              <w:sym w:font="Wingdings 2" w:char="F0D2"/>
+            </w:r>
           </w:p>
         </w:tc>
       </w:tr>
@@ -4504,9 +4465,11 @@
             <w:r>
               <w:t xml:space="preserve">Operações de Criptografia </w:t>
             </w:r>
+            <w:proofErr w:type="spellStart"/>
             <w:r>
               <w:t>optimizadas</w:t>
             </w:r>
+            <w:proofErr w:type="spellEnd"/>
           </w:p>
         </w:tc>
         <w:tc>
@@ -4543,6 +4506,7 @@
           </w:tcPr>
           <w:p>
             <w:r>
+              <w:lastRenderedPageBreak/>
               <w:t>RNF-EFI-04</w:t>
             </w:r>
           </w:p>
@@ -4617,44 +4581,12 @@
       <w:bookmarkEnd w:id="9"/>
     </w:p>
     <w:p/>
-    <w:p/>
-    <w:p/>
-    <w:p/>
-    <w:p/>
-    <w:p/>
-    <w:p/>
-    <w:p/>
-    <w:p>
-      <w:pPr>
-        <w:spacing w:after="160" w:line="259" w:lineRule="auto"/>
-        <w:jc w:val="left"/>
-      </w:pPr>
-      <w:r>
-        <w:lastRenderedPageBreak/>
-        <w:br w:type="page"/>
-      </w:r>
-    </w:p>
-    <w:p/>
     <w:p>
       <w:pPr>
         <w:pStyle w:val="Ttulo4"/>
       </w:pPr>
       <w:r>
         <w:t>Requisitos Não Funcionais de Disponibilidade</w:t>
-      </w:r>
-    </w:p>
-    <w:p/>
-    <w:p>
-      <w:r>
-        <w:t xml:space="preserve">Requisitos Não Funcionais de </w:t>
-      </w:r>
-      <w:r>
-        <w:t xml:space="preserve">Disponibilidade é utilizado para se referir ao tempo que o sistema está operacional e acessível. A sua importância é garantir que o sistema pode ser utilizado quando necessário. </w:t>
-      </w:r>
-    </w:p>
-    <w:p>
-      <w:r>
-        <w:t>&lt;etapa II – marcar com um X na coluna “Implementado”&gt;</w:t>
       </w:r>
     </w:p>
     <w:p/>
@@ -4810,10 +4742,22 @@
               <w:jc w:val="center"/>
               <w:cnfStyle w:val="000000100000" w:firstRow="0" w:lastRow="0" w:firstColumn="0" w:lastColumn="0" w:oddVBand="0" w:evenVBand="0" w:oddHBand="1" w:evenHBand="0" w:firstRowFirstColumn="0" w:firstRowLastColumn="0" w:lastRowFirstColumn="0" w:lastRowLastColumn="0"/>
             </w:pPr>
+            <w:r>
+              <w:rPr>
+                <w:noProof/>
+                <w:sz w:val="52"/>
+                <w:szCs w:val="52"/>
+              </w:rPr>
+              <w:sym w:font="Wingdings 2" w:char="F0D2"/>
+            </w:r>
           </w:p>
         </w:tc>
       </w:tr>
       <w:tr>
+        <w:trPr>
+          <w:cantSplit/>
+          <w:trHeight w:val="1134"/>
+        </w:trPr>
         <w:tc>
           <w:tcPr>
             <w:cnfStyle w:val="001000000000" w:firstRow="0" w:lastRow="0" w:firstColumn="1" w:lastColumn="0" w:oddVBand="0" w:evenVBand="0" w:oddHBand="0" w:evenHBand="0" w:firstRowFirstColumn="0" w:firstRowLastColumn="0" w:lastRowFirstColumn="0" w:lastRowLastColumn="0"/>
@@ -4828,9 +4772,11 @@
         <w:tc>
           <w:tcPr>
             <w:tcW w:w="5365" w:type="dxa"/>
-          </w:tcPr>
-          <w:p>
-            <w:pPr>
+            <w:vAlign w:val="center"/>
+          </w:tcPr>
+          <w:p>
+            <w:pPr>
+              <w:jc w:val="left"/>
               <w:cnfStyle w:val="000000000000" w:firstRow="0" w:lastRow="0" w:firstColumn="0" w:lastColumn="0" w:oddVBand="0" w:evenVBand="0" w:oddHBand="0" w:evenHBand="0" w:firstRowFirstColumn="0" w:firstRowLastColumn="0" w:lastRowFirstColumn="0" w:lastRowLastColumn="0"/>
             </w:pPr>
             <w:r>
@@ -4841,6 +4787,7 @@
         <w:tc>
           <w:tcPr>
             <w:tcW w:w="1422" w:type="dxa"/>
+            <w:vAlign w:val="center"/>
           </w:tcPr>
           <w:p>
             <w:pPr>
@@ -4855,12 +4802,21 @@
         <w:tc>
           <w:tcPr>
             <w:tcW w:w="1220" w:type="dxa"/>
+            <w:vAlign w:val="center"/>
           </w:tcPr>
           <w:p>
             <w:pPr>
               <w:jc w:val="center"/>
               <w:cnfStyle w:val="000000000000" w:firstRow="0" w:lastRow="0" w:firstColumn="0" w:lastColumn="0" w:oddVBand="0" w:evenVBand="0" w:oddHBand="0" w:evenHBand="0" w:firstRowFirstColumn="0" w:firstRowLastColumn="0" w:lastRowFirstColumn="0" w:lastRowLastColumn="0"/>
             </w:pPr>
+            <w:r>
+              <w:rPr>
+                <w:noProof/>
+                <w:sz w:val="52"/>
+                <w:szCs w:val="52"/>
+              </w:rPr>
+              <w:sym w:font="Wingdings 2" w:char="F0D2"/>
+            </w:r>
           </w:p>
         </w:tc>
       </w:tr>
@@ -4915,6 +4871,14 @@
               <w:jc w:val="center"/>
               <w:cnfStyle w:val="000000100000" w:firstRow="0" w:lastRow="0" w:firstColumn="0" w:lastColumn="0" w:oddVBand="0" w:evenVBand="0" w:oddHBand="1" w:evenHBand="0" w:firstRowFirstColumn="0" w:firstRowLastColumn="0" w:lastRowFirstColumn="0" w:lastRowLastColumn="0"/>
             </w:pPr>
+            <w:r>
+              <w:rPr>
+                <w:noProof/>
+                <w:sz w:val="52"/>
+                <w:szCs w:val="52"/>
+              </w:rPr>
+              <w:sym w:font="Wingdings 2" w:char="F0D2"/>
+            </w:r>
           </w:p>
         </w:tc>
       </w:tr>
@@ -4939,7 +4903,16 @@
               <w:cnfStyle w:val="000000000000" w:firstRow="0" w:lastRow="0" w:firstColumn="0" w:lastColumn="0" w:oddVBand="0" w:evenVBand="0" w:oddHBand="0" w:evenHBand="0" w:firstRowFirstColumn="0" w:firstRowLastColumn="0" w:lastRowFirstColumn="0" w:lastRowLastColumn="0"/>
             </w:pPr>
             <w:r>
-              <w:t>Mensagens não perdidas mesmo com desconexão inesperada</w:t>
+              <w:t xml:space="preserve">Mostrar aviso se falhar </w:t>
+            </w:r>
+            <w:r>
+              <w:t xml:space="preserve">o </w:t>
+            </w:r>
+            <w:r>
+              <w:t>envio</w:t>
+            </w:r>
+            <w:r>
+              <w:t xml:space="preserve"> de alguma mensagem</w:t>
             </w:r>
           </w:p>
         </w:tc>
@@ -4999,34 +4972,10 @@
     <w:p/>
     <w:p>
       <w:pPr>
-        <w:spacing w:after="160" w:line="259" w:lineRule="auto"/>
-        <w:jc w:val="left"/>
-      </w:pPr>
-      <w:r>
-        <w:br w:type="page"/>
-      </w:r>
-    </w:p>
-    <w:p/>
-    <w:p>
-      <w:pPr>
         <w:pStyle w:val="Ttulo4"/>
       </w:pPr>
       <w:r>
         <w:t>Requisitos Não Funcionais de Ambiente</w:t>
-      </w:r>
-    </w:p>
-    <w:p/>
-    <w:p>
-      <w:r>
-        <w:t xml:space="preserve">Requisitos Não Funcionais de </w:t>
-      </w:r>
-      <w:r>
-        <w:t xml:space="preserve">Ambiente refere-se às condições técnicas onde o sistema opera. É necessário configurar estes requisitos para assegurar a compatibilidade e funcionamento adequado do programa. </w:t>
-      </w:r>
-    </w:p>
-    <w:p>
-      <w:r>
-        <w:t>&lt;etapa II – marcar com um X na coluna “Implementado”&gt;</w:t>
       </w:r>
     </w:p>
     <w:p/>
@@ -5184,6 +5133,14 @@
               <w:jc w:val="center"/>
               <w:cnfStyle w:val="000000100000" w:firstRow="0" w:lastRow="0" w:firstColumn="0" w:lastColumn="0" w:oddVBand="0" w:evenVBand="0" w:oddHBand="1" w:evenHBand="0" w:firstRowFirstColumn="0" w:firstRowLastColumn="0" w:lastRowFirstColumn="0" w:lastRowLastColumn="0"/>
             </w:pPr>
+            <w:r>
+              <w:rPr>
+                <w:noProof/>
+                <w:sz w:val="52"/>
+                <w:szCs w:val="52"/>
+              </w:rPr>
+              <w:sym w:font="Wingdings 2" w:char="F0D2"/>
+            </w:r>
           </w:p>
         </w:tc>
       </w:tr>
@@ -5238,6 +5195,14 @@
               <w:jc w:val="center"/>
               <w:cnfStyle w:val="000000000000" w:firstRow="0" w:lastRow="0" w:firstColumn="0" w:lastColumn="0" w:oddVBand="0" w:evenVBand="0" w:oddHBand="0" w:evenHBand="0" w:firstRowFirstColumn="0" w:firstRowLastColumn="0" w:lastRowFirstColumn="0" w:lastRowLastColumn="0"/>
             </w:pPr>
+            <w:r>
+              <w:rPr>
+                <w:noProof/>
+                <w:sz w:val="52"/>
+                <w:szCs w:val="52"/>
+              </w:rPr>
+              <w:sym w:font="Wingdings 2" w:char="F0D2"/>
+            </w:r>
           </w:p>
         </w:tc>
       </w:tr>
@@ -5253,6 +5218,7 @@
           </w:tcPr>
           <w:p>
             <w:r>
+              <w:lastRenderedPageBreak/>
               <w:t>RNF-AMB-03</w:t>
             </w:r>
           </w:p>
@@ -5266,7 +5232,15 @@
               <w:cnfStyle w:val="000000100000" w:firstRow="0" w:lastRow="0" w:firstColumn="0" w:lastColumn="0" w:oddVBand="0" w:evenVBand="0" w:oddHBand="1" w:evenHBand="0" w:firstRowFirstColumn="0" w:firstRowLastColumn="0" w:lastRowFirstColumn="0" w:lastRowLastColumn="0"/>
             </w:pPr>
             <w:r>
-              <w:t>Suportar Visual Studio 2019 ou superior</w:t>
+              <w:t xml:space="preserve">Suportar Visual </w:t>
+            </w:r>
+            <w:proofErr w:type="spellStart"/>
+            <w:r>
+              <w:t>Studio</w:t>
+            </w:r>
+            <w:proofErr w:type="spellEnd"/>
+            <w:r>
+              <w:t xml:space="preserve"> 2019 ou superior</w:t>
             </w:r>
           </w:p>
         </w:tc>
@@ -5293,6 +5267,14 @@
               <w:jc w:val="center"/>
               <w:cnfStyle w:val="000000100000" w:firstRow="0" w:lastRow="0" w:firstColumn="0" w:lastColumn="0" w:oddVBand="0" w:evenVBand="0" w:oddHBand="1" w:evenHBand="0" w:firstRowFirstColumn="0" w:firstRowLastColumn="0" w:lastRowFirstColumn="0" w:lastRowLastColumn="0"/>
             </w:pPr>
+            <w:r>
+              <w:rPr>
+                <w:noProof/>
+                <w:sz w:val="52"/>
+                <w:szCs w:val="52"/>
+              </w:rPr>
+              <w:sym w:font="Wingdings 2" w:char="F0D2"/>
+            </w:r>
           </w:p>
         </w:tc>
       </w:tr>
@@ -5320,7 +5302,15 @@
               <w:cnfStyle w:val="000000000000" w:firstRow="0" w:lastRow="0" w:firstColumn="0" w:lastColumn="0" w:oddVBand="0" w:evenVBand="0" w:oddHBand="0" w:evenHBand="0" w:firstRowFirstColumn="0" w:firstRowLastColumn="0" w:lastRowFirstColumn="0" w:lastRowLastColumn="0"/>
             </w:pPr>
             <w:r>
-              <w:t>Base de dados SQL Server ou Entity Framework</w:t>
+              <w:t xml:space="preserve">Base de dados SQL Server ou </w:t>
+            </w:r>
+            <w:proofErr w:type="spellStart"/>
+            <w:r>
+              <w:t>Entity</w:t>
+            </w:r>
+            <w:proofErr w:type="spellEnd"/>
+            <w:r>
+              <w:t xml:space="preserve"> Framework</w:t>
             </w:r>
           </w:p>
         </w:tc>
@@ -5378,33 +5368,12 @@
       <w:bookmarkEnd w:id="11"/>
     </w:p>
     <w:p/>
-    <w:p/>
-    <w:p/>
-    <w:p/>
-    <w:p/>
-    <w:p/>
-    <w:p/>
-    <w:p/>
     <w:p>
       <w:pPr>
         <w:pStyle w:val="Ttulo4"/>
       </w:pPr>
       <w:r>
         <w:t>Requisitos Não Funcionais de Desenvolvimento</w:t>
-      </w:r>
-    </w:p>
-    <w:p/>
-    <w:p>
-      <w:r>
-        <w:t xml:space="preserve">Requisitos Não Funcionais de </w:t>
-      </w:r>
-      <w:r>
-        <w:t>desenvolvimento refere-se às práticas que devem ser seguidas durante o desenvolvimento do sistema. Seguir os padrões escolhidos permite garantir a qualidade e manutenção do sistema. Irá também facilitar o trabalho de equipa de desenvolvimento, assim garantido a consistência do trabalho ao longo do tempo.</w:t>
-      </w:r>
-    </w:p>
-    <w:p>
-      <w:r>
-        <w:t>&lt;etapa II – marcar com um X na coluna “Implementado”&gt;</w:t>
       </w:r>
     </w:p>
     <w:p/>
@@ -5512,6 +5481,7 @@
       <w:tr>
         <w:trPr>
           <w:cnfStyle w:val="000000100000" w:firstRow="0" w:lastRow="0" w:firstColumn="0" w:lastColumn="0" w:oddVBand="0" w:evenVBand="0" w:oddHBand="1" w:evenHBand="0" w:firstRowFirstColumn="0" w:firstRowLastColumn="0" w:lastRowFirstColumn="0" w:lastRowLastColumn="0"/>
+          <w:trHeight w:val="929"/>
         </w:trPr>
         <w:tc>
           <w:tcPr>
@@ -5560,6 +5530,14 @@
               <w:jc w:val="center"/>
               <w:cnfStyle w:val="000000100000" w:firstRow="0" w:lastRow="0" w:firstColumn="0" w:lastColumn="0" w:oddVBand="0" w:evenVBand="0" w:oddHBand="1" w:evenHBand="0" w:firstRowFirstColumn="0" w:firstRowLastColumn="0" w:lastRowFirstColumn="0" w:lastRowLastColumn="0"/>
             </w:pPr>
+            <w:r>
+              <w:rPr>
+                <w:noProof/>
+                <w:sz w:val="52"/>
+                <w:szCs w:val="52"/>
+              </w:rPr>
+              <w:sym w:font="Wingdings 2" w:char="F0D2"/>
+            </w:r>
           </w:p>
         </w:tc>
       </w:tr>
@@ -5611,6 +5589,14 @@
               <w:jc w:val="center"/>
               <w:cnfStyle w:val="000000000000" w:firstRow="0" w:lastRow="0" w:firstColumn="0" w:lastColumn="0" w:oddVBand="0" w:evenVBand="0" w:oddHBand="0" w:evenHBand="0" w:firstRowFirstColumn="0" w:firstRowLastColumn="0" w:lastRowFirstColumn="0" w:lastRowLastColumn="0"/>
             </w:pPr>
+            <w:r>
+              <w:rPr>
+                <w:noProof/>
+                <w:sz w:val="52"/>
+                <w:szCs w:val="52"/>
+              </w:rPr>
+              <w:sym w:font="Wingdings 2" w:char="F0D2"/>
+            </w:r>
           </w:p>
         </w:tc>
       </w:tr>
@@ -5689,7 +5675,15 @@
               <w:cnfStyle w:val="000000000000" w:firstRow="0" w:lastRow="0" w:firstColumn="0" w:lastColumn="0" w:oddVBand="0" w:evenVBand="0" w:oddHBand="0" w:evenHBand="0" w:firstRowFirstColumn="0" w:firstRowLastColumn="0" w:lastRowFirstColumn="0" w:lastRowLastColumn="0"/>
             </w:pPr>
             <w:r>
-              <w:t>Ficheiro .sql fornecido se utilizar base de dados</w:t>
+              <w:t>Ficheiro .</w:t>
+            </w:r>
+            <w:proofErr w:type="spellStart"/>
+            <w:r>
+              <w:t>sql</w:t>
+            </w:r>
+            <w:proofErr w:type="spellEnd"/>
+            <w:r>
+              <w:t xml:space="preserve"> fornecido se utilizar base de dados</w:t>
             </w:r>
           </w:p>
         </w:tc>
@@ -5751,29 +5745,219 @@
         <w:spacing w:after="160" w:line="259" w:lineRule="auto"/>
         <w:jc w:val="left"/>
       </w:pPr>
-      <w:r>
-        <w:br w:type="page"/>
-      </w:r>
     </w:p>
     <w:p>
       <w:pPr>
+        <w:spacing w:after="160" w:line="259" w:lineRule="auto"/>
+        <w:jc w:val="left"/>
+      </w:pPr>
+    </w:p>
+    <w:p>
+      <w:pPr>
+        <w:spacing w:after="160" w:line="259" w:lineRule="auto"/>
+        <w:jc w:val="left"/>
+      </w:pPr>
+    </w:p>
+    <w:p>
+      <w:pPr>
+        <w:spacing w:after="160" w:line="259" w:lineRule="auto"/>
+        <w:jc w:val="left"/>
+      </w:pPr>
+    </w:p>
+    <w:p>
+      <w:pPr>
+        <w:spacing w:after="160" w:line="259" w:lineRule="auto"/>
+        <w:jc w:val="left"/>
+      </w:pPr>
+    </w:p>
+    <w:p>
+      <w:pPr>
         <w:pStyle w:val="Ttulo3"/>
       </w:pPr>
       <w:bookmarkStart w:id="13" w:name="_Toc67476432"/>
       <w:bookmarkStart w:id="14" w:name="_Toc67476483"/>
+      <w:proofErr w:type="spellStart"/>
       <w:r>
         <w:lastRenderedPageBreak/>
-        <w:t>Wireframes UI</w:t>
+        <w:t>Wireframes</w:t>
+      </w:r>
+      <w:proofErr w:type="spellEnd"/>
+      <w:r>
+        <w:t xml:space="preserve"> UI</w:t>
       </w:r>
       <w:bookmarkEnd w:id="13"/>
       <w:bookmarkEnd w:id="14"/>
     </w:p>
+    <w:p/>
     <w:p>
       <w:r>
-        <w:t>&lt;Contextualização das wireframes desenvolvidas&gt;</w:t>
+        <w:rPr>
+          <w:noProof/>
+        </w:rPr>
+        <w:drawing>
+          <wp:inline distT="0" distB="0" distL="0" distR="0" wp14:anchorId="08E79B7F" wp14:editId="4414CA1B">
+            <wp:extent cx="5044440" cy="3528534"/>
+            <wp:effectExtent l="0" t="0" r="3810" b="0"/>
+            <wp:docPr id="1368167934" name="Imagem 1"/>
+            <wp:cNvGraphicFramePr>
+              <a:graphicFrameLocks xmlns:a="http://schemas.openxmlformats.org/drawingml/2006/main" noChangeAspect="1"/>
+            </wp:cNvGraphicFramePr>
+            <a:graphic xmlns:a="http://schemas.openxmlformats.org/drawingml/2006/main">
+              <a:graphicData uri="http://schemas.openxmlformats.org/drawingml/2006/picture">
+                <pic:pic xmlns:pic="http://schemas.openxmlformats.org/drawingml/2006/picture">
+                  <pic:nvPicPr>
+                    <pic:cNvPr id="1368167934" name=""/>
+                    <pic:cNvPicPr/>
+                  </pic:nvPicPr>
+                  <pic:blipFill>
+                    <a:blip r:embed="rId15"/>
+                    <a:stretch>
+                      <a:fillRect/>
+                    </a:stretch>
+                  </pic:blipFill>
+                  <pic:spPr>
+                    <a:xfrm>
+                      <a:off x="0" y="0"/>
+                      <a:ext cx="5078838" cy="3552595"/>
+                    </a:xfrm>
+                    <a:prstGeom prst="rect">
+                      <a:avLst/>
+                    </a:prstGeom>
+                  </pic:spPr>
+                </pic:pic>
+              </a:graphicData>
+            </a:graphic>
+          </wp:inline>
+        </w:drawing>
       </w:r>
     </w:p>
-    <w:p/>
+    <w:p>
+      <w:r>
+        <w:rPr>
+          <w:noProof/>
+        </w:rPr>
+        <w:drawing>
+          <wp:inline distT="0" distB="0" distL="0" distR="0" wp14:anchorId="310D504D" wp14:editId="334E46C8">
+            <wp:extent cx="5059680" cy="3527355"/>
+            <wp:effectExtent l="0" t="0" r="7620" b="0"/>
+            <wp:docPr id="82776974" name="Imagem 1"/>
+            <wp:cNvGraphicFramePr>
+              <a:graphicFrameLocks xmlns:a="http://schemas.openxmlformats.org/drawingml/2006/main" noChangeAspect="1"/>
+            </wp:cNvGraphicFramePr>
+            <a:graphic xmlns:a="http://schemas.openxmlformats.org/drawingml/2006/main">
+              <a:graphicData uri="http://schemas.openxmlformats.org/drawingml/2006/picture">
+                <pic:pic xmlns:pic="http://schemas.openxmlformats.org/drawingml/2006/picture">
+                  <pic:nvPicPr>
+                    <pic:cNvPr id="82776974" name=""/>
+                    <pic:cNvPicPr/>
+                  </pic:nvPicPr>
+                  <pic:blipFill>
+                    <a:blip r:embed="rId16"/>
+                    <a:stretch>
+                      <a:fillRect/>
+                    </a:stretch>
+                  </pic:blipFill>
+                  <pic:spPr>
+                    <a:xfrm>
+                      <a:off x="0" y="0"/>
+                      <a:ext cx="5088366" cy="3547353"/>
+                    </a:xfrm>
+                    <a:prstGeom prst="rect">
+                      <a:avLst/>
+                    </a:prstGeom>
+                  </pic:spPr>
+                </pic:pic>
+              </a:graphicData>
+            </a:graphic>
+          </wp:inline>
+        </w:drawing>
+      </w:r>
+    </w:p>
+    <w:p>
+      <w:r>
+        <w:rPr>
+          <w:noProof/>
+        </w:rPr>
+        <w:lastRenderedPageBreak/>
+        <w:drawing>
+          <wp:inline distT="0" distB="0" distL="0" distR="0" wp14:anchorId="66CEC3C0" wp14:editId="6CEE77F6">
+            <wp:extent cx="5059680" cy="3545649"/>
+            <wp:effectExtent l="0" t="0" r="7620" b="0"/>
+            <wp:docPr id="1823639880" name="Imagem 1"/>
+            <wp:cNvGraphicFramePr>
+              <a:graphicFrameLocks xmlns:a="http://schemas.openxmlformats.org/drawingml/2006/main" noChangeAspect="1"/>
+            </wp:cNvGraphicFramePr>
+            <a:graphic xmlns:a="http://schemas.openxmlformats.org/drawingml/2006/main">
+              <a:graphicData uri="http://schemas.openxmlformats.org/drawingml/2006/picture">
+                <pic:pic xmlns:pic="http://schemas.openxmlformats.org/drawingml/2006/picture">
+                  <pic:nvPicPr>
+                    <pic:cNvPr id="1823639880" name=""/>
+                    <pic:cNvPicPr/>
+                  </pic:nvPicPr>
+                  <pic:blipFill>
+                    <a:blip r:embed="rId17"/>
+                    <a:stretch>
+                      <a:fillRect/>
+                    </a:stretch>
+                  </pic:blipFill>
+                  <pic:spPr>
+                    <a:xfrm>
+                      <a:off x="0" y="0"/>
+                      <a:ext cx="5075639" cy="3556832"/>
+                    </a:xfrm>
+                    <a:prstGeom prst="rect">
+                      <a:avLst/>
+                    </a:prstGeom>
+                  </pic:spPr>
+                </pic:pic>
+              </a:graphicData>
+            </a:graphic>
+          </wp:inline>
+        </w:drawing>
+      </w:r>
+    </w:p>
+    <w:p>
+      <w:r>
+        <w:rPr>
+          <w:noProof/>
+        </w:rPr>
+        <w:drawing>
+          <wp:inline distT="0" distB="0" distL="0" distR="0" wp14:anchorId="6B5C2246" wp14:editId="2CBC653A">
+            <wp:extent cx="5971540" cy="2753360"/>
+            <wp:effectExtent l="0" t="0" r="0" b="8890"/>
+            <wp:docPr id="79388561" name="Imagem 1"/>
+            <wp:cNvGraphicFramePr>
+              <a:graphicFrameLocks xmlns:a="http://schemas.openxmlformats.org/drawingml/2006/main" noChangeAspect="1"/>
+            </wp:cNvGraphicFramePr>
+            <a:graphic xmlns:a="http://schemas.openxmlformats.org/drawingml/2006/main">
+              <a:graphicData uri="http://schemas.openxmlformats.org/drawingml/2006/picture">
+                <pic:pic xmlns:pic="http://schemas.openxmlformats.org/drawingml/2006/picture">
+                  <pic:nvPicPr>
+                    <pic:cNvPr id="79388561" name=""/>
+                    <pic:cNvPicPr/>
+                  </pic:nvPicPr>
+                  <pic:blipFill>
+                    <a:blip r:embed="rId18"/>
+                    <a:stretch>
+                      <a:fillRect/>
+                    </a:stretch>
+                  </pic:blipFill>
+                  <pic:spPr>
+                    <a:xfrm>
+                      <a:off x="0" y="0"/>
+                      <a:ext cx="5971540" cy="2753360"/>
+                    </a:xfrm>
+                    <a:prstGeom prst="rect">
+                      <a:avLst/>
+                    </a:prstGeom>
+                  </pic:spPr>
+                </pic:pic>
+              </a:graphicData>
+            </a:graphic>
+          </wp:inline>
+        </w:drawing>
+      </w:r>
+    </w:p>
     <w:p>
       <w:pPr>
         <w:pStyle w:val="Ttulo1"/>
@@ -5999,6 +6183,7 @@
         <w:docPartUnique/>
       </w:docPartObj>
     </w:sdtPr>
+    <w:sdtEndPr/>
     <w:sdtContent>
       <w:p>
         <w:pPr>
@@ -6439,6 +6624,92 @@
     </w:lvl>
   </w:abstractNum>
   <w:abstractNum w:abstractNumId="3" w15:restartNumberingAfterBreak="0">
+    <w:nsid w:val="422B3FAD"/>
+    <w:multiLevelType w:val="hybridMultilevel"/>
+    <w:tmpl w:val="10168044"/>
+    <w:lvl w:ilvl="0" w:tplc="0816000F">
+      <w:start w:val="1"/>
+      <w:numFmt w:val="decimal"/>
+      <w:lvlText w:val="%1."/>
+      <w:lvlJc w:val="left"/>
+      <w:pPr>
+        <w:ind w:left="720" w:hanging="360"/>
+      </w:pPr>
+    </w:lvl>
+    <w:lvl w:ilvl="1" w:tplc="08160019" w:tentative="1">
+      <w:start w:val="1"/>
+      <w:numFmt w:val="lowerLetter"/>
+      <w:lvlText w:val="%2."/>
+      <w:lvlJc w:val="left"/>
+      <w:pPr>
+        <w:ind w:left="1440" w:hanging="360"/>
+      </w:pPr>
+    </w:lvl>
+    <w:lvl w:ilvl="2" w:tplc="0816001B" w:tentative="1">
+      <w:start w:val="1"/>
+      <w:numFmt w:val="lowerRoman"/>
+      <w:lvlText w:val="%3."/>
+      <w:lvlJc w:val="right"/>
+      <w:pPr>
+        <w:ind w:left="2160" w:hanging="180"/>
+      </w:pPr>
+    </w:lvl>
+    <w:lvl w:ilvl="3" w:tplc="0816000F" w:tentative="1">
+      <w:start w:val="1"/>
+      <w:numFmt w:val="decimal"/>
+      <w:lvlText w:val="%4."/>
+      <w:lvlJc w:val="left"/>
+      <w:pPr>
+        <w:ind w:left="2880" w:hanging="360"/>
+      </w:pPr>
+    </w:lvl>
+    <w:lvl w:ilvl="4" w:tplc="08160019" w:tentative="1">
+      <w:start w:val="1"/>
+      <w:numFmt w:val="lowerLetter"/>
+      <w:lvlText w:val="%5."/>
+      <w:lvlJc w:val="left"/>
+      <w:pPr>
+        <w:ind w:left="3600" w:hanging="360"/>
+      </w:pPr>
+    </w:lvl>
+    <w:lvl w:ilvl="5" w:tplc="0816001B" w:tentative="1">
+      <w:start w:val="1"/>
+      <w:numFmt w:val="lowerRoman"/>
+      <w:lvlText w:val="%6."/>
+      <w:lvlJc w:val="right"/>
+      <w:pPr>
+        <w:ind w:left="4320" w:hanging="180"/>
+      </w:pPr>
+    </w:lvl>
+    <w:lvl w:ilvl="6" w:tplc="0816000F" w:tentative="1">
+      <w:start w:val="1"/>
+      <w:numFmt w:val="decimal"/>
+      <w:lvlText w:val="%7."/>
+      <w:lvlJc w:val="left"/>
+      <w:pPr>
+        <w:ind w:left="5040" w:hanging="360"/>
+      </w:pPr>
+    </w:lvl>
+    <w:lvl w:ilvl="7" w:tplc="08160019" w:tentative="1">
+      <w:start w:val="1"/>
+      <w:numFmt w:val="lowerLetter"/>
+      <w:lvlText w:val="%8."/>
+      <w:lvlJc w:val="left"/>
+      <w:pPr>
+        <w:ind w:left="5760" w:hanging="360"/>
+      </w:pPr>
+    </w:lvl>
+    <w:lvl w:ilvl="8" w:tplc="0816001B" w:tentative="1">
+      <w:start w:val="1"/>
+      <w:numFmt w:val="lowerRoman"/>
+      <w:lvlText w:val="%9."/>
+      <w:lvlJc w:val="right"/>
+      <w:pPr>
+        <w:ind w:left="6480" w:hanging="180"/>
+      </w:pPr>
+    </w:lvl>
+  </w:abstractNum>
+  <w:abstractNum w:abstractNumId="4" w15:restartNumberingAfterBreak="0">
     <w:nsid w:val="466B3EEB"/>
     <w:multiLevelType w:val="hybridMultilevel"/>
     <w:tmpl w:val="F3606FE6"/>
@@ -6524,7 +6795,7 @@
       </w:pPr>
     </w:lvl>
   </w:abstractNum>
-  <w:abstractNum w:abstractNumId="4" w15:restartNumberingAfterBreak="0">
+  <w:abstractNum w:abstractNumId="5" w15:restartNumberingAfterBreak="0">
     <w:nsid w:val="548A7FE1"/>
     <w:multiLevelType w:val="multilevel"/>
     <w:tmpl w:val="F0CECED0"/>
@@ -6619,7 +6890,7 @@
       </w:pPr>
     </w:lvl>
   </w:abstractNum>
-  <w:abstractNum w:abstractNumId="5" w15:restartNumberingAfterBreak="0">
+  <w:abstractNum w:abstractNumId="6" w15:restartNumberingAfterBreak="0">
     <w:nsid w:val="70926FB1"/>
     <w:multiLevelType w:val="hybridMultilevel"/>
     <w:tmpl w:val="F3606FE6"/>
@@ -6705,7 +6976,7 @@
       </w:pPr>
     </w:lvl>
   </w:abstractNum>
-  <w:abstractNum w:abstractNumId="6" w15:restartNumberingAfterBreak="0">
+  <w:abstractNum w:abstractNumId="7" w15:restartNumberingAfterBreak="0">
     <w:nsid w:val="7ED17C0B"/>
     <w:multiLevelType w:val="hybridMultilevel"/>
     <w:tmpl w:val="16A4E9B6"/>
@@ -6792,25 +7063,28 @@
     </w:lvl>
   </w:abstractNum>
   <w:num w:numId="1" w16cid:durableId="108358867">
-    <w:abstractNumId w:val="4"/>
+    <w:abstractNumId w:val="5"/>
   </w:num>
   <w:num w:numId="2" w16cid:durableId="811993329">
     <w:abstractNumId w:val="0"/>
   </w:num>
   <w:num w:numId="3" w16cid:durableId="712271900">
-    <w:abstractNumId w:val="3"/>
+    <w:abstractNumId w:val="4"/>
   </w:num>
   <w:num w:numId="4" w16cid:durableId="1807239228">
-    <w:abstractNumId w:val="5"/>
+    <w:abstractNumId w:val="6"/>
   </w:num>
   <w:num w:numId="5" w16cid:durableId="142043368">
     <w:abstractNumId w:val="2"/>
   </w:num>
   <w:num w:numId="6" w16cid:durableId="736247993">
-    <w:abstractNumId w:val="6"/>
+    <w:abstractNumId w:val="7"/>
   </w:num>
   <w:num w:numId="7" w16cid:durableId="216088640">
     <w:abstractNumId w:val="1"/>
+  </w:num>
+  <w:num w:numId="8" w16cid:durableId="502623163">
+    <w:abstractNumId w:val="3"/>
   </w:num>
   <w:numIdMacAtCleanup w:val="7"/>
 </w:numbering>
@@ -8717,6 +8991,16 @@
 </file>
 
 <file path=customXml/item1.xml><?xml version="1.0" encoding="utf-8"?>
+<b:Sources xmlns:b="http://schemas.openxmlformats.org/officeDocument/2006/bibliography" xmlns="http://schemas.openxmlformats.org/officeDocument/2006/bibliography" SelectedStyle="/APASixthEditionOfficeOnline.xsl" StyleName="APA" Version="6"/>
+</file>
+
+<file path=customXml/item2.xml><?xml version="1.0" encoding="utf-8"?>
+<p:properties xmlns:p="http://schemas.microsoft.com/office/2006/metadata/properties" xmlns:xsi="http://www.w3.org/2001/XMLSchema-instance" xmlns:pc="http://schemas.microsoft.com/office/infopath/2007/PartnerControls">
+  <documentManagement/>
+</p:properties>
+</file>
+
+<file path=customXml/item3.xml><?xml version="1.0" encoding="utf-8"?>
 <ct:contentTypeSchema xmlns:ct="http://schemas.microsoft.com/office/2006/metadata/contentType" xmlns:ma="http://schemas.microsoft.com/office/2006/metadata/properties/metaAttributes" ct:_="" ma:_="" ma:contentTypeName="Documento" ma:contentTypeID="0x0101003F8ECAAF88AFCB4AB1D806FDE394FD03" ma:contentTypeVersion="7" ma:contentTypeDescription="Criar um novo documento." ma:contentTypeScope="" ma:versionID="798687853898f8ed54c489be77f9a2ad">
   <xsd:schema xmlns:xsd="http://www.w3.org/2001/XMLSchema" xmlns:xs="http://www.w3.org/2001/XMLSchema" xmlns:p="http://schemas.microsoft.com/office/2006/metadata/properties" xmlns:ns2="52a6887f-9537-4a34-8793-b765f13d0873" targetNamespace="http://schemas.microsoft.com/office/2006/metadata/properties" ma:root="true" ma:fieldsID="68a63200760ff0df8e2889a3ca50214f" ns2:_="">
     <xsd:import namespace="52a6887f-9537-4a34-8793-b765f13d0873"/>
@@ -8880,16 +9164,6 @@
 </ct:contentTypeSchema>
 </file>
 
-<file path=customXml/item2.xml><?xml version="1.0" encoding="utf-8"?>
-<p:properties xmlns:p="http://schemas.microsoft.com/office/2006/metadata/properties" xmlns:xsi="http://www.w3.org/2001/XMLSchema-instance" xmlns:pc="http://schemas.microsoft.com/office/infopath/2007/PartnerControls">
-  <documentManagement/>
-</p:properties>
-</file>
-
-<file path=customXml/item3.xml><?xml version="1.0" encoding="utf-8"?>
-<b:Sources xmlns:b="http://schemas.openxmlformats.org/officeDocument/2006/bibliography" xmlns="http://schemas.openxmlformats.org/officeDocument/2006/bibliography" SelectedStyle="/APASixthEditionOfficeOnline.xsl" StyleName="APA" Version="6"/>
-</file>
-
 <file path=customXml/item4.xml><?xml version="1.0" encoding="utf-8"?>
 <?mso-contentType ?>
 <FormTemplates xmlns="http://schemas.microsoft.com/sharepoint/v3/contenttype/forms">
@@ -8900,6 +9174,23 @@
 </file>
 
 <file path=customXml/itemProps1.xml><?xml version="1.0" encoding="utf-8"?>
+<ds:datastoreItem xmlns:ds="http://schemas.openxmlformats.org/officeDocument/2006/customXml" ds:itemID="{19617398-908E-4614-909E-0F810C8F0377}">
+  <ds:schemaRefs>
+    <ds:schemaRef ds:uri="http://schemas.openxmlformats.org/officeDocument/2006/bibliography"/>
+  </ds:schemaRefs>
+</ds:datastoreItem>
+</file>
+
+<file path=customXml/itemProps2.xml><?xml version="1.0" encoding="utf-8"?>
+<ds:datastoreItem xmlns:ds="http://schemas.openxmlformats.org/officeDocument/2006/customXml" ds:itemID="{0D05F977-E0EB-4BDE-9CCC-35AE7F3468D1}">
+  <ds:schemaRefs>
+    <ds:schemaRef ds:uri="http://schemas.microsoft.com/office/2006/metadata/properties"/>
+    <ds:schemaRef ds:uri="http://schemas.microsoft.com/office/infopath/2007/PartnerControls"/>
+  </ds:schemaRefs>
+</ds:datastoreItem>
+</file>
+
+<file path=customXml/itemProps3.xml><?xml version="1.0" encoding="utf-8"?>
 <ds:datastoreItem xmlns:ds="http://schemas.openxmlformats.org/officeDocument/2006/customXml" ds:itemID="{4E47A284-D0FB-4EA5-B440-9D7D3810D8E5}">
   <ds:schemaRefs>
     <ds:schemaRef ds:uri="http://schemas.microsoft.com/office/2006/metadata/contentType"/>
@@ -8917,23 +9208,6 @@
 </ds:datastoreItem>
 </file>
 
-<file path=customXml/itemProps2.xml><?xml version="1.0" encoding="utf-8"?>
-<ds:datastoreItem xmlns:ds="http://schemas.openxmlformats.org/officeDocument/2006/customXml" ds:itemID="{0D05F977-E0EB-4BDE-9CCC-35AE7F3468D1}">
-  <ds:schemaRefs>
-    <ds:schemaRef ds:uri="http://schemas.microsoft.com/office/2006/metadata/properties"/>
-    <ds:schemaRef ds:uri="http://schemas.microsoft.com/office/infopath/2007/PartnerControls"/>
-  </ds:schemaRefs>
-</ds:datastoreItem>
-</file>
-
-<file path=customXml/itemProps3.xml><?xml version="1.0" encoding="utf-8"?>
-<ds:datastoreItem xmlns:ds="http://schemas.openxmlformats.org/officeDocument/2006/customXml" ds:itemID="{19617398-908E-4614-909E-0F810C8F0377}">
-  <ds:schemaRefs>
-    <ds:schemaRef ds:uri="http://schemas.openxmlformats.org/officeDocument/2006/bibliography"/>
-  </ds:schemaRefs>
-</ds:datastoreItem>
-</file>
-
 <file path=customXml/itemProps4.xml><?xml version="1.0" encoding="utf-8"?>
 <ds:datastoreItem xmlns:ds="http://schemas.openxmlformats.org/officeDocument/2006/customXml" ds:itemID="{3049E901-D460-4040-BE52-BFB2CA5EF0CE}">
   <ds:schemaRefs>

</xml_diff>